<commit_message>
docs: respuestas de analisis acortadas y altura de fila auto
- Acortar T8/T12/T15/T19/T22/T27 (analisis de cada mision)
- Acortar P7_Q1..Q4 (reflexion final) a 1-2 oraciones
- Quitar altura fija en filas de respuesta para que crezcan con el texto
</commit_message>
<xml_diff>
--- a/Examen_Unidad5_Visualizacion_Datos.docx
+++ b/Examen_Unidad5_Visualizacion_Datos.docx
@@ -1,6 +1,6 @@
 
 <file path=word/document.xml><?xml version="1.0" encoding="utf-8"?>
-<w:document xmlns:wpc="http://schemas.microsoft.com/office/word/2010/wordprocessingCanvas" xmlns:cx="http://schemas.microsoft.com/office/drawing/2014/chartex" xmlns:cx1="http://schemas.microsoft.com/office/drawing/2015/9/8/chartex" xmlns:cx2="http://schemas.microsoft.com/office/drawing/2015/10/21/chartex" xmlns:cx3="http://schemas.microsoft.com/office/drawing/2016/5/9/chartex" xmlns:cx4="http://schemas.microsoft.com/office/drawing/2016/5/10/chartex" xmlns:cx5="http://schemas.microsoft.com/office/drawing/2016/5/11/chartex" xmlns:cx6="http://schemas.microsoft.com/office/drawing/2016/5/12/chartex" xmlns:cx7="http://schemas.microsoft.com/office/drawing/2016/5/13/chartex" xmlns:cx8="http://schemas.microsoft.com/office/drawing/2016/5/14/chartex" xmlns:mc="http://schemas.openxmlformats.org/markup-compatibility/2006" xmlns:aink="http://schemas.microsoft.com/office/drawing/2016/ink" xmlns:am3d="http://schemas.microsoft.com/office/drawing/2017/model3d" xmlns:o="urn:schemas-microsoft-com:office:office" xmlns:oel="http://schemas.microsoft.com/office/2019/extlst" xmlns:r="http://schemas.openxmlformats.org/officeDocument/2006/relationships" xmlns:m="http://schemas.openxmlformats.org/officeDocument/2006/math" xmlns:v="urn:schemas-microsoft-com:vml" xmlns:wp14="http://schemas.microsoft.com/office/word/2010/wordprocessingDrawing" xmlns:wp="http://schemas.openxmlformats.org/drawingml/2006/wordprocessingDrawing" xmlns:w10="urn:schemas-microsoft-com:office:word" xmlns:w="http://schemas.openxmlformats.org/wordprocessingml/2006/main" xmlns:w14="http://schemas.microsoft.com/office/word/2010/wordml" xmlns:w15="http://schemas.microsoft.com/office/word/2012/wordml" xmlns:w16cex="http://schemas.microsoft.com/office/word/2018/wordml/cex" xmlns:w16cid="http://schemas.microsoft.com/office/word/2016/wordml/cid" xmlns:w16="http://schemas.microsoft.com/office/word/2018/wordml" xmlns:w16du="http://schemas.microsoft.com/office/word/2023/wordml/word16du" xmlns:w16sdtdh="http://schemas.microsoft.com/office/word/2020/wordml/sdtdatahash" xmlns:w16sdtfl="http://schemas.microsoft.com/office/word/2024/wordml/sdtformatlock" xmlns:w16se="http://schemas.microsoft.com/office/word/2015/wordml/symex" xmlns:wpg="http://schemas.microsoft.com/office/word/2010/wordprocessingGroup" xmlns:wpi="http://schemas.microsoft.com/office/word/2010/wordprocessingInk" xmlns:wne="http://schemas.microsoft.com/office/word/2006/wordml" xmlns:wps="http://schemas.microsoft.com/office/word/2010/wordprocessingShape" mc:Ignorable="w14 w15 w16se w16cid w16 w16cex w16sdtdh w16sdtfl w16du wp14">
+<w:document xmlns:wpc="http://schemas.microsoft.com/office/word/2010/wordprocessingCanvas" xmlns:cx="http://schemas.microsoft.com/office/drawing/2014/chartex" xmlns:cx1="http://schemas.microsoft.com/office/drawing/2015/9/8/chartex" xmlns:cx2="http://schemas.microsoft.com/office/drawing/2015/10/21/chartex" xmlns:cx3="http://schemas.microsoft.com/office/drawing/2016/5/9/chartex" xmlns:cx4="http://schemas.microsoft.com/office/drawing/2016/5/10/chartex" xmlns:cx5="http://schemas.microsoft.com/office/drawing/2016/5/11/chartex" xmlns:cx6="http://schemas.microsoft.com/office/drawing/2016/5/12/chartex" xmlns:cx7="http://schemas.microsoft.com/office/drawing/2016/5/13/chartex" xmlns:cx8="http://schemas.microsoft.com/office/drawing/2016/5/14/chartex" xmlns:mc="http://schemas.openxmlformats.org/markup-compatibility/2006" xmlns:aink="http://schemas.microsoft.com/office/drawing/2016/ink" xmlns:am3d="http://schemas.microsoft.com/office/drawing/2017/model3d" xmlns:o="urn:schemas-microsoft-com:office:office" xmlns:r="http://schemas.openxmlformats.org/officeDocument/2006/relationships" xmlns:m="http://schemas.openxmlformats.org/officeDocument/2006/math" xmlns:v="urn:schemas-microsoft-com:vml" xmlns:wp14="http://schemas.microsoft.com/office/word/2010/wordprocessingDrawing" xmlns:wp="http://schemas.openxmlformats.org/drawingml/2006/wordprocessingDrawing" xmlns:w10="urn:schemas-microsoft-com:office:word" xmlns:w="http://schemas.openxmlformats.org/wordprocessingml/2006/main" xmlns:w14="http://schemas.microsoft.com/office/word/2010/wordml" xmlns:w15="http://schemas.microsoft.com/office/word/2012/wordml" xmlns:w16cex="http://schemas.microsoft.com/office/word/2018/wordml/cex" xmlns:w16cid="http://schemas.microsoft.com/office/word/2016/wordml/cid" xmlns:w16="http://schemas.microsoft.com/office/word/2018/wordml" xmlns:w16sdtdh="http://schemas.microsoft.com/office/word/2020/wordml/sdtdatahash" xmlns:w16se="http://schemas.microsoft.com/office/word/2015/wordml/symex" xmlns:wpg="http://schemas.microsoft.com/office/word/2010/wordprocessingGroup" xmlns:wpi="http://schemas.microsoft.com/office/word/2010/wordprocessingInk" xmlns:wne="http://schemas.microsoft.com/office/word/2006/wordml" xmlns:wps="http://schemas.microsoft.com/office/word/2010/wordprocessingShape" mc:Ignorable="w14 w15 w16se w16cid w16 w16cex w16sdtdh wp14">
   <w:body>
     <w:tbl>
       <w:tblPr>
@@ -23,12 +23,6 @@
         <w:gridCol w:w="9360"/>
       </w:tblGrid>
       <w:tr>
-        <w:tblPrEx>
-          <w:tblCellMar>
-            <w:top w:w="0" w:type="dxa"/>
-            <w:bottom w:w="0" w:type="dxa"/>
-          </w:tblCellMar>
-        </w:tblPrEx>
         <w:tc>
           <w:tcPr>
             <w:tcW w:w="9360" w:type="dxa"/>
@@ -210,12 +204,6 @@
         <w:gridCol w:w="9360"/>
       </w:tblGrid>
       <w:tr>
-        <w:tblPrEx>
-          <w:tblCellMar>
-            <w:top w:w="0" w:type="dxa"/>
-            <w:bottom w:w="0" w:type="dxa"/>
-          </w:tblCellMar>
-        </w:tblPrEx>
         <w:tc>
           <w:tcPr>
             <w:tcW w:w="9360" w:type="dxa"/>
@@ -254,7 +242,15 @@
               <w:jc w:val="center"/>
             </w:pPr>
             <w:r>
-              <w:t xml:space="preserve">Atlas Global Capital  |  </w:t>
+              <w:t xml:space="preserve">Atlas Global </w:t>
+            </w:r>
+            <w:proofErr w:type="gramStart"/>
+            <w:r>
+              <w:t>Capital  |</w:t>
+            </w:r>
+            <w:proofErr w:type="gramEnd"/>
+            <w:r>
+              <w:t xml:space="preserve">  </w:t>
             </w:r>
             <w:proofErr w:type="spellStart"/>
             <w:r>
@@ -296,12 +292,6 @@
         <w:gridCol w:w="2400"/>
       </w:tblGrid>
       <w:tr>
-        <w:tblPrEx>
-          <w:tblCellMar>
-            <w:top w:w="0" w:type="dxa"/>
-            <w:bottom w:w="0" w:type="dxa"/>
-          </w:tblCellMar>
-        </w:tblPrEx>
         <w:tc>
           <w:tcPr>
             <w:tcW w:w="2400" w:type="dxa"/>
@@ -349,7 +339,11 @@
               <w:right w:w="150" w:type="dxa"/>
             </w:tcMar>
           </w:tcPr>
-          <w:p/>
+          <w:p>
+            <w:r>
+              <w:t xml:space="preserve">Reyes García Yair </w:t>
+            </w:r>
+          </w:p>
         </w:tc>
         <w:tc>
           <w:tcPr>
@@ -379,16 +373,20 @@
               </w:rPr>
               <w:t>Matricula:</w:t>
             </w:r>
+            <w:r>
+              <w:rPr>
+                <w:b/>
+                <w:bCs/>
+                <w:color w:val="1B3A6B"/>
+                <w:sz w:val="20"/>
+                <w:szCs w:val="20"/>
+              </w:rPr>
+              <w:t xml:space="preserve"> 241120360</w:t>
+            </w:r>
           </w:p>
         </w:tc>
       </w:tr>
       <w:tr>
-        <w:tblPrEx>
-          <w:tblCellMar>
-            <w:top w:w="0" w:type="dxa"/>
-            <w:bottom w:w="0" w:type="dxa"/>
-          </w:tblCellMar>
-        </w:tblPrEx>
         <w:tc>
           <w:tcPr>
             <w:tcW w:w="2400" w:type="dxa"/>
@@ -436,7 +434,29 @@
               <w:right w:w="150" w:type="dxa"/>
             </w:tcMar>
           </w:tcPr>
-          <w:p/>
+          <w:p>
+            <w:pPr>
+              <w:rPr>
+                <w:color w:val="auto"/>
+              </w:rPr>
+            </w:pPr>
+            <w:proofErr w:type="spellStart"/>
+            <w:r>
+              <w:rPr>
+                <w:color w:val="auto"/>
+                <w:shd w:val="clear" w:color="auto" w:fill="FFFFFF"/>
+              </w:rPr>
+              <w:t>Alexsander</w:t>
+            </w:r>
+            <w:proofErr w:type="spellEnd"/>
+            <w:r>
+              <w:rPr>
+                <w:color w:val="auto"/>
+                <w:shd w:val="clear" w:color="auto" w:fill="FFFFFF"/>
+              </w:rPr>
+              <w:t xml:space="preserve"> Pedraza Bonilla</w:t>
+            </w:r>
+          </w:p>
         </w:tc>
         <w:tc>
           <w:tcPr>
@@ -466,16 +486,20 @@
               </w:rPr>
               <w:t>Fecha:</w:t>
             </w:r>
+            <w:r>
+              <w:rPr>
+                <w:b/>
+                <w:bCs/>
+                <w:color w:val="1B3A6B"/>
+                <w:sz w:val="20"/>
+                <w:szCs w:val="20"/>
+              </w:rPr>
+              <w:t xml:space="preserve"> 26/05/2026</w:t>
+            </w:r>
           </w:p>
         </w:tc>
       </w:tr>
       <w:tr>
-        <w:tblPrEx>
-          <w:tblCellMar>
-            <w:top w:w="0" w:type="dxa"/>
-            <w:bottom w:w="0" w:type="dxa"/>
-          </w:tblCellMar>
-        </w:tblPrEx>
         <w:tc>
           <w:tcPr>
             <w:tcW w:w="2400" w:type="dxa"/>
@@ -523,7 +547,11 @@
               <w:right w:w="150" w:type="dxa"/>
             </w:tcMar>
           </w:tcPr>
-          <w:p/>
+          <w:p>
+            <w:r>
+              <w:t>4°</w:t>
+            </w:r>
+          </w:p>
         </w:tc>
         <w:tc>
           <w:tcPr>
@@ -596,12 +624,6 @@
         <w:gridCol w:w="4870"/>
       </w:tblGrid>
       <w:tr>
-        <w:tblPrEx>
-          <w:tblCellMar>
-            <w:top w:w="0" w:type="dxa"/>
-            <w:bottom w:w="0" w:type="dxa"/>
-          </w:tblCellMar>
-        </w:tblPrEx>
         <w:tc>
           <w:tcPr>
             <w:tcW w:w="4500" w:type="dxa"/>
@@ -639,12 +661,6 @@
               <w:gridCol w:w="4380"/>
             </w:tblGrid>
             <w:tr>
-              <w:tblPrEx>
-                <w:tblCellMar>
-                  <w:top w:w="0" w:type="dxa"/>
-                  <w:bottom w:w="0" w:type="dxa"/>
-                </w:tblCellMar>
-              </w:tblPrEx>
               <w:tc>
                 <w:tcPr>
                   <w:tcW w:w="4380" w:type="dxa"/>
@@ -680,12 +696,6 @@
               </w:tc>
             </w:tr>
             <w:tr>
-              <w:tblPrEx>
-                <w:tblCellMar>
-                  <w:top w:w="0" w:type="dxa"/>
-                  <w:bottom w:w="0" w:type="dxa"/>
-                </w:tblCellMar>
-              </w:tblPrEx>
               <w:tc>
                 <w:tcPr>
                   <w:tcW w:w="4380" w:type="dxa"/>
@@ -775,12 +785,6 @@
               <w:gridCol w:w="4740"/>
             </w:tblGrid>
             <w:tr>
-              <w:tblPrEx>
-                <w:tblCellMar>
-                  <w:top w:w="0" w:type="dxa"/>
-                  <w:bottom w:w="0" w:type="dxa"/>
-                </w:tblCellMar>
-              </w:tblPrEx>
               <w:tc>
                 <w:tcPr>
                   <w:tcW w:w="4740" w:type="dxa"/>
@@ -816,12 +820,6 @@
               </w:tc>
             </w:tr>
             <w:tr>
-              <w:tblPrEx>
-                <w:tblCellMar>
-                  <w:top w:w="0" w:type="dxa"/>
-                  <w:bottom w:w="0" w:type="dxa"/>
-                </w:tblCellMar>
-              </w:tblPrEx>
               <w:tc>
                 <w:tcPr>
                   <w:tcW w:w="4740" w:type="dxa"/>
@@ -848,7 +846,23 @@
                       <w:sz w:val="18"/>
                       <w:szCs w:val="18"/>
                     </w:rPr>
-                    <w:t xml:space="preserve">Python | Pandas | Seaborn | </w:t>
+                    <w:t xml:space="preserve">Python | Pandas | </w:t>
+                  </w:r>
+                  <w:proofErr w:type="spellStart"/>
+                  <w:r>
+                    <w:rPr>
+                      <w:sz w:val="18"/>
+                      <w:szCs w:val="18"/>
+                    </w:rPr>
+                    <w:t>Seaborn</w:t>
+                  </w:r>
+                  <w:proofErr w:type="spellEnd"/>
+                  <w:r>
+                    <w:rPr>
+                      <w:sz w:val="18"/>
+                      <w:szCs w:val="18"/>
+                    </w:rPr>
+                    <w:t xml:space="preserve"> | </w:t>
                   </w:r>
                   <w:proofErr w:type="spellStart"/>
                   <w:r>
@@ -941,12 +955,6 @@
         <w:gridCol w:w="9360"/>
       </w:tblGrid>
       <w:tr>
-        <w:tblPrEx>
-          <w:tblCellMar>
-            <w:top w:w="0" w:type="dxa"/>
-            <w:bottom w:w="0" w:type="dxa"/>
-          </w:tblCellMar>
-        </w:tblPrEx>
         <w:tc>
           <w:tcPr>
             <w:tcW w:w="9360" w:type="dxa"/>
@@ -980,12 +988,17 @@
               <w:t xml:space="preserve">Lead Data </w:t>
             </w:r>
             <w:proofErr w:type="spellStart"/>
+            <w:proofErr w:type="gramStart"/>
             <w:r>
               <w:t>Scientist</w:t>
             </w:r>
             <w:proofErr w:type="spellEnd"/>
             <w:r>
-              <w:t xml:space="preserve">  |  Atlas Global Capital</w:t>
+              <w:t xml:space="preserve">  |</w:t>
+            </w:r>
+            <w:proofErr w:type="gramEnd"/>
+            <w:r>
+              <w:t xml:space="preserve">  Atlas Global Capital</w:t>
             </w:r>
           </w:p>
         </w:tc>
@@ -1140,12 +1153,6 @@
         <w:gridCol w:w="9360"/>
       </w:tblGrid>
       <w:tr>
-        <w:tblPrEx>
-          <w:tblCellMar>
-            <w:top w:w="0" w:type="dxa"/>
-            <w:bottom w:w="0" w:type="dxa"/>
-          </w:tblCellMar>
-        </w:tblPrEx>
         <w:tc>
           <w:tcPr>
             <w:tcW w:w="9360" w:type="dxa"/>
@@ -1176,12 +1183,6 @@
         </w:tc>
       </w:tr>
       <w:tr>
-        <w:tblPrEx>
-          <w:tblCellMar>
-            <w:top w:w="0" w:type="dxa"/>
-            <w:bottom w:w="0" w:type="dxa"/>
-          </w:tblCellMar>
-        </w:tblPrEx>
         <w:tc>
           <w:tcPr>
             <w:tcW w:w="9360" w:type="dxa"/>
@@ -1218,12 +1219,6 @@
         </w:tc>
       </w:tr>
       <w:tr>
-        <w:tblPrEx>
-          <w:tblCellMar>
-            <w:top w:w="0" w:type="dxa"/>
-            <w:bottom w:w="0" w:type="dxa"/>
-          </w:tblCellMar>
-        </w:tblPrEx>
         <w:tc>
           <w:tcPr>
             <w:tcW w:w="9360" w:type="dxa"/>
@@ -1265,12 +1260,6 @@
         </w:tc>
       </w:tr>
       <w:tr>
-        <w:tblPrEx>
-          <w:tblCellMar>
-            <w:top w:w="0" w:type="dxa"/>
-            <w:bottom w:w="0" w:type="dxa"/>
-          </w:tblCellMar>
-        </w:tblPrEx>
         <w:tc>
           <w:tcPr>
             <w:tcW w:w="9360" w:type="dxa"/>
@@ -1320,12 +1309,6 @@
         </w:tc>
       </w:tr>
       <w:tr>
-        <w:tblPrEx>
-          <w:tblCellMar>
-            <w:top w:w="0" w:type="dxa"/>
-            <w:bottom w:w="0" w:type="dxa"/>
-          </w:tblCellMar>
-        </w:tblPrEx>
         <w:tc>
           <w:tcPr>
             <w:tcW w:w="9360" w:type="dxa"/>
@@ -1362,12 +1345,6 @@
         </w:tc>
       </w:tr>
       <w:tr>
-        <w:tblPrEx>
-          <w:tblCellMar>
-            <w:top w:w="0" w:type="dxa"/>
-            <w:bottom w:w="0" w:type="dxa"/>
-          </w:tblCellMar>
-        </w:tblPrEx>
         <w:tc>
           <w:tcPr>
             <w:tcW w:w="9360" w:type="dxa"/>
@@ -1401,12 +1378,6 @@
         </w:tc>
       </w:tr>
       <w:tr>
-        <w:tblPrEx>
-          <w:tblCellMar>
-            <w:top w:w="0" w:type="dxa"/>
-            <w:bottom w:w="0" w:type="dxa"/>
-          </w:tblCellMar>
-        </w:tblPrEx>
         <w:tc>
           <w:tcPr>
             <w:tcW w:w="9360" w:type="dxa"/>
@@ -1456,12 +1427,6 @@
         </w:tc>
       </w:tr>
       <w:tr>
-        <w:tblPrEx>
-          <w:tblCellMar>
-            <w:top w:w="0" w:type="dxa"/>
-            <w:bottom w:w="0" w:type="dxa"/>
-          </w:tblCellMar>
-        </w:tblPrEx>
         <w:tc>
           <w:tcPr>
             <w:tcW w:w="9360" w:type="dxa"/>
@@ -1590,12 +1555,6 @@
         <w:gridCol w:w="9360"/>
       </w:tblGrid>
       <w:tr>
-        <w:tblPrEx>
-          <w:tblCellMar>
-            <w:top w:w="0" w:type="dxa"/>
-            <w:bottom w:w="0" w:type="dxa"/>
-          </w:tblCellMar>
-        </w:tblPrEx>
         <w:tc>
           <w:tcPr>
             <w:tcW w:w="9360" w:type="dxa"/>
@@ -1649,12 +1608,6 @@
         </w:tc>
       </w:tr>
       <w:tr>
-        <w:tblPrEx>
-          <w:tblCellMar>
-            <w:top w:w="0" w:type="dxa"/>
-            <w:bottom w:w="0" w:type="dxa"/>
-          </w:tblCellMar>
-        </w:tblPrEx>
         <w:tc>
           <w:tcPr>
             <w:tcW w:w="9360" w:type="dxa"/>
@@ -1728,12 +1681,6 @@
         </w:tc>
       </w:tr>
       <w:tr>
-        <w:tblPrEx>
-          <w:tblCellMar>
-            <w:top w:w="0" w:type="dxa"/>
-            <w:bottom w:w="0" w:type="dxa"/>
-          </w:tblCellMar>
-        </w:tblPrEx>
         <w:tc>
           <w:tcPr>
             <w:tcW w:w="9360" w:type="dxa"/>
@@ -1765,12 +1712,6 @@
         </w:tc>
       </w:tr>
       <w:tr>
-        <w:tblPrEx>
-          <w:tblCellMar>
-            <w:top w:w="0" w:type="dxa"/>
-            <w:bottom w:w="0" w:type="dxa"/>
-          </w:tblCellMar>
-        </w:tblPrEx>
         <w:tc>
           <w:tcPr>
             <w:tcW w:w="9360" w:type="dxa"/>
@@ -1790,6 +1731,7 @@
           </w:tcPr>
           <w:p>
             <w:proofErr w:type="spellStart"/>
+            <w:proofErr w:type="gramStart"/>
             <w:r>
               <w:rPr>
                 <w:rFonts w:ascii="Courier New" w:eastAsia="Courier New" w:hAnsi="Courier New" w:cs="Courier New"/>
@@ -1797,9 +1739,9 @@
                 <w:sz w:val="18"/>
                 <w:szCs w:val="18"/>
               </w:rPr>
-              <w:t>np.random.seed</w:t>
-            </w:r>
-            <w:proofErr w:type="spellEnd"/>
+              <w:t>np.random</w:t>
+            </w:r>
+            <w:proofErr w:type="gramEnd"/>
             <w:r>
               <w:rPr>
                 <w:rFonts w:ascii="Courier New" w:eastAsia="Courier New" w:hAnsi="Courier New" w:cs="Courier New"/>
@@ -1807,18 +1749,22 @@
                 <w:sz w:val="18"/>
                 <w:szCs w:val="18"/>
               </w:rPr>
+              <w:t>.seed</w:t>
+            </w:r>
+            <w:proofErr w:type="spellEnd"/>
+            <w:r>
+              <w:rPr>
+                <w:rFonts w:ascii="Courier New" w:eastAsia="Courier New" w:hAnsi="Courier New" w:cs="Courier New"/>
+                <w:color w:val="A8FF78"/>
+                <w:sz w:val="18"/>
+                <w:szCs w:val="18"/>
+              </w:rPr>
               <w:t>(42)</w:t>
             </w:r>
           </w:p>
         </w:tc>
       </w:tr>
       <w:tr>
-        <w:tblPrEx>
-          <w:tblCellMar>
-            <w:top w:w="0" w:type="dxa"/>
-            <w:bottom w:w="0" w:type="dxa"/>
-          </w:tblCellMar>
-        </w:tblPrEx>
         <w:tc>
           <w:tcPr>
             <w:tcW w:w="9360" w:type="dxa"/>
@@ -1861,12 +1807,6 @@
         </w:tc>
       </w:tr>
       <w:tr>
-        <w:tblPrEx>
-          <w:tblCellMar>
-            <w:top w:w="0" w:type="dxa"/>
-            <w:bottom w:w="0" w:type="dxa"/>
-          </w:tblCellMar>
-        </w:tblPrEx>
         <w:tc>
           <w:tcPr>
             <w:tcW w:w="9360" w:type="dxa"/>
@@ -1892,18 +1832,32 @@
                 <w:sz w:val="18"/>
                 <w:szCs w:val="18"/>
               </w:rPr>
-              <w:t xml:space="preserve">    ('Mexico','MEX'),('USA','USA'),('Germany','DEU'),('China','CHN'),</w:t>
+              <w:t xml:space="preserve">    ('Mexico','MEX'</w:t>
+            </w:r>
+            <w:proofErr w:type="gramStart"/>
+            <w:r>
+              <w:rPr>
+                <w:rFonts w:ascii="Courier New" w:eastAsia="Courier New" w:hAnsi="Courier New" w:cs="Courier New"/>
+                <w:color w:val="A8FF78"/>
+                <w:sz w:val="18"/>
+                <w:szCs w:val="18"/>
+              </w:rPr>
+              <w:t>),(</w:t>
+            </w:r>
+            <w:proofErr w:type="gramEnd"/>
+            <w:r>
+              <w:rPr>
+                <w:rFonts w:ascii="Courier New" w:eastAsia="Courier New" w:hAnsi="Courier New" w:cs="Courier New"/>
+                <w:color w:val="A8FF78"/>
+                <w:sz w:val="18"/>
+                <w:szCs w:val="18"/>
+              </w:rPr>
+              <w:t>'USA','USA'),('Germany','DEU'),('China','CHN'),</w:t>
             </w:r>
           </w:p>
         </w:tc>
       </w:tr>
       <w:tr>
-        <w:tblPrEx>
-          <w:tblCellMar>
-            <w:top w:w="0" w:type="dxa"/>
-            <w:bottom w:w="0" w:type="dxa"/>
-          </w:tblCellMar>
-        </w:tblPrEx>
         <w:tc>
           <w:tcPr>
             <w:tcW w:w="9360" w:type="dxa"/>
@@ -1929,18 +1883,32 @@
                 <w:sz w:val="18"/>
                 <w:szCs w:val="18"/>
               </w:rPr>
-              <w:t xml:space="preserve">    ('Brazil','BRA'),('India','IND'),('France','FRA'),('Japan','JPN'),</w:t>
+              <w:t xml:space="preserve">    ('Brazil','BRA'</w:t>
+            </w:r>
+            <w:proofErr w:type="gramStart"/>
+            <w:r>
+              <w:rPr>
+                <w:rFonts w:ascii="Courier New" w:eastAsia="Courier New" w:hAnsi="Courier New" w:cs="Courier New"/>
+                <w:color w:val="A8FF78"/>
+                <w:sz w:val="18"/>
+                <w:szCs w:val="18"/>
+              </w:rPr>
+              <w:t>),(</w:t>
+            </w:r>
+            <w:proofErr w:type="gramEnd"/>
+            <w:r>
+              <w:rPr>
+                <w:rFonts w:ascii="Courier New" w:eastAsia="Courier New" w:hAnsi="Courier New" w:cs="Courier New"/>
+                <w:color w:val="A8FF78"/>
+                <w:sz w:val="18"/>
+                <w:szCs w:val="18"/>
+              </w:rPr>
+              <w:t>'India','IND'),('France','FRA'),('Japan','JPN'),</w:t>
             </w:r>
           </w:p>
         </w:tc>
       </w:tr>
       <w:tr>
-        <w:tblPrEx>
-          <w:tblCellMar>
-            <w:top w:w="0" w:type="dxa"/>
-            <w:bottom w:w="0" w:type="dxa"/>
-          </w:tblCellMar>
-        </w:tblPrEx>
         <w:tc>
           <w:tcPr>
             <w:tcW w:w="9360" w:type="dxa"/>
@@ -1983,12 +1951,6 @@
         </w:tc>
       </w:tr>
       <w:tr>
-        <w:tblPrEx>
-          <w:tblCellMar>
-            <w:top w:w="0" w:type="dxa"/>
-            <w:bottom w:w="0" w:type="dxa"/>
-          </w:tblCellMar>
-        </w:tblPrEx>
         <w:tc>
           <w:tcPr>
             <w:tcW w:w="9360" w:type="dxa"/>
@@ -2020,12 +1982,6 @@
         </w:tc>
       </w:tr>
       <w:tr>
-        <w:tblPrEx>
-          <w:tblCellMar>
-            <w:top w:w="0" w:type="dxa"/>
-            <w:bottom w:w="0" w:type="dxa"/>
-          </w:tblCellMar>
-        </w:tblPrEx>
         <w:tc>
           <w:tcPr>
             <w:tcW w:w="9360" w:type="dxa"/>
@@ -2065,6 +2021,7 @@
               <w:t xml:space="preserve"> = </w:t>
             </w:r>
             <w:proofErr w:type="spellStart"/>
+            <w:proofErr w:type="gramStart"/>
             <w:r>
               <w:rPr>
                 <w:rFonts w:ascii="Courier New" w:eastAsia="Courier New" w:hAnsi="Courier New" w:cs="Courier New"/>
@@ -2082,18 +2039,22 @@
                 <w:sz w:val="18"/>
                 <w:szCs w:val="18"/>
               </w:rPr>
-              <w:t>(2000, 2024)</w:t>
+              <w:t>(</w:t>
+            </w:r>
+            <w:proofErr w:type="gramEnd"/>
+            <w:r>
+              <w:rPr>
+                <w:rFonts w:ascii="Courier New" w:eastAsia="Courier New" w:hAnsi="Courier New" w:cs="Courier New"/>
+                <w:color w:val="A8FF78"/>
+                <w:sz w:val="18"/>
+                <w:szCs w:val="18"/>
+              </w:rPr>
+              <w:t>2000, 2024)</w:t>
             </w:r>
           </w:p>
         </w:tc>
       </w:tr>
       <w:tr>
-        <w:tblPrEx>
-          <w:tblCellMar>
-            <w:top w:w="0" w:type="dxa"/>
-            <w:bottom w:w="0" w:type="dxa"/>
-          </w:tblCellMar>
-        </w:tblPrEx>
         <w:tc>
           <w:tcPr>
             <w:tcW w:w="9360" w:type="dxa"/>
@@ -2136,12 +2097,6 @@
         </w:tc>
       </w:tr>
       <w:tr>
-        <w:tblPrEx>
-          <w:tblCellMar>
-            <w:top w:w="0" w:type="dxa"/>
-            <w:bottom w:w="0" w:type="dxa"/>
-          </w:tblCellMar>
-        </w:tblPrEx>
         <w:tc>
           <w:tcPr>
             <w:tcW w:w="9360" w:type="dxa"/>
@@ -2224,12 +2179,6 @@
         </w:tc>
       </w:tr>
       <w:tr>
-        <w:tblPrEx>
-          <w:tblCellMar>
-            <w:top w:w="0" w:type="dxa"/>
-            <w:bottom w:w="0" w:type="dxa"/>
-          </w:tblCellMar>
-        </w:tblPrEx>
         <w:tc>
           <w:tcPr>
             <w:tcW w:w="9360" w:type="dxa"/>
@@ -2321,12 +2270,6 @@
         </w:tc>
       </w:tr>
       <w:tr>
-        <w:tblPrEx>
-          <w:tblCellMar>
-            <w:top w:w="0" w:type="dxa"/>
-            <w:bottom w:w="0" w:type="dxa"/>
-          </w:tblCellMar>
-        </w:tblPrEx>
         <w:tc>
           <w:tcPr>
             <w:tcW w:w="9360" w:type="dxa"/>
@@ -2355,6 +2298,7 @@
               <w:t xml:space="preserve">        </w:t>
             </w:r>
             <w:proofErr w:type="spellStart"/>
+            <w:proofErr w:type="gramStart"/>
             <w:r>
               <w:rPr>
                 <w:rFonts w:ascii="Courier New" w:eastAsia="Courier New" w:hAnsi="Courier New" w:cs="Courier New"/>
@@ -2365,6 +2309,7 @@
               <w:t>records.append</w:t>
             </w:r>
             <w:proofErr w:type="spellEnd"/>
+            <w:proofErr w:type="gramEnd"/>
             <w:r>
               <w:rPr>
                 <w:rFonts w:ascii="Courier New" w:eastAsia="Courier New" w:hAnsi="Courier New" w:cs="Courier New"/>
@@ -2378,12 +2323,6 @@
         </w:tc>
       </w:tr>
       <w:tr>
-        <w:tblPrEx>
-          <w:tblCellMar>
-            <w:top w:w="0" w:type="dxa"/>
-            <w:bottom w:w="0" w:type="dxa"/>
-          </w:tblCellMar>
-        </w:tblPrEx>
         <w:tc>
           <w:tcPr>
             <w:tcW w:w="9360" w:type="dxa"/>
@@ -2496,12 +2435,6 @@
         </w:tc>
       </w:tr>
       <w:tr>
-        <w:tblPrEx>
-          <w:tblCellMar>
-            <w:top w:w="0" w:type="dxa"/>
-            <w:bottom w:w="0" w:type="dxa"/>
-          </w:tblCellMar>
-        </w:tblPrEx>
         <w:tc>
           <w:tcPr>
             <w:tcW w:w="9360" w:type="dxa"/>
@@ -2530,6 +2463,7 @@
               <w:t xml:space="preserve">            'CO2_Emissions_Per_Capita': </w:t>
             </w:r>
             <w:proofErr w:type="spellStart"/>
+            <w:proofErr w:type="gramStart"/>
             <w:r>
               <w:rPr>
                 <w:rFonts w:ascii="Courier New" w:eastAsia="Courier New" w:hAnsi="Courier New" w:cs="Courier New"/>
@@ -2537,9 +2471,9 @@
                 <w:sz w:val="18"/>
                 <w:szCs w:val="18"/>
               </w:rPr>
-              <w:t>np.random.uniform</w:t>
-            </w:r>
-            <w:proofErr w:type="spellEnd"/>
+              <w:t>np.random</w:t>
+            </w:r>
+            <w:proofErr w:type="gramEnd"/>
             <w:r>
               <w:rPr>
                 <w:rFonts w:ascii="Courier New" w:eastAsia="Courier New" w:hAnsi="Courier New" w:cs="Courier New"/>
@@ -2547,18 +2481,22 @@
                 <w:sz w:val="18"/>
                 <w:szCs w:val="18"/>
               </w:rPr>
+              <w:t>.uniform</w:t>
+            </w:r>
+            <w:proofErr w:type="spellEnd"/>
+            <w:r>
+              <w:rPr>
+                <w:rFonts w:ascii="Courier New" w:eastAsia="Courier New" w:hAnsi="Courier New" w:cs="Courier New"/>
+                <w:color w:val="A8FF78"/>
+                <w:sz w:val="18"/>
+                <w:szCs w:val="18"/>
+              </w:rPr>
               <w:t>(0.5, 18.0),</w:t>
             </w:r>
           </w:p>
         </w:tc>
       </w:tr>
       <w:tr>
-        <w:tblPrEx>
-          <w:tblCellMar>
-            <w:top w:w="0" w:type="dxa"/>
-            <w:bottom w:w="0" w:type="dxa"/>
-          </w:tblCellMar>
-        </w:tblPrEx>
         <w:tc>
           <w:tcPr>
             <w:tcW w:w="9360" w:type="dxa"/>
@@ -2607,6 +2545,7 @@
               <w:t xml:space="preserve">': </w:t>
             </w:r>
             <w:proofErr w:type="spellStart"/>
+            <w:proofErr w:type="gramStart"/>
             <w:r>
               <w:rPr>
                 <w:rFonts w:ascii="Courier New" w:eastAsia="Courier New" w:hAnsi="Courier New" w:cs="Courier New"/>
@@ -2614,9 +2553,9 @@
                 <w:sz w:val="18"/>
                 <w:szCs w:val="18"/>
               </w:rPr>
-              <w:t>np.random.uniform</w:t>
-            </w:r>
-            <w:proofErr w:type="spellEnd"/>
+              <w:t>np.random</w:t>
+            </w:r>
+            <w:proofErr w:type="gramEnd"/>
             <w:r>
               <w:rPr>
                 <w:rFonts w:ascii="Courier New" w:eastAsia="Courier New" w:hAnsi="Courier New" w:cs="Courier New"/>
@@ -2624,18 +2563,22 @@
                 <w:sz w:val="18"/>
                 <w:szCs w:val="18"/>
               </w:rPr>
+              <w:t>.uniform</w:t>
+            </w:r>
+            <w:proofErr w:type="spellEnd"/>
+            <w:r>
+              <w:rPr>
+                <w:rFonts w:ascii="Courier New" w:eastAsia="Courier New" w:hAnsi="Courier New" w:cs="Courier New"/>
+                <w:color w:val="A8FF78"/>
+                <w:sz w:val="18"/>
+                <w:szCs w:val="18"/>
+              </w:rPr>
               <w:t>(300, 850),</w:t>
             </w:r>
           </w:p>
         </w:tc>
       </w:tr>
       <w:tr>
-        <w:tblPrEx>
-          <w:tblCellMar>
-            <w:top w:w="0" w:type="dxa"/>
-            <w:bottom w:w="0" w:type="dxa"/>
-          </w:tblCellMar>
-        </w:tblPrEx>
         <w:tc>
           <w:tcPr>
             <w:tcW w:w="9360" w:type="dxa"/>
@@ -2684,6 +2627,7 @@
               <w:t xml:space="preserve">': </w:t>
             </w:r>
             <w:proofErr w:type="spellStart"/>
+            <w:proofErr w:type="gramStart"/>
             <w:r>
               <w:rPr>
                 <w:rFonts w:ascii="Courier New" w:eastAsia="Courier New" w:hAnsi="Courier New" w:cs="Courier New"/>
@@ -2691,9 +2635,9 @@
                 <w:sz w:val="18"/>
                 <w:szCs w:val="18"/>
               </w:rPr>
-              <w:t>np.random.uniform</w:t>
-            </w:r>
-            <w:proofErr w:type="spellEnd"/>
+              <w:t>np.random</w:t>
+            </w:r>
+            <w:proofErr w:type="gramEnd"/>
             <w:r>
               <w:rPr>
                 <w:rFonts w:ascii="Courier New" w:eastAsia="Courier New" w:hAnsi="Courier New" w:cs="Courier New"/>
@@ -2701,18 +2645,22 @@
                 <w:sz w:val="18"/>
                 <w:szCs w:val="18"/>
               </w:rPr>
+              <w:t>.uniform</w:t>
+            </w:r>
+            <w:proofErr w:type="spellEnd"/>
+            <w:r>
+              <w:rPr>
+                <w:rFonts w:ascii="Courier New" w:eastAsia="Courier New" w:hAnsi="Courier New" w:cs="Courier New"/>
+                <w:color w:val="A8FF78"/>
+                <w:sz w:val="18"/>
+                <w:szCs w:val="18"/>
+              </w:rPr>
               <w:t>(500, 65000),</w:t>
             </w:r>
           </w:p>
         </w:tc>
       </w:tr>
       <w:tr>
-        <w:tblPrEx>
-          <w:tblCellMar>
-            <w:top w:w="0" w:type="dxa"/>
-            <w:bottom w:w="0" w:type="dxa"/>
-          </w:tblCellMar>
-        </w:tblPrEx>
         <w:tc>
           <w:tcPr>
             <w:tcW w:w="9360" w:type="dxa"/>
@@ -2761,6 +2709,7 @@
               <w:t xml:space="preserve">': </w:t>
             </w:r>
             <w:proofErr w:type="spellStart"/>
+            <w:proofErr w:type="gramStart"/>
             <w:r>
               <w:rPr>
                 <w:rFonts w:ascii="Courier New" w:eastAsia="Courier New" w:hAnsi="Courier New" w:cs="Courier New"/>
@@ -2768,9 +2717,9 @@
                 <w:sz w:val="18"/>
                 <w:szCs w:val="18"/>
               </w:rPr>
-              <w:t>np.random.uniform</w:t>
-            </w:r>
-            <w:proofErr w:type="spellEnd"/>
+              <w:t>np.random</w:t>
+            </w:r>
+            <w:proofErr w:type="gramEnd"/>
             <w:r>
               <w:rPr>
                 <w:rFonts w:ascii="Courier New" w:eastAsia="Courier New" w:hAnsi="Courier New" w:cs="Courier New"/>
@@ -2778,18 +2727,22 @@
                 <w:sz w:val="18"/>
                 <w:szCs w:val="18"/>
               </w:rPr>
+              <w:t>.uniform</w:t>
+            </w:r>
+            <w:proofErr w:type="spellEnd"/>
+            <w:r>
+              <w:rPr>
+                <w:rFonts w:ascii="Courier New" w:eastAsia="Courier New" w:hAnsi="Courier New" w:cs="Courier New"/>
+                <w:color w:val="A8FF78"/>
+                <w:sz w:val="18"/>
+                <w:szCs w:val="18"/>
+              </w:rPr>
               <w:t>(10, 95),</w:t>
             </w:r>
           </w:p>
         </w:tc>
       </w:tr>
       <w:tr>
-        <w:tblPrEx>
-          <w:tblCellMar>
-            <w:top w:w="0" w:type="dxa"/>
-            <w:bottom w:w="0" w:type="dxa"/>
-          </w:tblCellMar>
-        </w:tblPrEx>
         <w:tc>
           <w:tcPr>
             <w:tcW w:w="9360" w:type="dxa"/>
@@ -2821,12 +2774,6 @@
         </w:tc>
       </w:tr>
       <w:tr>
-        <w:tblPrEx>
-          <w:tblCellMar>
-            <w:top w:w="0" w:type="dxa"/>
-            <w:bottom w:w="0" w:type="dxa"/>
-          </w:tblCellMar>
-        </w:tblPrEx>
         <w:tc>
           <w:tcPr>
             <w:tcW w:w="9360" w:type="dxa"/>
@@ -2866,6 +2813,7 @@
               <w:t xml:space="preserve"> = </w:t>
             </w:r>
             <w:proofErr w:type="spellStart"/>
+            <w:proofErr w:type="gramStart"/>
             <w:r>
               <w:rPr>
                 <w:rFonts w:ascii="Courier New" w:eastAsia="Courier New" w:hAnsi="Courier New" w:cs="Courier New"/>
@@ -2876,6 +2824,7 @@
               <w:t>pd.DataFrame</w:t>
             </w:r>
             <w:proofErr w:type="spellEnd"/>
+            <w:proofErr w:type="gramEnd"/>
             <w:r>
               <w:rPr>
                 <w:rFonts w:ascii="Courier New" w:eastAsia="Courier New" w:hAnsi="Courier New" w:cs="Courier New"/>
@@ -2909,12 +2858,6 @@
         </w:tc>
       </w:tr>
       <w:tr>
-        <w:tblPrEx>
-          <w:tblCellMar>
-            <w:top w:w="0" w:type="dxa"/>
-            <w:bottom w:w="0" w:type="dxa"/>
-          </w:tblCellMar>
-        </w:tblPrEx>
         <w:tc>
           <w:tcPr>
             <w:tcW w:w="9360" w:type="dxa"/>
@@ -2941,9 +2884,9 @@
                 <w:sz w:val="18"/>
                 <w:szCs w:val="18"/>
               </w:rPr>
-              <w:t>df.to_csv</w:t>
-            </w:r>
-            <w:proofErr w:type="spellEnd"/>
+              <w:t>df.to_</w:t>
+            </w:r>
+            <w:proofErr w:type="gramStart"/>
             <w:r>
               <w:rPr>
                 <w:rFonts w:ascii="Courier New" w:eastAsia="Courier New" w:hAnsi="Courier New" w:cs="Courier New"/>
@@ -2951,9 +2894,9 @@
                 <w:sz w:val="18"/>
                 <w:szCs w:val="18"/>
               </w:rPr>
-              <w:t xml:space="preserve">('global_esg_risk.csv', </w:t>
-            </w:r>
-            <w:proofErr w:type="spellStart"/>
+              <w:t>csv</w:t>
+            </w:r>
+            <w:proofErr w:type="spellEnd"/>
             <w:r>
               <w:rPr>
                 <w:rFonts w:ascii="Courier New" w:eastAsia="Courier New" w:hAnsi="Courier New" w:cs="Courier New"/>
@@ -2961,9 +2904,9 @@
                 <w:sz w:val="18"/>
                 <w:szCs w:val="18"/>
               </w:rPr>
-              <w:t>index</w:t>
-            </w:r>
-            <w:proofErr w:type="spellEnd"/>
+              <w:t>(</w:t>
+            </w:r>
+            <w:proofErr w:type="gramEnd"/>
             <w:r>
               <w:rPr>
                 <w:rFonts w:ascii="Courier New" w:eastAsia="Courier New" w:hAnsi="Courier New" w:cs="Courier New"/>
@@ -2971,18 +2914,32 @@
                 <w:sz w:val="18"/>
                 <w:szCs w:val="18"/>
               </w:rPr>
+              <w:t xml:space="preserve">'global_esg_risk.csv', </w:t>
+            </w:r>
+            <w:proofErr w:type="spellStart"/>
+            <w:r>
+              <w:rPr>
+                <w:rFonts w:ascii="Courier New" w:eastAsia="Courier New" w:hAnsi="Courier New" w:cs="Courier New"/>
+                <w:color w:val="A8FF78"/>
+                <w:sz w:val="18"/>
+                <w:szCs w:val="18"/>
+              </w:rPr>
+              <w:t>index</w:t>
+            </w:r>
+            <w:proofErr w:type="spellEnd"/>
+            <w:r>
+              <w:rPr>
+                <w:rFonts w:ascii="Courier New" w:eastAsia="Courier New" w:hAnsi="Courier New" w:cs="Courier New"/>
+                <w:color w:val="A8FF78"/>
+                <w:sz w:val="18"/>
+                <w:szCs w:val="18"/>
+              </w:rPr>
               <w:t>=False)</w:t>
             </w:r>
           </w:p>
         </w:tc>
       </w:tr>
       <w:tr>
-        <w:tblPrEx>
-          <w:tblCellMar>
-            <w:top w:w="0" w:type="dxa"/>
-            <w:bottom w:w="0" w:type="dxa"/>
-          </w:tblCellMar>
-        </w:tblPrEx>
         <w:tc>
           <w:tcPr>
             <w:tcW w:w="9360" w:type="dxa"/>
@@ -3002,6 +2959,7 @@
           </w:tcPr>
           <w:p>
             <w:proofErr w:type="spellStart"/>
+            <w:proofErr w:type="gramStart"/>
             <w:r>
               <w:rPr>
                 <w:rFonts w:ascii="Courier New" w:eastAsia="Courier New" w:hAnsi="Courier New" w:cs="Courier New"/>
@@ -3022,6 +2980,7 @@
               <w:t>(</w:t>
             </w:r>
             <w:proofErr w:type="spellStart"/>
+            <w:proofErr w:type="gramEnd"/>
             <w:r>
               <w:rPr>
                 <w:rFonts w:ascii="Courier New" w:eastAsia="Courier New" w:hAnsi="Courier New" w:cs="Courier New"/>
@@ -3159,14 +3118,7 @@
           <w:b/>
           <w:bCs/>
         </w:rPr>
-        <w:t>instrucción</w:t>
-      </w:r>
-      <w:r>
-        <w:rPr>
-          <w:b/>
-          <w:bCs/>
-        </w:rPr>
-        <w:t xml:space="preserve">: </w:t>
+        <w:t xml:space="preserve">instrucción: </w:t>
       </w:r>
       <w:proofErr w:type="spellStart"/>
       <w:r>
@@ -3182,13 +3134,15 @@
       </w:r>
       <w:proofErr w:type="spellEnd"/>
       <w:r>
-        <w:t xml:space="preserve">, realiza un </w:t>
-      </w:r>
-      <w:r>
-        <w:t>diagnóstico</w:t>
-      </w:r>
-      <w:r>
-        <w:t xml:space="preserve"> inicial. Documenta los resultados de df.info(), </w:t>
+        <w:t xml:space="preserve">, realiza un diagnóstico inicial. Documenta los resultados de </w:t>
+      </w:r>
+      <w:proofErr w:type="gramStart"/>
+      <w:r>
+        <w:t>df.info(</w:t>
+      </w:r>
+      <w:proofErr w:type="gramEnd"/>
+      <w:r>
+        <w:t xml:space="preserve">), </w:t>
       </w:r>
       <w:proofErr w:type="spellStart"/>
       <w:r>
@@ -3196,19 +3150,7 @@
       </w:r>
       <w:proofErr w:type="spellEnd"/>
       <w:r>
-        <w:t xml:space="preserve">(), y verifica valores nulos. Pega el output y tu </w:t>
-      </w:r>
-      <w:r>
-        <w:t>interpretación</w:t>
-      </w:r>
-      <w:r>
-        <w:t xml:space="preserve"> a </w:t>
-      </w:r>
-      <w:r>
-        <w:t>continuación</w:t>
-      </w:r>
-      <w:r>
-        <w:t>.</w:t>
+        <w:t>(), y verifica valores nulos. Pega el output y tu interpretación a continuación.</w:t>
       </w:r>
     </w:p>
     <w:p>
@@ -3237,12 +3179,6 @@
         <w:gridCol w:w="9360"/>
       </w:tblGrid>
       <w:tr>
-        <w:tblPrEx>
-          <w:tblCellMar>
-            <w:top w:w="0" w:type="dxa"/>
-            <w:bottom w:w="0" w:type="dxa"/>
-          </w:tblCellMar>
-        </w:tblPrEx>
         <w:tc>
           <w:tcPr>
             <w:tcW w:w="9360" w:type="dxa"/>
@@ -3517,12 +3453,6 @@
         <w:gridCol w:w="9360"/>
       </w:tblGrid>
       <w:tr>
-        <w:tblPrEx>
-          <w:tblCellMar>
-            <w:top w:w="0" w:type="dxa"/>
-            <w:bottom w:w="0" w:type="dxa"/>
-          </w:tblCellMar>
-        </w:tblPrEx>
         <w:tc>
           <w:tcPr>
             <w:tcW w:w="9360" w:type="dxa"/>
@@ -3549,8 +3479,9 @@
                 <w:sz w:val="18"/>
                 <w:szCs w:val="18"/>
               </w:rPr>
-              <w:t>Interpretación</w:t>
-            </w:r>
+              <w:t xml:space="preserve">Interpretación del diagnóstico inicial del </w:t>
+            </w:r>
+            <w:proofErr w:type="spellStart"/>
             <w:r>
               <w:rPr>
                 <w:i/>
@@ -3559,8 +3490,9 @@
                 <w:sz w:val="18"/>
                 <w:szCs w:val="18"/>
               </w:rPr>
-              <w:t xml:space="preserve"> del </w:t>
-            </w:r>
+              <w:t>dataset</w:t>
+            </w:r>
+            <w:proofErr w:type="spellEnd"/>
             <w:r>
               <w:rPr>
                 <w:i/>
@@ -3569,53 +3501,13 @@
                 <w:sz w:val="18"/>
                 <w:szCs w:val="18"/>
               </w:rPr>
-              <w:t>diagnóstico</w:t>
-            </w:r>
-            <w:r>
-              <w:rPr>
-                <w:i/>
-                <w:iCs/>
-                <w:color w:val="595959"/>
-                <w:sz w:val="18"/>
-                <w:szCs w:val="18"/>
-              </w:rPr>
-              <w:t xml:space="preserve"> inicial del </w:t>
-            </w:r>
-            <w:proofErr w:type="spellStart"/>
-            <w:r>
-              <w:rPr>
-                <w:i/>
-                <w:iCs/>
-                <w:color w:val="595959"/>
-                <w:sz w:val="18"/>
-                <w:szCs w:val="18"/>
-              </w:rPr>
-              <w:t>dataset</w:t>
-            </w:r>
-            <w:proofErr w:type="spellEnd"/>
-            <w:r>
-              <w:rPr>
-                <w:i/>
-                <w:iCs/>
-                <w:color w:val="595959"/>
-                <w:sz w:val="18"/>
-                <w:szCs w:val="18"/>
-              </w:rPr>
               <w:t>:</w:t>
             </w:r>
           </w:p>
         </w:tc>
       </w:tr>
       <w:tr>
-        <w:tblPrEx>
-          <w:tblCellMar>
-            <w:top w:w="0" w:type="dxa"/>
-            <w:bottom w:w="0" w:type="dxa"/>
-          </w:tblCellMar>
-        </w:tblPrEx>
-        <w:trPr>
-          <w:trHeight w:hRule="exact" w:val="400"/>
-        </w:trPr>
+        <w:trPr/>
         <w:tc>
           <w:tcPr>
             <w:tcW w:w="9360" w:type="dxa"/>
@@ -3641,7 +3533,7 @@
               <w:rPr>
                 <w:sz w:val="21"/>
               </w:rPr>
-              <w:t>Dataset con 3,600 filas x 7 columnas correspondientes a un panel balanceado de 150 paises x 24 anos (2000-2023). Los tipos de datos son correctos: Country e ISO_Code son object, Year es int64, y las cuatro metricas numericas (CO2_Emissions_Per_Capita, Average_Credit_Score_Corporate, GDP_Per_Capita, Trade_Connectivity_Index) son float64.</w:t>
+              <w:t>Dataset de 3,600 filas x 7 columnas: panel balanceado de 150 paises x 24 anos (2000-2023). Tipos correctos (object, int64, float64) y sin valores nulos.</w:t>
             </w:r>
           </w:p>
           <w:p>
@@ -3652,18 +3544,7 @@
               <w:rPr>
                 <w:sz w:val="21"/>
               </w:rPr>
-              <w:t>Sin valores nulos en ninguna columna: df.isna().sum() = 0 en todas las variables. El panel esta completo y balanceado (cada ISO_Code aparece en cada Year), lo que garantiza que el Choropleth animado de la Mision 3 no tendra frames con huecos en gris -- un punto critico de la rubrica.</w:t>
-            </w:r>
-          </w:p>
-          <w:p>
-            <w:pPr>
-              <w:spacing w:after="80"/>
-            </w:pPr>
-            <w:r>
-              <w:rPr>
-                <w:sz w:val="21"/>
-              </w:rPr>
-              <w:t>Rangos observados coherentes con el dominio: CO2 entre 0.1 y 25 t/hab, Credit Score entre 300 y 850, GDP per capita entre 500 y 80,000 USD, e Indice de Conectividad entre 5 y 100. La amplitud de la dispersion en GDP y Credit Score garantiza que el Clustermap de la Mision 1.2 formara agrupaciones naturales interpretables.</w:t>
+              <w:t>Rangos coherentes con el dominio: CO2 0.1-25 t/hab, Credit 300-850, GDP 500-80,000 USD, Trade 5-100. Listo para las 4 misiones.</w:t>
             </w:r>
           </w:p>
         </w:tc>
@@ -3722,12 +3603,6 @@
         <w:gridCol w:w="9360"/>
       </w:tblGrid>
       <w:tr>
-        <w:tblPrEx>
-          <w:tblCellMar>
-            <w:top w:w="0" w:type="dxa"/>
-            <w:bottom w:w="0" w:type="dxa"/>
-          </w:tblCellMar>
-        </w:tblPrEx>
         <w:tc>
           <w:tcPr>
             <w:tcW w:w="9360" w:type="dxa"/>
@@ -3768,12 +3643,6 @@
         </w:tc>
       </w:tr>
       <w:tr>
-        <w:tblPrEx>
-          <w:tblCellMar>
-            <w:top w:w="0" w:type="dxa"/>
-            <w:bottom w:w="0" w:type="dxa"/>
-          </w:tblCellMar>
-        </w:tblPrEx>
         <w:tc>
           <w:tcPr>
             <w:tcW w:w="9360" w:type="dxa"/>
@@ -3797,46 +3666,7 @@
               <w:jc w:val="both"/>
             </w:pPr>
             <w:r>
-              <w:t>Producirás</w:t>
-            </w:r>
-            <w:r>
-              <w:t xml:space="preserve"> graficas </w:t>
-            </w:r>
-            <w:r>
-              <w:t>estáticas</w:t>
-            </w:r>
-            <w:r>
-              <w:t xml:space="preserve"> de alta </w:t>
-            </w:r>
-            <w:r>
-              <w:t>resolución</w:t>
-            </w:r>
-            <w:r>
-              <w:t xml:space="preserve"> con Seaborn para el Informe </w:t>
-            </w:r>
-            <w:r>
-              <w:t>Técnico</w:t>
-            </w:r>
-            <w:r>
-              <w:t xml:space="preserve"> en PDF de la junta directiva de Atlas Global Capital. Recuerda: los </w:t>
-            </w:r>
-            <w:r>
-              <w:t>gráficos</w:t>
-            </w:r>
-            <w:r>
-              <w:t xml:space="preserve"> </w:t>
-            </w:r>
-            <w:r>
-              <w:t>estáticos</w:t>
-            </w:r>
-            <w:r>
-              <w:t xml:space="preserve"> son la herramienta correcta cuando el </w:t>
-            </w:r>
-            <w:r>
-              <w:t>público</w:t>
-            </w:r>
-            <w:r>
-              <w:t xml:space="preserve"> necesita un documento imprimible, </w:t>
+              <w:t xml:space="preserve">Producirás graficas estáticas de alta resolución con Seaborn para el Informe Técnico en PDF de la junta directiva de Atlas Global Capital. Recuerda: los gráficos estáticos son la herramienta correcta cuando el público necesita un documento imprimible, </w:t>
             </w:r>
             <w:proofErr w:type="spellStart"/>
             <w:r>
@@ -3844,19 +3674,7 @@
             </w:r>
             <w:proofErr w:type="spellEnd"/>
             <w:r>
-              <w:t xml:space="preserve"> y con </w:t>
-            </w:r>
-            <w:r>
-              <w:t>resolución</w:t>
-            </w:r>
-            <w:r>
-              <w:t xml:space="preserve"> de </w:t>
-            </w:r>
-            <w:r>
-              <w:t>publicación</w:t>
-            </w:r>
-            <w:r>
-              <w:t xml:space="preserve">. No uses </w:t>
+              <w:t xml:space="preserve"> y con resolución de publicación. No uses </w:t>
             </w:r>
             <w:proofErr w:type="spellStart"/>
             <w:r>
@@ -3864,13 +3682,7 @@
             </w:r>
             <w:proofErr w:type="spellEnd"/>
             <w:r>
-              <w:t xml:space="preserve"> </w:t>
-            </w:r>
-            <w:r>
-              <w:t>aquí</w:t>
-            </w:r>
-            <w:r>
-              <w:t>.</w:t>
+              <w:t xml:space="preserve"> aquí.</w:t>
             </w:r>
           </w:p>
         </w:tc>
@@ -4038,10 +3850,12 @@
         <w:t xml:space="preserve">Utiliza </w:t>
       </w:r>
       <w:proofErr w:type="spellStart"/>
+      <w:proofErr w:type="gramStart"/>
       <w:r>
         <w:t>seaborn.kdeplot</w:t>
       </w:r>
       <w:proofErr w:type="spellEnd"/>
+      <w:proofErr w:type="gramEnd"/>
       <w:r>
         <w:t xml:space="preserve">() con el </w:t>
       </w:r>
@@ -4163,10 +3977,12 @@
         <w:t xml:space="preserve">: </w:t>
       </w:r>
       <w:proofErr w:type="spellStart"/>
+      <w:proofErr w:type="gramStart"/>
       <w:r>
         <w:t>plt.savefig</w:t>
       </w:r>
       <w:proofErr w:type="spellEnd"/>
+      <w:proofErr w:type="gramEnd"/>
       <w:r>
         <w:t xml:space="preserve">('kde_credito.png', dpi=300, </w:t>
       </w:r>
@@ -4226,12 +4042,6 @@
         <w:gridCol w:w="9360"/>
       </w:tblGrid>
       <w:tr>
-        <w:tblPrEx>
-          <w:tblCellMar>
-            <w:top w:w="0" w:type="dxa"/>
-            <w:bottom w:w="0" w:type="dxa"/>
-          </w:tblCellMar>
-        </w:tblPrEx>
         <w:tc>
           <w:tcPr>
             <w:tcW w:w="9360" w:type="dxa"/>
@@ -5066,12 +4876,6 @@
         <w:gridCol w:w="9360"/>
       </w:tblGrid>
       <w:tr>
-        <w:tblPrEx>
-          <w:tblCellMar>
-            <w:top w:w="0" w:type="dxa"/>
-            <w:bottom w:w="0" w:type="dxa"/>
-          </w:tblCellMar>
-        </w:tblPrEx>
         <w:trPr>
           <w:trHeight w:hRule="exact" w:val="3600"/>
         </w:trPr>
@@ -5101,7 +4905,7 @@
               <w:drawing>
                 <wp:inline xmlns:a="http://schemas.openxmlformats.org/drawingml/2006/main" xmlns:pic="http://schemas.openxmlformats.org/drawingml/2006/picture">
                   <wp:extent cx="5486400" cy="3140697"/>
-                  <wp:docPr id="1" name="Picture 1"/>
+                  <wp:docPr id="25" name="Picture 25"/>
                   <wp:cNvGraphicFramePr>
                     <a:graphicFrameLocks noChangeAspect="1"/>
                   </wp:cNvGraphicFramePr>
@@ -5109,11 +4913,11 @@
                     <a:graphicData uri="http://schemas.openxmlformats.org/drawingml/2006/picture">
                       <pic:pic>
                         <pic:nvPicPr>
-                          <pic:cNvPr id="0" name="kde_credito.png"/>
+                          <pic:cNvPr id="0" name="image.png"/>
                           <pic:cNvPicPr/>
                         </pic:nvPicPr>
                         <pic:blipFill>
-                          <a:blip r:embed="rId11"/>
+                          <a:blip r:embed="rId7"/>
                           <a:stretch>
                             <a:fillRect/>
                           </a:stretch>
@@ -5256,12 +5060,6 @@
         <w:gridCol w:w="9360"/>
       </w:tblGrid>
       <w:tr>
-        <w:tblPrEx>
-          <w:tblCellMar>
-            <w:top w:w="0" w:type="dxa"/>
-            <w:bottom w:w="0" w:type="dxa"/>
-          </w:tblCellMar>
-        </w:tblPrEx>
         <w:tc>
           <w:tcPr>
             <w:tcW w:w="9360" w:type="dxa"/>
@@ -5316,15 +5114,7 @@
         </w:tc>
       </w:tr>
       <w:tr>
-        <w:tblPrEx>
-          <w:tblCellMar>
-            <w:top w:w="0" w:type="dxa"/>
-            <w:bottom w:w="0" w:type="dxa"/>
-          </w:tblCellMar>
-        </w:tblPrEx>
-        <w:trPr>
-          <w:trHeight w:hRule="exact" w:val="400"/>
-        </w:trPr>
+        <w:trPr/>
         <w:tc>
           <w:tcPr>
             <w:tcW w:w="9360" w:type="dxa"/>
@@ -5348,10 +5138,9 @@
             </w:pPr>
             <w:r>
               <w:rPr>
-                <w:b/>
                 <w:sz w:val="21"/>
               </w:rPr>
-              <w:t>Estadisticos por decada:</w:t>
+              <w:t>Medias por decada: 2000s = 562.6, 2010s = 574.7, 2020s = 583.4 (sigma ~143 estable).</w:t>
             </w:r>
           </w:p>
           <w:p>
@@ -5362,51 +5151,7 @@
               <w:rPr>
                 <w:sz w:val="21"/>
               </w:rPr>
-              <w:t xml:space="preserve">  2000s:  media = 562.6   desv. est. = 143.0</w:t>
-            </w:r>
-          </w:p>
-          <w:p>
-            <w:pPr>
-              <w:spacing w:after="80"/>
-            </w:pPr>
-            <w:r>
-              <w:rPr>
-                <w:sz w:val="21"/>
-              </w:rPr>
-              <w:t xml:space="preserve">  2010s:  media = 574.7   desv. est. = 141.8</w:t>
-            </w:r>
-          </w:p>
-          <w:p>
-            <w:pPr>
-              <w:spacing w:after="80"/>
-            </w:pPr>
-            <w:r>
-              <w:rPr>
-                <w:sz w:val="21"/>
-              </w:rPr>
-              <w:t xml:space="preserve">  2020s:  media = 583.4   desv. est. = 143.1</w:t>
-            </w:r>
-          </w:p>
-          <w:p>
-            <w:pPr>
-              <w:spacing w:after="80"/>
-            </w:pPr>
-            <w:r>
-              <w:rPr>
-                <w:sz w:val="21"/>
-              </w:rPr>
-              <w:t>El KDE revela un desplazamiento positivo de la distribucion del score crediticio corporativo a lo largo de las tres decadas: la media subio de 562.6 (2000s) a 583.4 (2020s), una mejora de aproximadamente 21 puntos. La dispersion permanece practicamente constante (sigma cercano a 143 en las tres decadas), lo que indica que la mejora es sistemica y no impulsada por unos pocos paises atipicos -- el universo entero se desplaza, no solo los extremos.</w:t>
-            </w:r>
-          </w:p>
-          <w:p>
-            <w:pPr>
-              <w:spacing w:after="80"/>
-            </w:pPr>
-            <w:r>
-              <w:rPr>
-                <w:sz w:val="21"/>
-              </w:rPr>
-              <w:t>Para los directores de Atlas Global Capital, este patron sugiere que el conjunto de emisores corporativos elegibles se ha ampliado modestamente hacia mejores grados de inversion. La implicacion estrategica es que se puede justificar una reduccion gradual del risk premium exigido a la cartera global, sin que ello implique mayor concentracion del riesgo, dado que la dispersion no se redujo.</w:t>
+              <w:t>El score crediticio mejora ~21 puntos en 20 anos con dispersion constante: la mejora es sistemica, no de pocos paises. Para Atlas implica que el universo de emisores investment-grade se amplio modestamente.</w:t>
             </w:r>
           </w:p>
         </w:tc>
@@ -5422,7 +5167,6 @@
         <w:pStyle w:val="Ttulo2"/>
       </w:pPr>
       <w:r>
-        <w:lastRenderedPageBreak/>
         <w:t xml:space="preserve">Tarea 1.2: </w:t>
       </w:r>
       <w:proofErr w:type="spellStart"/>
@@ -5650,10 +5394,12 @@
         <w:t xml:space="preserve">=1 (normalizar columnas) a </w:t>
       </w:r>
       <w:proofErr w:type="spellStart"/>
+      <w:proofErr w:type="gramStart"/>
       <w:r>
         <w:t>seaborn.clustermap</w:t>
       </w:r>
       <w:proofErr w:type="spellEnd"/>
+      <w:proofErr w:type="gramEnd"/>
       <w:r>
         <w:t>().</w:t>
       </w:r>
@@ -5740,10 +5486,12 @@
         <w:t xml:space="preserve">: </w:t>
       </w:r>
       <w:proofErr w:type="spellStart"/>
+      <w:proofErr w:type="gramStart"/>
       <w:r>
         <w:t>plt.savefig</w:t>
       </w:r>
       <w:proofErr w:type="spellEnd"/>
+      <w:proofErr w:type="gramEnd"/>
       <w:r>
         <w:t xml:space="preserve">('clustermap_2023.png', dpi=300, </w:t>
       </w:r>
@@ -5824,12 +5572,6 @@
         <w:gridCol w:w="9360"/>
       </w:tblGrid>
       <w:tr>
-        <w:tblPrEx>
-          <w:tblCellMar>
-            <w:top w:w="0" w:type="dxa"/>
-            <w:bottom w:w="0" w:type="dxa"/>
-          </w:tblCellMar>
-        </w:tblPrEx>
         <w:tc>
           <w:tcPr>
             <w:tcW w:w="9360" w:type="dxa"/>
@@ -6652,6 +6394,7 @@
         <w:pStyle w:val="Ttulo3"/>
       </w:pPr>
       <w:r>
+        <w:lastRenderedPageBreak/>
         <w:t>Pegado del Grafico</w:t>
       </w:r>
     </w:p>
@@ -6676,12 +6419,6 @@
         <w:gridCol w:w="9360"/>
       </w:tblGrid>
       <w:tr>
-        <w:tblPrEx>
-          <w:tblCellMar>
-            <w:top w:w="0" w:type="dxa"/>
-            <w:bottom w:w="0" w:type="dxa"/>
-          </w:tblCellMar>
-        </w:tblPrEx>
         <w:trPr>
           <w:trHeight w:hRule="exact" w:val="3600"/>
         </w:trPr>
@@ -6711,7 +6448,7 @@
               <w:drawing>
                 <wp:inline xmlns:a="http://schemas.openxmlformats.org/drawingml/2006/main" xmlns:pic="http://schemas.openxmlformats.org/drawingml/2006/picture">
                   <wp:extent cx="4572000" cy="9841503"/>
-                  <wp:docPr id="2" name="Picture 2"/>
+                  <wp:docPr id="26" name="Picture 26"/>
                   <wp:cNvGraphicFramePr>
                     <a:graphicFrameLocks noChangeAspect="1"/>
                   </wp:cNvGraphicFramePr>
@@ -6719,11 +6456,11 @@
                     <a:graphicData uri="http://schemas.openxmlformats.org/drawingml/2006/picture">
                       <pic:pic>
                         <pic:nvPicPr>
-                          <pic:cNvPr id="0" name="clustermap_2023.png"/>
+                          <pic:cNvPr id="0" name="image.png"/>
                           <pic:cNvPicPr/>
                         </pic:nvPicPr>
                         <pic:blipFill>
-                          <a:blip r:embed="rId12"/>
+                          <a:blip r:embed="rId8"/>
                           <a:stretch>
                             <a:fillRect/>
                           </a:stretch>
@@ -6838,12 +6575,6 @@
         <w:gridCol w:w="9360"/>
       </w:tblGrid>
       <w:tr>
-        <w:tblPrEx>
-          <w:tblCellMar>
-            <w:top w:w="0" w:type="dxa"/>
-            <w:bottom w:w="0" w:type="dxa"/>
-          </w:tblCellMar>
-        </w:tblPrEx>
         <w:tc>
           <w:tcPr>
             <w:tcW w:w="9360" w:type="dxa"/>
@@ -6962,15 +6693,7 @@
         </w:tc>
       </w:tr>
       <w:tr>
-        <w:tblPrEx>
-          <w:tblCellMar>
-            <w:top w:w="0" w:type="dxa"/>
-            <w:bottom w:w="0" w:type="dxa"/>
-          </w:tblCellMar>
-        </w:tblPrEx>
-        <w:trPr>
-          <w:trHeight w:hRule="exact" w:val="400"/>
-        </w:trPr>
+        <w:trPr/>
         <w:tc>
           <w:tcPr>
             <w:tcW w:w="9360" w:type="dxa"/>
@@ -6996,7 +6719,7 @@
               <w:rPr>
                 <w:sz w:val="21"/>
               </w:rPr>
-              <w:t>Al cortar el dendrograma en 4 clusters se identifican cuatro perfiles claramente diferenciados:</w:t>
+              <w:t>El dendrograma forma 4 clusters:</w:t>
             </w:r>
           </w:p>
           <w:p>
@@ -7008,18 +6731,7 @@
                 <w:b/>
                 <w:sz w:val="21"/>
               </w:rPr>
-              <w:t>Cluster 4 -- "Naciones Premium" (CO2 alto, Credit alto, GDP alto, Trade ~75):</w:t>
-            </w:r>
-          </w:p>
-          <w:p>
-            <w:pPr>
-              <w:spacing w:after="80"/>
-            </w:pPr>
-            <w:r>
-              <w:rPr>
-                <w:sz w:val="21"/>
-              </w:rPr>
-              <w:t xml:space="preserve">   Paises representativos: United States, United Kingdom, Canada, South Korea, Turkey.</w:t>
+              <w:t>Premium (Trade ~75): US, UK, Canada, Korea, Turkey.</w:t>
             </w:r>
           </w:p>
           <w:p>
@@ -7031,18 +6743,7 @@
                 <w:b/>
                 <w:sz w:val="21"/>
               </w:rPr>
-              <w:t>Cluster 3 -- "Economias Industrializadas Medias" (CO2 medio-alto, Trade ~53):</w:t>
-            </w:r>
-          </w:p>
-          <w:p>
-            <w:pPr>
-              <w:spacing w:after="80"/>
-            </w:pPr>
-            <w:r>
-              <w:rPr>
-                <w:sz w:val="21"/>
-              </w:rPr>
-              <w:t xml:space="preserve">   Paises representativos: Indonesia, Poland, Belgium, Nigeria, Philippines.</w:t>
+              <w:t>Industrializadas Medias (Trade ~53): Indonesia, Poland, Belgium.</w:t>
             </w:r>
           </w:p>
           <w:p>
@@ -7054,18 +6755,7 @@
                 <w:b/>
                 <w:sz w:val="21"/>
               </w:rPr>
-              <w:t>Cluster 1 -- "Mercados Emergentes Mixtos" (CO2 medio, Trade ~38):</w:t>
-            </w:r>
-          </w:p>
-          <w:p>
-            <w:pPr>
-              <w:spacing w:after="80"/>
-            </w:pPr>
-            <w:r>
-              <w:rPr>
-                <w:sz w:val="21"/>
-              </w:rPr>
-              <w:t xml:space="preserve">   Paises representativos: China, Japan, Germany, India, France.</w:t>
+              <w:t>Emergentes Mixtos (Trade ~38): China, Japan, Germany, India, France.</w:t>
             </w:r>
           </w:p>
           <w:p>
@@ -7077,7 +6767,7 @@
                 <w:b/>
                 <w:sz w:val="21"/>
               </w:rPr>
-              <w:t>Cluster 2 -- "Economias de Bajo Impacto" (CO2 bajo, Trade ~20):</w:t>
+              <w:t>Bajo Impacto (Trade ~20): Italy, Brazil, Russia, Australia, Mexico.</w:t>
             </w:r>
           </w:p>
           <w:p>
@@ -7088,18 +6778,7 @@
               <w:rPr>
                 <w:sz w:val="21"/>
               </w:rPr>
-              <w:t xml:space="preserve">   Paises representativos: Italy, Brazil, Russia, Australia, Mexico.</w:t>
-            </w:r>
-          </w:p>
-          <w:p>
-            <w:pPr>
-              <w:spacing w:after="80"/>
-            </w:pPr>
-            <w:r>
-              <w:rPr>
-                <w:sz w:val="21"/>
-              </w:rPr>
-              <w:t>Las variables que dominan la separacion son GDP_Per_Capita, Average_Credit_Score_Corporate y Trade_Connectivity_Index, que se mueven juntas (correlaciones superiores a 0.93). CO2_Emissions_Per_Capita correlaciona positivamente con ellas: las economias mas ricas son tambien las mas contaminantes -- un trade-off central para la estrategia ESG del fondo.</w:t>
+              <w:t>GDP, Credit y Trade se mueven juntos (r &gt; 0.93) y CO2 tambien correlaciona positivamente: las economias mas ricas son las mas contaminantes.</w:t>
             </w:r>
           </w:p>
         </w:tc>
@@ -7153,12 +6832,6 @@
         <w:gridCol w:w="9360"/>
       </w:tblGrid>
       <w:tr>
-        <w:tblPrEx>
-          <w:tblCellMar>
-            <w:top w:w="0" w:type="dxa"/>
-            <w:bottom w:w="0" w:type="dxa"/>
-          </w:tblCellMar>
-        </w:tblPrEx>
         <w:tc>
           <w:tcPr>
             <w:tcW w:w="9360" w:type="dxa"/>
@@ -7199,12 +6872,6 @@
         </w:tc>
       </w:tr>
       <w:tr>
-        <w:tblPrEx>
-          <w:tblCellMar>
-            <w:top w:w="0" w:type="dxa"/>
-            <w:bottom w:w="0" w:type="dxa"/>
-          </w:tblCellMar>
-        </w:tblPrEx>
         <w:tc>
           <w:tcPr>
             <w:tcW w:w="9360" w:type="dxa"/>
@@ -7418,6 +7085,7 @@
         <w:t>numeric_cols</w:t>
       </w:r>
       <w:proofErr w:type="spellEnd"/>
+      <w:proofErr w:type="gramStart"/>
       <w:r>
         <w:t>].</w:t>
       </w:r>
@@ -7426,6 +7094,7 @@
         <w:t>corr</w:t>
       </w:r>
       <w:proofErr w:type="spellEnd"/>
+      <w:proofErr w:type="gramEnd"/>
       <w:r>
         <w:t>().</w:t>
       </w:r>
@@ -7451,10 +7120,12 @@
         <w:t xml:space="preserve"> con </w:t>
       </w:r>
       <w:proofErr w:type="spellStart"/>
+      <w:proofErr w:type="gramStart"/>
       <w:r>
         <w:t>seaborn.heatmap</w:t>
       </w:r>
       <w:proofErr w:type="spellEnd"/>
+      <w:proofErr w:type="gramEnd"/>
       <w:r>
         <w:t xml:space="preserve">(). </w:t>
       </w:r>
@@ -7540,10 +7211,12 @@
         <w:t xml:space="preserve"> = </w:t>
       </w:r>
       <w:proofErr w:type="spellStart"/>
+      <w:proofErr w:type="gramStart"/>
       <w:r>
         <w:t>np.triu</w:t>
       </w:r>
       <w:proofErr w:type="spellEnd"/>
+      <w:proofErr w:type="gramEnd"/>
       <w:r>
         <w:t>(</w:t>
       </w:r>
@@ -7602,10 +7275,12 @@
         <w:t xml:space="preserve">Exporta: </w:t>
       </w:r>
       <w:proofErr w:type="spellStart"/>
+      <w:proofErr w:type="gramStart"/>
       <w:r>
         <w:t>plt.savefig</w:t>
       </w:r>
       <w:proofErr w:type="spellEnd"/>
+      <w:proofErr w:type="gramEnd"/>
       <w:r>
         <w:t xml:space="preserve">('heatmap_correlacion.png', dpi=300, </w:t>
       </w:r>
@@ -7665,12 +7340,6 @@
         <w:gridCol w:w="9360"/>
       </w:tblGrid>
       <w:tr>
-        <w:tblPrEx>
-          <w:tblCellMar>
-            <w:top w:w="0" w:type="dxa"/>
-            <w:bottom w:w="0" w:type="dxa"/>
-          </w:tblCellMar>
-        </w:tblPrEx>
         <w:tc>
           <w:tcPr>
             <w:tcW w:w="9360" w:type="dxa"/>
@@ -8601,12 +8270,6 @@
         <w:gridCol w:w="9360"/>
       </w:tblGrid>
       <w:tr>
-        <w:tblPrEx>
-          <w:tblCellMar>
-            <w:top w:w="0" w:type="dxa"/>
-            <w:bottom w:w="0" w:type="dxa"/>
-          </w:tblCellMar>
-        </w:tblPrEx>
         <w:trPr>
           <w:trHeight w:hRule="exact" w:val="2800"/>
         </w:trPr>
@@ -8636,7 +8299,7 @@
               <w:drawing>
                 <wp:inline xmlns:a="http://schemas.openxmlformats.org/drawingml/2006/main" xmlns:pic="http://schemas.openxmlformats.org/drawingml/2006/picture">
                   <wp:extent cx="5486400" cy="4186281"/>
-                  <wp:docPr id="3" name="Picture 3"/>
+                  <wp:docPr id="27" name="Picture 27"/>
                   <wp:cNvGraphicFramePr>
                     <a:graphicFrameLocks noChangeAspect="1"/>
                   </wp:cNvGraphicFramePr>
@@ -8644,11 +8307,11 @@
                     <a:graphicData uri="http://schemas.openxmlformats.org/drawingml/2006/picture">
                       <pic:pic>
                         <pic:nvPicPr>
-                          <pic:cNvPr id="0" name="heatmap_correlacion.png"/>
+                          <pic:cNvPr id="0" name="image.png"/>
                           <pic:cNvPicPr/>
                         </pic:nvPicPr>
                         <pic:blipFill>
-                          <a:blip r:embed="rId13"/>
+                          <a:blip r:embed="rId9"/>
                           <a:stretch>
                             <a:fillRect/>
                           </a:stretch>
@@ -8680,10 +8343,7 @@
         <w:pStyle w:val="Ttulo3"/>
       </w:pPr>
       <w:r>
-        <w:t>Conclusión</w:t>
-      </w:r>
-      <w:r>
-        <w:t xml:space="preserve"> sobre Multicolinealidad</w:t>
+        <w:t>Conclusión sobre Multicolinealidad</w:t>
       </w:r>
     </w:p>
     <w:p>
@@ -8695,14 +8355,7 @@
           <w:b/>
           <w:bCs/>
         </w:rPr>
-        <w:t>instrucción</w:t>
-      </w:r>
-      <w:r>
-        <w:rPr>
-          <w:b/>
-          <w:bCs/>
-        </w:rPr>
-        <w:t xml:space="preserve">: </w:t>
+        <w:t xml:space="preserve">instrucción: </w:t>
       </w:r>
       <w:r>
         <w:t xml:space="preserve">Responde las siguientes preguntas con base en tu </w:t>
@@ -8729,19 +8382,7 @@
       </w:r>
       <w:proofErr w:type="spellEnd"/>
       <w:r>
-        <w:t xml:space="preserve">? (b) ¿Que par de variables presenta la </w:t>
-      </w:r>
-      <w:r>
-        <w:t>correlación</w:t>
-      </w:r>
-      <w:r>
-        <w:t xml:space="preserve"> </w:t>
-      </w:r>
-      <w:r>
-        <w:t>más</w:t>
-      </w:r>
-      <w:r>
-        <w:t xml:space="preserve"> alta del </w:t>
+        <w:t xml:space="preserve">? (b) ¿Que par de variables presenta la correlación más alta del </w:t>
       </w:r>
       <w:proofErr w:type="spellStart"/>
       <w:r>
@@ -8749,19 +8390,7 @@
       </w:r>
       <w:proofErr w:type="spellEnd"/>
       <w:r>
-        <w:t xml:space="preserve">? (c) ¿Que </w:t>
-      </w:r>
-      <w:r>
-        <w:t>recomendación</w:t>
-      </w:r>
-      <w:r>
-        <w:t xml:space="preserve"> </w:t>
-      </w:r>
-      <w:r>
-        <w:t>harías</w:t>
-      </w:r>
-      <w:r>
-        <w:t xml:space="preserve"> al equipo de modelado?</w:t>
+        <w:t>? (c) ¿Que recomendación harías al equipo de modelado?</w:t>
       </w:r>
     </w:p>
     <w:p>
@@ -8790,12 +8419,6 @@
         <w:gridCol w:w="9360"/>
       </w:tblGrid>
       <w:tr>
-        <w:tblPrEx>
-          <w:tblCellMar>
-            <w:top w:w="0" w:type="dxa"/>
-            <w:bottom w:w="0" w:type="dxa"/>
-          </w:tblCellMar>
-        </w:tblPrEx>
         <w:tc>
           <w:tcPr>
             <w:tcW w:w="9360" w:type="dxa"/>
@@ -8848,15 +8471,7 @@
         </w:tc>
       </w:tr>
       <w:tr>
-        <w:tblPrEx>
-          <w:tblCellMar>
-            <w:top w:w="0" w:type="dxa"/>
-            <w:bottom w:w="0" w:type="dxa"/>
-          </w:tblCellMar>
-        </w:tblPrEx>
-        <w:trPr>
-          <w:trHeight w:hRule="exact" w:val="400"/>
-        </w:trPr>
+        <w:trPr/>
         <w:tc>
           <w:tcPr>
             <w:tcW w:w="9360" w:type="dxa"/>
@@ -8883,18 +8498,7 @@
                 <w:b/>
                 <w:sz w:val="21"/>
               </w:rPr>
-              <w:t>(a) Multicolinealidad entre GDP_Per_Capita y Trade_Connectivity_Index:</w:t>
-            </w:r>
-          </w:p>
-          <w:p>
-            <w:pPr>
-              <w:spacing w:after="80"/>
-            </w:pPr>
-            <w:r>
-              <w:rPr>
-                <w:sz w:val="21"/>
-              </w:rPr>
-              <w:t xml:space="preserve">   Si, r = 0.953 que es mayor a 0.85 -- multicolinealidad severa. Estas dos variables miden esencialmente la misma dimension latente de "desarrollo economico".</w:t>
+              <w:t>(a) GDP vs Trade: r = 0.953, multicolinealidad severa (&gt;0.85).</w:t>
             </w:r>
           </w:p>
           <w:p>
@@ -8906,18 +8510,7 @@
                 <w:b/>
                 <w:sz w:val="21"/>
               </w:rPr>
-              <w:t>(b) Par con la correlacion mas alta del dataset:</w:t>
-            </w:r>
-          </w:p>
-          <w:p>
-            <w:pPr>
-              <w:spacing w:after="80"/>
-            </w:pPr>
-            <w:r>
-              <w:rPr>
-                <w:sz w:val="21"/>
-              </w:rPr>
-              <w:t xml:space="preserve">   Average_Credit_Score_Corporate ~ GDP_Per_Capita con r = 0.960. Es logico desde el punto de vista financiero: economias con mayor PIB sostienen empresas con mejor calidad crediticia, mayor capacidad de repago y menor riesgo soberano.</w:t>
+              <w:t>(b) Par mas alto: Credit ~ GDP con r = 0.960. Logico: mas PIB implica empresas con mejor credito.</w:t>
             </w:r>
           </w:p>
           <w:p>
@@ -8929,18 +8522,7 @@
                 <w:b/>
                 <w:sz w:val="21"/>
               </w:rPr>
-              <w:t>(c) Recomendacion al equipo de modelado:</w:t>
-            </w:r>
-          </w:p>
-          <w:p>
-            <w:pPr>
-              <w:spacing w:after="80"/>
-            </w:pPr>
-            <w:r>
-              <w:rPr>
-                <w:sz w:val="21"/>
-              </w:rPr>
-              <w:t xml:space="preserve">   No usar las cuatro variables explicativas simultaneamente en una regresion lineal -- los coeficientes se volverian inestables y los errores estandar se inflarian. Tres alternativas viables: (1) reducir dimensionalidad con PCA y trabajar con uno o dos componentes principales que capturen ~95% de la varianza; (2) elegir una sola variable de "desarrollo" (recomiendo GDP_Per_Capita) y descartar las redundantes; (3) usar modelos robustos a multicolinealidad como Ridge, Lasso, o arboles (XGBoost). Calcular el VIF (Variance Inflation Factor) antes de cualquier modelado supervisado para confirmar el diagnostico.</w:t>
+              <w:t>(c) Recomendacion: no usar las 4 variables juntas en regresion. Opciones: PCA, quedarse solo con GDP, o usar modelos robustos (Ridge/XGBoost). Calcular VIF antes de modelar.</w:t>
             </w:r>
           </w:p>
         </w:tc>
@@ -9002,8 +8584,13 @@
         <w:t xml:space="preserve">) y visualizarla con </w:t>
       </w:r>
       <w:proofErr w:type="spellStart"/>
-      <w:r>
-        <w:t>plotly.express.imshow</w:t>
+      <w:proofErr w:type="gramStart"/>
+      <w:r>
+        <w:t>plotly.express</w:t>
+      </w:r>
+      <w:proofErr w:type="gramEnd"/>
+      <w:r>
+        <w:t>.imshow</w:t>
       </w:r>
       <w:proofErr w:type="spellEnd"/>
       <w:r>
@@ -9034,7 +8621,6 @@
         <w:pStyle w:val="Ttulo3"/>
       </w:pPr>
       <w:r>
-        <w:lastRenderedPageBreak/>
         <w:t>Instrucciones Paso a Paso</w:t>
       </w:r>
     </w:p>
@@ -9078,10 +8664,12 @@
         <w:t>Genera o simula una matriz de adyacencia 15x15 donde cada celda [</w:t>
       </w:r>
       <w:proofErr w:type="spellStart"/>
+      <w:proofErr w:type="gramStart"/>
       <w:r>
         <w:t>i,j</w:t>
       </w:r>
       <w:proofErr w:type="spellEnd"/>
+      <w:proofErr w:type="gramEnd"/>
       <w:r>
         <w:t xml:space="preserve">] representa el volumen comercial entre el </w:t>
       </w:r>
@@ -9111,8 +8699,13 @@
         <w:t xml:space="preserve">Usa </w:t>
       </w:r>
       <w:proofErr w:type="spellStart"/>
-      <w:r>
-        <w:t>plotly.express.imshow</w:t>
+      <w:proofErr w:type="gramStart"/>
+      <w:r>
+        <w:t>plotly.express</w:t>
+      </w:r>
+      <w:proofErr w:type="gramEnd"/>
+      <w:r>
+        <w:t>.imshow</w:t>
       </w:r>
       <w:proofErr w:type="spellEnd"/>
       <w:r>
@@ -9228,8 +8821,13 @@
         <w:t xml:space="preserve">Guarda como archivo HTML: </w:t>
       </w:r>
       <w:proofErr w:type="spellStart"/>
-      <w:r>
-        <w:t>fig.write_html</w:t>
+      <w:proofErr w:type="gramStart"/>
+      <w:r>
+        <w:t>fig.write</w:t>
+      </w:r>
+      <w:proofErr w:type="gramEnd"/>
+      <w:r>
+        <w:t>_html</w:t>
       </w:r>
       <w:proofErr w:type="spellEnd"/>
       <w:r>
@@ -9275,12 +8873,6 @@
         <w:gridCol w:w="9360"/>
       </w:tblGrid>
       <w:tr>
-        <w:tblPrEx>
-          <w:tblCellMar>
-            <w:top w:w="0" w:type="dxa"/>
-            <w:bottom w:w="0" w:type="dxa"/>
-          </w:tblCellMar>
-        </w:tblPrEx>
         <w:tc>
           <w:tcPr>
             <w:tcW w:w="9360" w:type="dxa"/>
@@ -10231,14 +9823,7 @@
           <w:b/>
           <w:bCs/>
         </w:rPr>
-        <w:t>instrucción</w:t>
-      </w:r>
-      <w:r>
-        <w:rPr>
-          <w:b/>
-          <w:bCs/>
-        </w:rPr>
-        <w:t xml:space="preserve">: </w:t>
+        <w:t xml:space="preserve">instrucción: </w:t>
       </w:r>
       <w:r>
         <w:t xml:space="preserve">Toma una captura de pantalla mostrando el </w:t>
@@ -10257,13 +9842,7 @@
       </w:r>
       <w:proofErr w:type="spellEnd"/>
       <w:r>
-        <w:t xml:space="preserve"> sobre una celda. </w:t>
-      </w:r>
-      <w:r>
-        <w:t>pégala</w:t>
-      </w:r>
-      <w:r>
-        <w:t xml:space="preserve"> abajo. El </w:t>
+        <w:t xml:space="preserve"> sobre una celda. pégala abajo. El </w:t>
       </w:r>
       <w:proofErr w:type="spellStart"/>
       <w:r>
@@ -10271,19 +9850,7 @@
       </w:r>
       <w:proofErr w:type="spellEnd"/>
       <w:r>
-        <w:t xml:space="preserve"> DEBE mostrar el formato: 'Origen: [</w:t>
-      </w:r>
-      <w:r>
-        <w:t>País</w:t>
-      </w:r>
-      <w:r>
-        <w:t>] | Destino: [</w:t>
-      </w:r>
-      <w:r>
-        <w:t>País</w:t>
-      </w:r>
-      <w:r>
-        <w:t>] | Volumen: [valor]'.</w:t>
+        <w:t xml:space="preserve"> DEBE mostrar el formato: 'Origen: [País] | Destino: [País] | Volumen: [valor]'.</w:t>
       </w:r>
     </w:p>
     <w:p>
@@ -10312,12 +9879,6 @@
         <w:gridCol w:w="9360"/>
       </w:tblGrid>
       <w:tr>
-        <w:tblPrEx>
-          <w:tblCellMar>
-            <w:top w:w="0" w:type="dxa"/>
-            <w:bottom w:w="0" w:type="dxa"/>
-          </w:tblCellMar>
-        </w:tblPrEx>
         <w:trPr>
           <w:trHeight w:hRule="exact" w:val="2200"/>
         </w:trPr>
@@ -10347,7 +9908,7 @@
               <w:drawing>
                 <wp:inline xmlns:a="http://schemas.openxmlformats.org/drawingml/2006/main" xmlns:pic="http://schemas.openxmlformats.org/drawingml/2006/picture">
                   <wp:extent cx="5486400" cy="5143500"/>
-                  <wp:docPr id="4" name="Picture 4"/>
+                  <wp:docPr id="28" name="Picture 28"/>
                   <wp:cNvGraphicFramePr>
                     <a:graphicFrameLocks noChangeAspect="1"/>
                   </wp:cNvGraphicFramePr>
@@ -10355,11 +9916,11 @@
                     <a:graphicData uri="http://schemas.openxmlformats.org/drawingml/2006/picture">
                       <pic:pic>
                         <pic:nvPicPr>
-                          <pic:cNvPr id="0" name="adyacencia.PNG"/>
+                          <pic:cNvPr id="0" name="image.png"/>
                           <pic:cNvPicPr/>
                         </pic:nvPicPr>
                         <pic:blipFill>
-                          <a:blip r:embed="rId14"/>
+                          <a:blip r:embed="rId10"/>
                           <a:stretch>
                             <a:fillRect/>
                           </a:stretch>
@@ -10407,12 +9968,6 @@
         <w:gridCol w:w="9360"/>
       </w:tblGrid>
       <w:tr>
-        <w:tblPrEx>
-          <w:tblCellMar>
-            <w:top w:w="0" w:type="dxa"/>
-            <w:bottom w:w="0" w:type="dxa"/>
-          </w:tblCellMar>
-        </w:tblPrEx>
         <w:tc>
           <w:tcPr>
             <w:tcW w:w="9360" w:type="dxa"/>
@@ -10439,7 +9994,7 @@
                 <w:sz w:val="18"/>
                 <w:szCs w:val="18"/>
               </w:rPr>
-              <w:t xml:space="preserve">Explica brevemente las diferencias entre usar Seaborn vs </w:t>
+              <w:t xml:space="preserve">Explica brevemente las diferencias entre usar </w:t>
             </w:r>
             <w:proofErr w:type="spellStart"/>
             <w:r>
@@ -10450,7 +10005,7 @@
                 <w:sz w:val="18"/>
                 <w:szCs w:val="18"/>
               </w:rPr>
-              <w:t>Plotly</w:t>
+              <w:t>Seaborn</w:t>
             </w:r>
             <w:proofErr w:type="spellEnd"/>
             <w:r>
@@ -10461,8 +10016,9 @@
                 <w:sz w:val="18"/>
                 <w:szCs w:val="18"/>
               </w:rPr>
-              <w:t xml:space="preserve"> para este tipo de </w:t>
-            </w:r>
+              <w:t xml:space="preserve"> vs </w:t>
+            </w:r>
+            <w:proofErr w:type="spellStart"/>
             <w:r>
               <w:rPr>
                 <w:i/>
@@ -10471,8 +10027,9 @@
                 <w:sz w:val="18"/>
                 <w:szCs w:val="18"/>
               </w:rPr>
-              <w:t>visualización</w:t>
-            </w:r>
+              <w:t>Plotly</w:t>
+            </w:r>
+            <w:proofErr w:type="spellEnd"/>
             <w:r>
               <w:rPr>
                 <w:i/>
@@ -10481,21 +10038,33 @@
                 <w:sz w:val="18"/>
                 <w:szCs w:val="18"/>
               </w:rPr>
+              <w:t xml:space="preserve"> para este tipo de </w:t>
+            </w:r>
+            <w:r>
+              <w:rPr>
+                <w:i/>
+                <w:iCs/>
+                <w:color w:val="595959"/>
+                <w:sz w:val="18"/>
+                <w:szCs w:val="18"/>
+              </w:rPr>
+              <w:t>visualización</w:t>
+            </w:r>
+            <w:r>
+              <w:rPr>
+                <w:i/>
+                <w:iCs/>
+                <w:color w:val="595959"/>
+                <w:sz w:val="18"/>
+                <w:szCs w:val="18"/>
+              </w:rPr>
               <w:t xml:space="preserve"> matricial:</w:t>
             </w:r>
           </w:p>
         </w:tc>
       </w:tr>
       <w:tr>
-        <w:tblPrEx>
-          <w:tblCellMar>
-            <w:top w:w="0" w:type="dxa"/>
-            <w:bottom w:w="0" w:type="dxa"/>
-          </w:tblCellMar>
-        </w:tblPrEx>
-        <w:trPr>
-          <w:trHeight w:hRule="exact" w:val="400"/>
-        </w:trPr>
+        <w:trPr/>
         <w:tc>
           <w:tcPr>
             <w:tcW w:w="9360" w:type="dxa"/>
@@ -10521,7 +10090,7 @@
               <w:rPr>
                 <w:sz w:val="21"/>
               </w:rPr>
-              <w:t>Seaborn produce imagenes estaticas en formato PNG (vectorial cuando se exporta a PDF) ideales para informes impresos, articulos academicos y documentos archivables donde la audiencia consume el grafico de forma lineal y sin interaccion. Plotly genera HTML interactivo que permite hover, zoom, filtrado y exploracion dinamica -- esencial cuando los analistas necesitan inspeccionar relaciones celda por celda.</w:t>
+              <w:t>Seaborn: PNG estatico para PDF impreso. Plotly: HTML interactivo con hover y zoom.</w:t>
             </w:r>
           </w:p>
           <w:p>
@@ -10530,54 +10099,9 @@
             </w:pPr>
             <w:r>
               <w:rPr>
-                <w:b/>
                 <w:sz w:val="21"/>
               </w:rPr>
-              <w:t>Tres criterios de decision para un Data Scientist Senior:</w:t>
-            </w:r>
-          </w:p>
-          <w:p>
-            <w:pPr>
-              <w:spacing w:after="80"/>
-            </w:pPr>
-            <w:r>
-              <w:rPr>
-                <w:sz w:val="21"/>
-              </w:rPr>
-              <w:t>1) Medio de consumo: Seaborn para PDF impresos / Plotly para navegador.</w:t>
-            </w:r>
-          </w:p>
-          <w:p>
-            <w:pPr>
-              <w:spacing w:after="80"/>
-            </w:pPr>
-            <w:r>
-              <w:rPr>
-                <w:sz w:val="21"/>
-              </w:rPr>
-              <w:t>2) Interactividad: Plotly soporta tooltips personalizados con custom_data y hovertemplate -- imposible en Seaborn.</w:t>
-            </w:r>
-          </w:p>
-          <w:p>
-            <w:pPr>
-              <w:spacing w:after="80"/>
-            </w:pPr>
-            <w:r>
-              <w:rPr>
-                <w:sz w:val="21"/>
-              </w:rPr>
-              <w:t>3) Tamano del entregable: Seaborn produce archivos de pocos KB (PNG 300 dpi), Plotly produce MB porque embebe Plotly.js completo.</w:t>
-            </w:r>
-          </w:p>
-          <w:p>
-            <w:pPr>
-              <w:spacing w:after="80"/>
-            </w:pPr>
-            <w:r>
-              <w:rPr>
-                <w:sz w:val="21"/>
-              </w:rPr>
-              <w:t>Para esta matriz 15x15 con etiquetas Origen-&gt;Destino, Plotly es la eleccion correcta porque los analistas de inversion necesitan hacer hover sobre celdas especificas para identificar relaciones bilaterales -- algo imposible en una imagen estatica.</w:t>
+              <w:t>Para esta matriz 15x15 Plotly gana porque el tooltip Origen-&gt;Destino solo tiene sentido si se puede hacer hover; en imagen estatica seria ilegible.</w:t>
             </w:r>
           </w:p>
         </w:tc>
@@ -10631,12 +10155,6 @@
         <w:gridCol w:w="9360"/>
       </w:tblGrid>
       <w:tr>
-        <w:tblPrEx>
-          <w:tblCellMar>
-            <w:top w:w="0" w:type="dxa"/>
-            <w:bottom w:w="0" w:type="dxa"/>
-          </w:tblCellMar>
-        </w:tblPrEx>
         <w:tc>
           <w:tcPr>
             <w:tcW w:w="9360" w:type="dxa"/>
@@ -10677,12 +10195,6 @@
         </w:tc>
       </w:tr>
       <w:tr>
-        <w:tblPrEx>
-          <w:tblCellMar>
-            <w:top w:w="0" w:type="dxa"/>
-            <w:bottom w:w="0" w:type="dxa"/>
-          </w:tblCellMar>
-        </w:tblPrEx>
         <w:tc>
           <w:tcPr>
             <w:tcW w:w="9360" w:type="dxa"/>
@@ -10706,10 +10218,7 @@
               <w:jc w:val="both"/>
             </w:pPr>
             <w:r>
-              <w:t>Creación</w:t>
-            </w:r>
-            <w:r>
-              <w:t xml:space="preserve"> de un mapa </w:t>
+              <w:t xml:space="preserve">Creación de un mapa </w:t>
             </w:r>
             <w:proofErr w:type="spellStart"/>
             <w:r>
@@ -10717,13 +10226,7 @@
             </w:r>
             <w:proofErr w:type="spellEnd"/>
             <w:r>
-              <w:t xml:space="preserve"> mundial animado que muestre la </w:t>
-            </w:r>
-            <w:r>
-              <w:t>evolución</w:t>
-            </w:r>
-            <w:r>
-              <w:t xml:space="preserve"> de las emisiones de CO2 por habitante desde el </w:t>
+              <w:t xml:space="preserve"> mundial animado que muestre la evolución de las emisiones de CO2 por habitante desde el </w:t>
             </w:r>
             <w:r>
               <w:t>año</w:t>
@@ -10936,10 +10439,12 @@
         <w:t xml:space="preserve">Usa </w:t>
       </w:r>
       <w:proofErr w:type="spellStart"/>
+      <w:proofErr w:type="gramStart"/>
       <w:r>
         <w:t>px.choropleth</w:t>
       </w:r>
       <w:proofErr w:type="spellEnd"/>
+      <w:proofErr w:type="gramEnd"/>
       <w:r>
         <w:t xml:space="preserve">() con los </w:t>
       </w:r>
@@ -11075,7 +10580,15 @@
       </w:r>
       <w:proofErr w:type="spellEnd"/>
       <w:r>
-        <w:t xml:space="preserve">=[df.CO2.min(), df.CO2.max()] para que la escala sea CONSISTENTE en todos los </w:t>
+        <w:t>=[</w:t>
+      </w:r>
+      <w:proofErr w:type="gramStart"/>
+      <w:r>
+        <w:t>df.CO2.min(</w:t>
+      </w:r>
+      <w:proofErr w:type="gramEnd"/>
+      <w:r>
+        <w:t xml:space="preserve">), df.CO2.max()] para que la escala sea CONSISTENTE en todos los </w:t>
       </w:r>
       <w:proofErr w:type="spellStart"/>
       <w:r>
@@ -11158,8 +10671,13 @@
         <w:t xml:space="preserve">Guarda como HTML: </w:t>
       </w:r>
       <w:proofErr w:type="spellStart"/>
-      <w:r>
-        <w:t>fig.write_html</w:t>
+      <w:proofErr w:type="gramStart"/>
+      <w:r>
+        <w:t>fig.write</w:t>
+      </w:r>
+      <w:proofErr w:type="gramEnd"/>
+      <w:r>
+        <w:t>_html</w:t>
       </w:r>
       <w:proofErr w:type="spellEnd"/>
       <w:r>
@@ -11192,12 +10710,6 @@
         <w:gridCol w:w="9360"/>
       </w:tblGrid>
       <w:tr>
-        <w:tblPrEx>
-          <w:tblCellMar>
-            <w:top w:w="0" w:type="dxa"/>
-            <w:bottom w:w="0" w:type="dxa"/>
-          </w:tblCellMar>
-        </w:tblPrEx>
         <w:tc>
           <w:tcPr>
             <w:tcW w:w="9360" w:type="dxa"/>
@@ -11246,12 +10758,6 @@
         </w:tc>
       </w:tr>
       <w:tr>
-        <w:tblPrEx>
-          <w:tblCellMar>
-            <w:top w:w="0" w:type="dxa"/>
-            <w:bottom w:w="0" w:type="dxa"/>
-          </w:tblCellMar>
-        </w:tblPrEx>
         <w:tc>
           <w:tcPr>
             <w:tcW w:w="9360" w:type="dxa"/>
@@ -11370,12 +10876,6 @@
         <w:gridCol w:w="9360"/>
       </w:tblGrid>
       <w:tr>
-        <w:tblPrEx>
-          <w:tblCellMar>
-            <w:top w:w="0" w:type="dxa"/>
-            <w:bottom w:w="0" w:type="dxa"/>
-          </w:tblCellMar>
-        </w:tblPrEx>
         <w:tc>
           <w:tcPr>
             <w:tcW w:w="9360" w:type="dxa"/>
@@ -12140,7 +11640,15 @@
         <w:t>Asegúrate</w:t>
       </w:r>
       <w:r>
-        <w:t xml:space="preserve"> de que se vea el slider de </w:t>
+        <w:t xml:space="preserve"> de que se vea </w:t>
+      </w:r>
+      <w:proofErr w:type="gramStart"/>
+      <w:r>
+        <w:t>el slider</w:t>
+      </w:r>
+      <w:proofErr w:type="gramEnd"/>
+      <w:r>
+        <w:t xml:space="preserve"> de </w:t>
       </w:r>
       <w:r>
         <w:t>animación</w:t>
@@ -12176,12 +11684,6 @@
         <w:gridCol w:w="4870"/>
       </w:tblGrid>
       <w:tr>
-        <w:tblPrEx>
-          <w:tblCellMar>
-            <w:top w:w="0" w:type="dxa"/>
-            <w:bottom w:w="0" w:type="dxa"/>
-          </w:tblCellMar>
-        </w:tblPrEx>
         <w:tc>
           <w:tcPr>
             <w:tcW w:w="4500" w:type="dxa"/>
@@ -12219,12 +11721,6 @@
               <w:gridCol w:w="4380"/>
             </w:tblGrid>
             <w:tr>
-              <w:tblPrEx>
-                <w:tblCellMar>
-                  <w:top w:w="0" w:type="dxa"/>
-                  <w:bottom w:w="0" w:type="dxa"/>
-                </w:tblCellMar>
-              </w:tblPrEx>
               <w:tc>
                 <w:tcPr>
                   <w:tcW w:w="4380" w:type="dxa"/>
@@ -12280,12 +11776,6 @@
               </w:tc>
             </w:tr>
             <w:tr>
-              <w:tblPrEx>
-                <w:tblCellMar>
-                  <w:top w:w="0" w:type="dxa"/>
-                  <w:bottom w:w="0" w:type="dxa"/>
-                </w:tblCellMar>
-              </w:tblPrEx>
               <w:trPr>
                 <w:trHeight w:hRule="exact" w:val="2000"/>
               </w:trPr>
@@ -12319,8 +11809,21 @@
                       <w:sz w:val="20"/>
                       <w:szCs w:val="20"/>
                     </w:rPr>
-                    <w:t>[ Captura 2000 ]</w:t>
+                    <w:lastRenderedPageBreak/>
+                    <w:t xml:space="preserve">[ Captura </w:t>
                   </w:r>
+                  <w:proofErr w:type="gramStart"/>
+                  <w:r>
+                    <w:rPr>
+                      <w:i/>
+                      <w:iCs/>
+                      <w:color w:val="595959"/>
+                      <w:sz w:val="20"/>
+                      <w:szCs w:val="20"/>
+                    </w:rPr>
+                    <w:t>2000 ]</w:t>
+                  </w:r>
+                  <w:proofErr w:type="gramEnd"/>
                 </w:p>
               </w:tc>
             </w:tr>
@@ -12333,7 +11836,7 @@
               <w:drawing>
                 <wp:inline xmlns:a="http://schemas.openxmlformats.org/drawingml/2006/main" xmlns:pic="http://schemas.openxmlformats.org/drawingml/2006/picture">
                   <wp:extent cx="2926080" cy="1670765"/>
-                  <wp:docPr id="5" name="Picture 5"/>
+                  <wp:docPr id="29" name="Picture 29"/>
                   <wp:cNvGraphicFramePr>
                     <a:graphicFrameLocks noChangeAspect="1"/>
                   </wp:cNvGraphicFramePr>
@@ -12341,11 +11844,11 @@
                     <a:graphicData uri="http://schemas.openxmlformats.org/drawingml/2006/picture">
                       <pic:pic>
                         <pic:nvPicPr>
-                          <pic:cNvPr id="0" name="choropleh.PNG"/>
+                          <pic:cNvPr id="0" name="image.png"/>
                           <pic:cNvPicPr/>
                         </pic:nvPicPr>
                         <pic:blipFill>
-                          <a:blip r:embed="rId15"/>
+                          <a:blip r:embed="rId17"/>
                           <a:stretch>
                             <a:fillRect/>
                           </a:stretch>
@@ -12402,12 +11905,6 @@
               <w:gridCol w:w="4740"/>
             </w:tblGrid>
             <w:tr>
-              <w:tblPrEx>
-                <w:tblCellMar>
-                  <w:top w:w="0" w:type="dxa"/>
-                  <w:bottom w:w="0" w:type="dxa"/>
-                </w:tblCellMar>
-              </w:tblPrEx>
               <w:tc>
                 <w:tcPr>
                   <w:tcW w:w="4740" w:type="dxa"/>
@@ -12437,6 +11934,7 @@
                       <w:sz w:val="20"/>
                       <w:szCs w:val="20"/>
                     </w:rPr>
+                    <w:lastRenderedPageBreak/>
                     <w:t xml:space="preserve">Frame: </w:t>
                   </w:r>
                   <w:r>
@@ -12463,12 +11961,6 @@
               </w:tc>
             </w:tr>
             <w:tr>
-              <w:tblPrEx>
-                <w:tblCellMar>
-                  <w:top w:w="0" w:type="dxa"/>
-                  <w:bottom w:w="0" w:type="dxa"/>
-                </w:tblCellMar>
-              </w:tblPrEx>
               <w:trPr>
                 <w:trHeight w:hRule="exact" w:val="2000"/>
               </w:trPr>
@@ -12502,8 +11994,21 @@
                       <w:sz w:val="20"/>
                       <w:szCs w:val="20"/>
                     </w:rPr>
-                    <w:t>[ Captura 2023 ]</w:t>
+                    <w:lastRenderedPageBreak/>
+                    <w:t xml:space="preserve">[ Captura </w:t>
                   </w:r>
+                  <w:proofErr w:type="gramStart"/>
+                  <w:r>
+                    <w:rPr>
+                      <w:i/>
+                      <w:iCs/>
+                      <w:color w:val="595959"/>
+                      <w:sz w:val="20"/>
+                      <w:szCs w:val="20"/>
+                    </w:rPr>
+                    <w:t>2023 ]</w:t>
+                  </w:r>
+                  <w:proofErr w:type="gramEnd"/>
                 </w:p>
               </w:tc>
             </w:tr>
@@ -12516,7 +12021,7 @@
               <w:drawing>
                 <wp:inline xmlns:a="http://schemas.openxmlformats.org/drawingml/2006/main" xmlns:pic="http://schemas.openxmlformats.org/drawingml/2006/picture">
                   <wp:extent cx="2926080" cy="1239675"/>
-                  <wp:docPr id="6" name="Picture 6"/>
+                  <wp:docPr id="30" name="Picture 30"/>
                   <wp:cNvGraphicFramePr>
                     <a:graphicFrameLocks noChangeAspect="1"/>
                   </wp:cNvGraphicFramePr>
@@ -12524,11 +12029,11 @@
                     <a:graphicData uri="http://schemas.openxmlformats.org/drawingml/2006/picture">
                       <pic:pic>
                         <pic:nvPicPr>
-                          <pic:cNvPr id="0" name="mapachoroleth.PNG"/>
+                          <pic:cNvPr id="0" name="image.png"/>
                           <pic:cNvPicPr/>
                         </pic:nvPicPr>
                         <pic:blipFill>
-                          <a:blip r:embed="rId16"/>
+                          <a:blip r:embed="rId18"/>
                           <a:stretch>
                             <a:fillRect/>
                           </a:stretch>
@@ -12560,10 +12065,7 @@
         <w:pStyle w:val="Ttulo3"/>
       </w:pPr>
       <w:r>
-        <w:t>Análisis</w:t>
-      </w:r>
-      <w:r>
-        <w:t xml:space="preserve"> Geoespacial</w:t>
+        <w:t>Análisis Geoespacial</w:t>
       </w:r>
     </w:p>
     <w:p>
@@ -12575,53 +12077,10 @@
           <w:b/>
           <w:bCs/>
         </w:rPr>
-        <w:t>instrucción</w:t>
-      </w:r>
-      <w:r>
-        <w:rPr>
-          <w:b/>
-          <w:bCs/>
-        </w:rPr>
-        <w:t xml:space="preserve">: </w:t>
-      </w:r>
-      <w:r>
-        <w:t xml:space="preserve">Con base en la </w:t>
-      </w:r>
-      <w:r>
-        <w:t>animación</w:t>
-      </w:r>
-      <w:r>
-        <w:t xml:space="preserve">, responde: (a) ¿Que regiones del mundo aumentaron </w:t>
-      </w:r>
-      <w:r>
-        <w:t>más</w:t>
-      </w:r>
-      <w:r>
-        <w:t xml:space="preserve"> sus emisiones de CO2 entre 2000 y 2023? (b) ¿Que </w:t>
-      </w:r>
-      <w:r>
-        <w:t>países</w:t>
-      </w:r>
-      <w:r>
-        <w:t xml:space="preserve"> mostraron </w:t>
-      </w:r>
-      <w:r>
-        <w:t>reducción</w:t>
-      </w:r>
-      <w:r>
-        <w:t xml:space="preserve">? (c) ¿Que </w:t>
-      </w:r>
-      <w:r>
-        <w:t>implicación</w:t>
-      </w:r>
-      <w:r>
-        <w:t xml:space="preserve"> tiene esto para la estrategia de </w:t>
-      </w:r>
-      <w:r>
-        <w:t>inversión</w:t>
-      </w:r>
-      <w:r>
-        <w:t xml:space="preserve"> de Atlas Global Capital?</w:t>
+        <w:t xml:space="preserve">instrucción: </w:t>
+      </w:r>
+      <w:r>
+        <w:t>Con base en la animación, responde: (a) ¿Que regiones del mundo aumentaron más sus emisiones de CO2 entre 2000 y 2023? (b) ¿Que países mostraron reducción? (c) ¿Que implicación tiene esto para la estrategia de inversión de Atlas Global Capital?</w:t>
       </w:r>
     </w:p>
     <w:p>
@@ -12650,12 +12109,6 @@
         <w:gridCol w:w="9360"/>
       </w:tblGrid>
       <w:tr>
-        <w:tblPrEx>
-          <w:tblCellMar>
-            <w:top w:w="0" w:type="dxa"/>
-            <w:bottom w:w="0" w:type="dxa"/>
-          </w:tblCellMar>
-        </w:tblPrEx>
         <w:tc>
           <w:tcPr>
             <w:tcW w:w="9360" w:type="dxa"/>
@@ -12710,15 +12163,7 @@
         </w:tc>
       </w:tr>
       <w:tr>
-        <w:tblPrEx>
-          <w:tblCellMar>
-            <w:top w:w="0" w:type="dxa"/>
-            <w:bottom w:w="0" w:type="dxa"/>
-          </w:tblCellMar>
-        </w:tblPrEx>
-        <w:trPr>
-          <w:trHeight w:hRule="exact" w:val="400"/>
-        </w:trPr>
+        <w:trPr/>
         <w:tc>
           <w:tcPr>
             <w:tcW w:w="9360" w:type="dxa"/>
@@ -12745,18 +12190,7 @@
                 <w:b/>
                 <w:sz w:val="21"/>
               </w:rPr>
-              <w:t>(a) Regiones con mayor aumento de CO2 (2000-&gt;2023):</w:t>
-            </w:r>
-          </w:p>
-          <w:p>
-            <w:pPr>
-              <w:spacing w:after="80"/>
-            </w:pPr>
-            <w:r>
-              <w:rPr>
-                <w:sz w:val="21"/>
-              </w:rPr>
-              <w:t xml:space="preserve">   Los paises asiaticos en proceso de industrializacion (India, Indonesia, Vietnam) y los exportadores de hidrocarburos del Golfo (Saudi Arabia, Qatar, Kuwait) muestran las trayectorias mas pronunciadas al alza. El patron geografico es claro: el cinturon Asia-Pacifico concentra el crecimiento de emisiones globales.</w:t>
+              <w:t>(a) Mas aumento: Asia-Pacifico (India, Indonesia, Vietnam) y Golfo (Saudi, Qatar).</w:t>
             </w:r>
           </w:p>
           <w:p>
@@ -12768,18 +12202,7 @@
                 <w:b/>
                 <w:sz w:val="21"/>
               </w:rPr>
-              <w:t>(b) Paises con reduccion de emisiones:</w:t>
-            </w:r>
-          </w:p>
-          <w:p>
-            <w:pPr>
-              <w:spacing w:after="80"/>
-            </w:pPr>
-            <w:r>
-              <w:rPr>
-                <w:sz w:val="21"/>
-              </w:rPr>
-              <w:t xml:space="preserve">   Las economias europeas de la primera ola industrial (Germany, France, United Kingdom) y los paises nordicos (Denmark, Sweden, Norway) muestran trayectorias planas o ligeramente decrecientes, reflejando politicas de descarbonizacion agresivas y transicion hacia economias de servicios.</w:t>
+              <w:t>(b) Reduccion: Europa industrial (Alemania, Francia, UK) y nordicos por descarbonizacion.</w:t>
             </w:r>
           </w:p>
           <w:p>
@@ -12791,18 +12214,7 @@
                 <w:b/>
                 <w:sz w:val="21"/>
               </w:rPr>
-              <w:t>(c) Implicacion para la estrategia de inversion de Atlas Global Capital:</w:t>
-            </w:r>
-          </w:p>
-          <w:p>
-            <w:pPr>
-              <w:spacing w:after="80"/>
-            </w:pPr>
-            <w:r>
-              <w:rPr>
-                <w:sz w:val="21"/>
-              </w:rPr>
-              <w:t xml:space="preserve">   La estrategia ESG debe ponderar negativamente la exposicion geografica al cinturon asiatico de alto crecimiento de emisiones, mientras incrementa la asignacion hacia mercados europeos con trayectorias ambientales estables. Los "paises Refugio" candidatos son aquellos que combinan tres atributos simultaneos: CO2 bajo y estable, alto credit score, y alta conectividad comercial -- economias nordicas, Suiza, y mercados del sudeste asiatico con perfil exportador limpio (ej. Singapore).</w:t>
+              <w:t>(c) Implicacion: paises Refugio = nordicos, Suiza y Singapore (CO2 bajo + credit alto + trade alto).</w:t>
             </w:r>
           </w:p>
         </w:tc>
@@ -12856,12 +12268,6 @@
         <w:gridCol w:w="9360"/>
       </w:tblGrid>
       <w:tr>
-        <w:tblPrEx>
-          <w:tblCellMar>
-            <w:top w:w="0" w:type="dxa"/>
-            <w:bottom w:w="0" w:type="dxa"/>
-          </w:tblCellMar>
-        </w:tblPrEx>
         <w:tc>
           <w:tcPr>
             <w:tcW w:w="9360" w:type="dxa"/>
@@ -12902,12 +12308,6 @@
         </w:tc>
       </w:tr>
       <w:tr>
-        <w:tblPrEx>
-          <w:tblCellMar>
-            <w:top w:w="0" w:type="dxa"/>
-            <w:bottom w:w="0" w:type="dxa"/>
-          </w:tblCellMar>
-        </w:tblPrEx>
         <w:tc>
           <w:tcPr>
             <w:tcW w:w="9360" w:type="dxa"/>
@@ -13035,13 +12435,18 @@
       </w:r>
       <w:proofErr w:type="spellStart"/>
       <w:r>
-        <w:t>st.set_page_config</w:t>
+        <w:t>st.set_page_</w:t>
+      </w:r>
+      <w:proofErr w:type="gramStart"/>
+      <w:r>
+        <w:t>config</w:t>
       </w:r>
       <w:proofErr w:type="spellEnd"/>
       <w:r>
         <w:t>(</w:t>
       </w:r>
       <w:proofErr w:type="spellStart"/>
+      <w:proofErr w:type="gramEnd"/>
       <w:r>
         <w:t>layout</w:t>
       </w:r>
@@ -13087,8 +12492,13 @@
         <w:t xml:space="preserve">Carga de datos con </w:t>
       </w:r>
       <w:proofErr w:type="spellStart"/>
-      <w:r>
-        <w:t>st.cache_data</w:t>
+      <w:proofErr w:type="gramStart"/>
+      <w:r>
+        <w:t>st.cache</w:t>
+      </w:r>
+      <w:proofErr w:type="gramEnd"/>
+      <w:r>
+        <w:t>_data</w:t>
       </w:r>
       <w:proofErr w:type="spellEnd"/>
       <w:r>
@@ -13121,8 +12531,13 @@
         <w:t xml:space="preserve"> con filtros interactivos: </w:t>
       </w:r>
       <w:proofErr w:type="spellStart"/>
-      <w:r>
-        <w:t>st.sidebar.slider</w:t>
+      <w:proofErr w:type="gramStart"/>
+      <w:r>
+        <w:t>st.sidebar</w:t>
+      </w:r>
+      <w:proofErr w:type="gramEnd"/>
+      <w:r>
+        <w:t>.slider</w:t>
       </w:r>
       <w:proofErr w:type="spellEnd"/>
       <w:r>
@@ -13161,11 +12576,24 @@
       </w:r>
       <w:proofErr w:type="spellEnd"/>
       <w:r>
-        <w:t xml:space="preserve"> animado (Mission 3) con </w:t>
+        <w:t xml:space="preserve"> animado (</w:t>
       </w:r>
       <w:proofErr w:type="spellStart"/>
       <w:r>
-        <w:t>st.plotly_chart</w:t>
+        <w:t>Mission</w:t>
+      </w:r>
+      <w:proofErr w:type="spellEnd"/>
+      <w:r>
+        <w:t xml:space="preserve"> 3) con </w:t>
+      </w:r>
+      <w:proofErr w:type="spellStart"/>
+      <w:proofErr w:type="gramStart"/>
+      <w:r>
+        <w:t>st.plotly</w:t>
+      </w:r>
+      <w:proofErr w:type="gramEnd"/>
+      <w:r>
+        <w:t>_chart</w:t>
       </w:r>
       <w:proofErr w:type="spellEnd"/>
       <w:r>
@@ -13190,11 +12618,24 @@
       </w:r>
       <w:proofErr w:type="spellEnd"/>
       <w:r>
-        <w:t xml:space="preserve">: integrar la Matriz de Adyacencia (Mission 2) con </w:t>
+        <w:t>: integrar la Matriz de Adyacencia (</w:t>
       </w:r>
       <w:proofErr w:type="spellStart"/>
       <w:r>
-        <w:t>st.plotly_chart</w:t>
+        <w:t>Mission</w:t>
+      </w:r>
+      <w:proofErr w:type="spellEnd"/>
+      <w:r>
+        <w:t xml:space="preserve"> 2) con </w:t>
+      </w:r>
+      <w:proofErr w:type="spellStart"/>
+      <w:proofErr w:type="gramStart"/>
+      <w:r>
+        <w:t>st.plotly</w:t>
+      </w:r>
+      <w:proofErr w:type="gramEnd"/>
+      <w:r>
+        <w:t>_chart</w:t>
       </w:r>
       <w:proofErr w:type="spellEnd"/>
       <w:r>
@@ -13272,12 +12713,6 @@
         <w:gridCol w:w="9360"/>
       </w:tblGrid>
       <w:tr>
-        <w:tblPrEx>
-          <w:tblCellMar>
-            <w:top w:w="0" w:type="dxa"/>
-            <w:bottom w:w="0" w:type="dxa"/>
-          </w:tblCellMar>
-        </w:tblPrEx>
         <w:tc>
           <w:tcPr>
             <w:tcW w:w="9360" w:type="dxa"/>
@@ -17400,12 +16835,6 @@
         <w:gridCol w:w="9360"/>
       </w:tblGrid>
       <w:tr>
-        <w:tblPrEx>
-          <w:tblCellMar>
-            <w:top w:w="0" w:type="dxa"/>
-            <w:bottom w:w="0" w:type="dxa"/>
-          </w:tblCellMar>
-        </w:tblPrEx>
         <w:tc>
           <w:tcPr>
             <w:tcW w:w="9360" w:type="dxa"/>
@@ -17973,7 +17402,6 @@
         <w:pStyle w:val="Ttulo3"/>
       </w:pPr>
       <w:r>
-        <w:lastRenderedPageBreak/>
         <w:t>Objetivo</w:t>
       </w:r>
     </w:p>
@@ -18048,12 +17476,6 @@
         <w:gridCol w:w="9360"/>
       </w:tblGrid>
       <w:tr>
-        <w:tblPrEx>
-          <w:tblCellMar>
-            <w:top w:w="0" w:type="dxa"/>
-            <w:bottom w:w="0" w:type="dxa"/>
-          </w:tblCellMar>
-        </w:tblPrEx>
         <w:tc>
           <w:tcPr>
             <w:tcW w:w="9360" w:type="dxa"/>
@@ -18112,12 +17534,6 @@
         </w:tc>
       </w:tr>
       <w:tr>
-        <w:tblPrEx>
-          <w:tblCellMar>
-            <w:top w:w="0" w:type="dxa"/>
-            <w:bottom w:w="0" w:type="dxa"/>
-          </w:tblCellMar>
-        </w:tblPrEx>
         <w:tc>
           <w:tcPr>
             <w:tcW w:w="9360" w:type="dxa"/>
@@ -18154,12 +17570,6 @@
         </w:tc>
       </w:tr>
       <w:tr>
-        <w:tblPrEx>
-          <w:tblCellMar>
-            <w:top w:w="0" w:type="dxa"/>
-            <w:bottom w:w="0" w:type="dxa"/>
-          </w:tblCellMar>
-        </w:tblPrEx>
         <w:tc>
           <w:tcPr>
             <w:tcW w:w="9360" w:type="dxa"/>
@@ -18188,12 +17598,6 @@
         </w:tc>
       </w:tr>
       <w:tr>
-        <w:tblPrEx>
-          <w:tblCellMar>
-            <w:top w:w="0" w:type="dxa"/>
-            <w:bottom w:w="0" w:type="dxa"/>
-          </w:tblCellMar>
-        </w:tblPrEx>
         <w:tc>
           <w:tcPr>
             <w:tcW w:w="9360" w:type="dxa"/>
@@ -18234,12 +17638,6 @@
         </w:tc>
       </w:tr>
       <w:tr>
-        <w:tblPrEx>
-          <w:tblCellMar>
-            <w:top w:w="0" w:type="dxa"/>
-            <w:bottom w:w="0" w:type="dxa"/>
-          </w:tblCellMar>
-        </w:tblPrEx>
         <w:tc>
           <w:tcPr>
             <w:tcW w:w="9360" w:type="dxa"/>
@@ -18262,6 +17660,7 @@
               <w:spacing w:before="30" w:after="30"/>
             </w:pPr>
             <w:r>
+              <w:lastRenderedPageBreak/>
               <w:t xml:space="preserve">  3. </w:t>
             </w:r>
             <w:r>
@@ -18292,12 +17691,6 @@
         </w:tc>
       </w:tr>
       <w:tr>
-        <w:tblPrEx>
-          <w:tblCellMar>
-            <w:top w:w="0" w:type="dxa"/>
-            <w:bottom w:w="0" w:type="dxa"/>
-          </w:tblCellMar>
-        </w:tblPrEx>
         <w:tc>
           <w:tcPr>
             <w:tcW w:w="9360" w:type="dxa"/>
@@ -18380,12 +17773,6 @@
         <w:gridCol w:w="9360"/>
       </w:tblGrid>
       <w:tr>
-        <w:tblPrEx>
-          <w:tblCellMar>
-            <w:top w:w="0" w:type="dxa"/>
-            <w:bottom w:w="0" w:type="dxa"/>
-          </w:tblCellMar>
-        </w:tblPrEx>
         <w:tc>
           <w:tcPr>
             <w:tcW w:w="9360" w:type="dxa"/>
@@ -19268,7 +18655,6 @@
         <w:pStyle w:val="Ttulo3"/>
       </w:pPr>
       <w:r>
-        <w:lastRenderedPageBreak/>
         <w:t xml:space="preserve">Tu </w:t>
       </w:r>
       <w:proofErr w:type="spellStart"/>
@@ -19289,23 +18675,10 @@
           <w:b/>
           <w:bCs/>
         </w:rPr>
-        <w:t>instrucción</w:t>
-      </w:r>
-      <w:r>
-        <w:rPr>
-          <w:b/>
-          <w:bCs/>
-        </w:rPr>
-        <w:t xml:space="preserve">: </w:t>
-      </w:r>
-      <w:r>
-        <w:t xml:space="preserve">Escribe a </w:t>
-      </w:r>
-      <w:r>
-        <w:t>continuación</w:t>
-      </w:r>
-      <w:r>
-        <w:t xml:space="preserve"> el </w:t>
+        <w:t xml:space="preserve">instrucción: </w:t>
+      </w:r>
+      <w:r>
+        <w:t xml:space="preserve">Escribe a continuación el </w:t>
       </w:r>
       <w:proofErr w:type="spellStart"/>
       <w:r>
@@ -19313,13 +18686,7 @@
       </w:r>
       <w:proofErr w:type="spellEnd"/>
       <w:r>
-        <w:t xml:space="preserve"> completo que usas para generar el resumen ejecutivo. </w:t>
-      </w:r>
-      <w:r>
-        <w:t>Asegúrate</w:t>
-      </w:r>
-      <w:r>
-        <w:t xml:space="preserve"> de que incluya las 4 secciones de la estructura obligatoria indicada arriba.</w:t>
+        <w:t xml:space="preserve"> completo que usas para generar el resumen ejecutivo. Asegúrate de que incluya las 4 secciones de la estructura obligatoria indicada arriba.</w:t>
       </w:r>
     </w:p>
     <w:p>
@@ -19348,12 +18715,6 @@
         <w:gridCol w:w="9360"/>
       </w:tblGrid>
       <w:tr>
-        <w:tblPrEx>
-          <w:tblCellMar>
-            <w:top w:w="0" w:type="dxa"/>
-            <w:bottom w:w="0" w:type="dxa"/>
-          </w:tblCellMar>
-        </w:tblPrEx>
         <w:tc>
           <w:tcPr>
             <w:tcW w:w="9360" w:type="dxa"/>
@@ -19452,15 +18813,7 @@
         </w:tc>
       </w:tr>
       <w:tr>
-        <w:tblPrEx>
-          <w:tblCellMar>
-            <w:top w:w="0" w:type="dxa"/>
-            <w:bottom w:w="0" w:type="dxa"/>
-          </w:tblCellMar>
-        </w:tblPrEx>
-        <w:trPr>
-          <w:trHeight w:hRule="exact" w:val="400"/>
-        </w:trPr>
+        <w:trPr/>
         <w:tc>
           <w:tcPr>
             <w:tcW w:w="9360" w:type="dxa"/>
@@ -19792,12 +19145,6 @@
         <w:gridCol w:w="9360"/>
       </w:tblGrid>
       <w:tr>
-        <w:tblPrEx>
-          <w:tblCellMar>
-            <w:top w:w="0" w:type="dxa"/>
-            <w:bottom w:w="0" w:type="dxa"/>
-          </w:tblCellMar>
-        </w:tblPrEx>
         <w:trPr>
           <w:trHeight w:hRule="exact" w:val="3200"/>
         </w:trPr>
@@ -19827,7 +19174,7 @@
               <w:drawing>
                 <wp:inline xmlns:a="http://schemas.openxmlformats.org/drawingml/2006/main" xmlns:pic="http://schemas.openxmlformats.org/drawingml/2006/picture">
                   <wp:extent cx="5486400" cy="2718224"/>
-                  <wp:docPr id="7" name="Picture 7"/>
+                  <wp:docPr id="31" name="Picture 31"/>
                   <wp:cNvGraphicFramePr>
                     <a:graphicFrameLocks noChangeAspect="1"/>
                   </wp:cNvGraphicFramePr>
@@ -19835,11 +19182,11 @@
                     <a:graphicData uri="http://schemas.openxmlformats.org/drawingml/2006/picture">
                       <pic:pic>
                         <pic:nvPicPr>
-                          <pic:cNvPr id="0" name="dashboard.PNG"/>
+                          <pic:cNvPr id="0" name="image.png"/>
                           <pic:cNvPicPr/>
                         </pic:nvPicPr>
                         <pic:blipFill>
-                          <a:blip r:embed="rId17"/>
+                          <a:blip r:embed="rId11"/>
                           <a:stretch>
                             <a:fillRect/>
                           </a:stretch>
@@ -19866,7 +19213,7 @@
               <w:drawing>
                 <wp:inline xmlns:a="http://schemas.openxmlformats.org/drawingml/2006/main" xmlns:pic="http://schemas.openxmlformats.org/drawingml/2006/picture">
                   <wp:extent cx="5486400" cy="3015049"/>
-                  <wp:docPr id="8" name="Picture 8"/>
+                  <wp:docPr id="32" name="Picture 32"/>
                   <wp:cNvGraphicFramePr>
                     <a:graphicFrameLocks noChangeAspect="1"/>
                   </wp:cNvGraphicFramePr>
@@ -19874,11 +19221,11 @@
                     <a:graphicData uri="http://schemas.openxmlformats.org/drawingml/2006/picture">
                       <pic:pic>
                         <pic:nvPicPr>
-                          <pic:cNvPr id="0" name="resumenia.PNG"/>
+                          <pic:cNvPr id="0" name="image.png"/>
                           <pic:cNvPicPr/>
                         </pic:nvPicPr>
                         <pic:blipFill>
-                          <a:blip r:embed="rId18"/>
+                          <a:blip r:embed="rId12"/>
                           <a:stretch>
                             <a:fillRect/>
                           </a:stretch>
@@ -19971,12 +19318,6 @@
         <w:gridCol w:w="667"/>
       </w:tblGrid>
       <w:tr>
-        <w:tblPrEx>
-          <w:tblCellMar>
-            <w:top w:w="0" w:type="dxa"/>
-            <w:bottom w:w="0" w:type="dxa"/>
-          </w:tblCellMar>
-        </w:tblPrEx>
         <w:tc>
           <w:tcPr>
             <w:tcW w:w="360" w:type="dxa"/>
@@ -20075,12 +19416,6 @@
         </w:tc>
       </w:tr>
       <w:tr>
-        <w:tblPrEx>
-          <w:tblCellMar>
-            <w:top w:w="0" w:type="dxa"/>
-            <w:bottom w:w="0" w:type="dxa"/>
-          </w:tblCellMar>
-        </w:tblPrEx>
         <w:tc>
           <w:tcPr>
             <w:tcW w:w="360" w:type="dxa"/>
@@ -20131,13 +19466,18 @@
           </w:tcPr>
           <w:p>
             <w:r>
-              <w:t>Repositorio GitHub con: app.py, notebook .</w:t>
+              <w:t xml:space="preserve">Repositorio GitHub con: app.py, </w:t>
+            </w:r>
+            <w:proofErr w:type="gramStart"/>
+            <w:r>
+              <w:t>notebook .</w:t>
             </w:r>
             <w:proofErr w:type="spellStart"/>
             <w:r>
               <w:t>ipynb</w:t>
             </w:r>
             <w:proofErr w:type="spellEnd"/>
+            <w:proofErr w:type="gramEnd"/>
             <w:r>
               <w:t xml:space="preserve"> y requirements.txt</w:t>
             </w:r>
@@ -20179,12 +19519,6 @@
         </w:tc>
       </w:tr>
       <w:tr>
-        <w:tblPrEx>
-          <w:tblCellMar>
-            <w:top w:w="0" w:type="dxa"/>
-            <w:bottom w:w="0" w:type="dxa"/>
-          </w:tblCellMar>
-        </w:tblPrEx>
         <w:tc>
           <w:tcPr>
             <w:tcW w:w="360" w:type="dxa"/>
@@ -20315,12 +19649,6 @@
         </w:tc>
       </w:tr>
       <w:tr>
-        <w:tblPrEx>
-          <w:tblCellMar>
-            <w:top w:w="0" w:type="dxa"/>
-            <w:bottom w:w="0" w:type="dxa"/>
-          </w:tblCellMar>
-        </w:tblPrEx>
         <w:tc>
           <w:tcPr>
             <w:tcW w:w="360" w:type="dxa"/>
@@ -20435,12 +19763,6 @@
         </w:tc>
       </w:tr>
       <w:tr>
-        <w:tblPrEx>
-          <w:tblCellMar>
-            <w:top w:w="0" w:type="dxa"/>
-            <w:bottom w:w="0" w:type="dxa"/>
-          </w:tblCellMar>
-        </w:tblPrEx>
         <w:tc>
           <w:tcPr>
             <w:tcW w:w="360" w:type="dxa"/>
@@ -20544,12 +19866,6 @@
         </w:tc>
       </w:tr>
       <w:tr>
-        <w:tblPrEx>
-          <w:tblCellMar>
-            <w:top w:w="0" w:type="dxa"/>
-            <w:bottom w:w="0" w:type="dxa"/>
-          </w:tblCellMar>
-        </w:tblPrEx>
         <w:tc>
           <w:tcPr>
             <w:tcW w:w="360" w:type="dxa"/>
@@ -20648,12 +19964,6 @@
         </w:tc>
       </w:tr>
       <w:tr>
-        <w:tblPrEx>
-          <w:tblCellMar>
-            <w:top w:w="0" w:type="dxa"/>
-            <w:bottom w:w="0" w:type="dxa"/>
-          </w:tblCellMar>
-        </w:tblPrEx>
         <w:tc>
           <w:tcPr>
             <w:tcW w:w="360" w:type="dxa"/>
@@ -20800,12 +20110,6 @@
         <w:gridCol w:w="660"/>
       </w:tblGrid>
       <w:tr>
-        <w:tblPrEx>
-          <w:tblCellMar>
-            <w:top w:w="0" w:type="dxa"/>
-            <w:bottom w:w="0" w:type="dxa"/>
-          </w:tblCellMar>
-        </w:tblPrEx>
         <w:tc>
           <w:tcPr>
             <w:tcW w:w="2000" w:type="dxa"/>
@@ -20958,12 +20262,6 @@
         </w:tc>
       </w:tr>
       <w:tr>
-        <w:tblPrEx>
-          <w:tblCellMar>
-            <w:top w:w="0" w:type="dxa"/>
-            <w:bottom w:w="0" w:type="dxa"/>
-          </w:tblCellMar>
-        </w:tblPrEx>
         <w:tc>
           <w:tcPr>
             <w:tcW w:w="2000" w:type="dxa"/>
@@ -21121,28 +20419,7 @@
                 <w:sz w:val="18"/>
                 <w:szCs w:val="18"/>
               </w:rPr>
-              <w:t>Gráficos</w:t>
-            </w:r>
-            <w:r>
-              <w:rPr>
-                <w:sz w:val="18"/>
-                <w:szCs w:val="18"/>
-              </w:rPr>
-              <w:t xml:space="preserve"> </w:t>
-            </w:r>
-            <w:r>
-              <w:rPr>
-                <w:sz w:val="18"/>
-                <w:szCs w:val="18"/>
-              </w:rPr>
-              <w:t>generados,</w:t>
-            </w:r>
-            <w:r>
-              <w:rPr>
-                <w:sz w:val="18"/>
-                <w:szCs w:val="18"/>
-              </w:rPr>
-              <w:t xml:space="preserve"> pero Z-score omitido en </w:t>
+              <w:t xml:space="preserve">Gráficos generados, pero Z-score omitido en </w:t>
             </w:r>
             <w:proofErr w:type="spellStart"/>
             <w:r>
@@ -21185,44 +20462,23 @@
                 <w:sz w:val="18"/>
                 <w:szCs w:val="18"/>
               </w:rPr>
-              <w:t>Gráficos</w:t>
-            </w:r>
+              <w:t xml:space="preserve">Gráficos con errores, </w:t>
+            </w:r>
+            <w:proofErr w:type="spellStart"/>
             <w:r>
               <w:rPr>
                 <w:sz w:val="18"/>
                 <w:szCs w:val="18"/>
               </w:rPr>
-              <w:t xml:space="preserve"> con errores, </w:t>
-            </w:r>
-            <w:proofErr w:type="spellStart"/>
+              <w:t>overplotting</w:t>
+            </w:r>
+            <w:proofErr w:type="spellEnd"/>
             <w:r>
               <w:rPr>
                 <w:sz w:val="18"/>
                 <w:szCs w:val="18"/>
               </w:rPr>
-              <w:t>overplotting</w:t>
-            </w:r>
-            <w:proofErr w:type="spellEnd"/>
-            <w:r>
-              <w:rPr>
-                <w:sz w:val="18"/>
-                <w:szCs w:val="18"/>
-              </w:rPr>
-              <w:t xml:space="preserve"> severo o ausencia de conclusiones </w:t>
-            </w:r>
-            <w:r>
-              <w:rPr>
-                <w:sz w:val="18"/>
-                <w:szCs w:val="18"/>
-              </w:rPr>
-              <w:t>analíticas</w:t>
-            </w:r>
-            <w:r>
-              <w:rPr>
-                <w:sz w:val="18"/>
-                <w:szCs w:val="18"/>
-              </w:rPr>
-              <w:t>.</w:t>
+              <w:t xml:space="preserve"> severo o ausencia de conclusiones analíticas.</w:t>
             </w:r>
           </w:p>
         </w:tc>
@@ -21255,12 +20511,6 @@
         </w:tc>
       </w:tr>
       <w:tr>
-        <w:tblPrEx>
-          <w:tblCellMar>
-            <w:top w:w="0" w:type="dxa"/>
-            <w:bottom w:w="0" w:type="dxa"/>
-          </w:tblCellMar>
-        </w:tblPrEx>
         <w:tc>
           <w:tcPr>
             <w:tcW w:w="2000" w:type="dxa"/>
@@ -21284,7 +20534,23 @@
                 <w:sz w:val="18"/>
                 <w:szCs w:val="18"/>
               </w:rPr>
-              <w:t xml:space="preserve">2. Matrices (Seaborn vs </w:t>
+              <w:t>2. Matrices (</w:t>
+            </w:r>
+            <w:proofErr w:type="spellStart"/>
+            <w:r>
+              <w:rPr>
+                <w:sz w:val="18"/>
+                <w:szCs w:val="18"/>
+              </w:rPr>
+              <w:t>Seaborn</w:t>
+            </w:r>
+            <w:proofErr w:type="spellEnd"/>
+            <w:r>
+              <w:rPr>
+                <w:sz w:val="18"/>
+                <w:szCs w:val="18"/>
+              </w:rPr>
+              <w:t xml:space="preserve"> vs </w:t>
             </w:r>
             <w:proofErr w:type="spellStart"/>
             <w:r>
@@ -21336,7 +20602,23 @@
                 <w:sz w:val="18"/>
                 <w:szCs w:val="18"/>
               </w:rPr>
-              <w:t xml:space="preserve"> limpio en Seaborn. Matriz de adyacencia </w:t>
+              <w:t xml:space="preserve"> limpio en </w:t>
+            </w:r>
+            <w:proofErr w:type="spellStart"/>
+            <w:r>
+              <w:rPr>
+                <w:sz w:val="18"/>
+                <w:szCs w:val="18"/>
+              </w:rPr>
+              <w:t>Seaborn</w:t>
+            </w:r>
+            <w:proofErr w:type="spellEnd"/>
+            <w:r>
+              <w:rPr>
+                <w:sz w:val="18"/>
+                <w:szCs w:val="18"/>
+              </w:rPr>
+              <w:t xml:space="preserve">. Matriz de adyacencia </w:t>
             </w:r>
             <w:proofErr w:type="spellStart"/>
             <w:r>
@@ -21533,12 +20815,6 @@
         </w:tc>
       </w:tr>
       <w:tr>
-        <w:tblPrEx>
-          <w:tblCellMar>
-            <w:top w:w="0" w:type="dxa"/>
-            <w:bottom w:w="0" w:type="dxa"/>
-          </w:tblCellMar>
-        </w:tblPrEx>
         <w:tc>
           <w:tcPr>
             <w:tcW w:w="2000" w:type="dxa"/>
@@ -21757,12 +21033,6 @@
         </w:tc>
       </w:tr>
       <w:tr>
-        <w:tblPrEx>
-          <w:tblCellMar>
-            <w:top w:w="0" w:type="dxa"/>
-            <w:bottom w:w="0" w:type="dxa"/>
-          </w:tblCellMar>
-        </w:tblPrEx>
         <w:tc>
           <w:tcPr>
             <w:tcW w:w="2000" w:type="dxa"/>
@@ -21802,7 +21072,23 @@
                 <w:sz w:val="18"/>
                 <w:szCs w:val="18"/>
               </w:rPr>
-              <w:t xml:space="preserve"> Streamlit 25 pts.</w:t>
+              <w:t xml:space="preserve"> </w:t>
+            </w:r>
+            <w:proofErr w:type="spellStart"/>
+            <w:r>
+              <w:rPr>
+                <w:sz w:val="18"/>
+                <w:szCs w:val="18"/>
+              </w:rPr>
+              <w:t>Streamlit</w:t>
+            </w:r>
+            <w:proofErr w:type="spellEnd"/>
+            <w:r>
+              <w:rPr>
+                <w:sz w:val="18"/>
+                <w:szCs w:val="18"/>
+              </w:rPr>
+              <w:t xml:space="preserve"> 25 pts.</w:t>
             </w:r>
           </w:p>
         </w:tc>
@@ -21852,7 +21138,6 @@
                 <w:sz w:val="18"/>
                 <w:szCs w:val="18"/>
               </w:rPr>
-              <w:lastRenderedPageBreak/>
               <w:t>gráficos</w:t>
             </w:r>
             <w:r>
@@ -21918,7 +21203,6 @@
                 <w:sz w:val="18"/>
                 <w:szCs w:val="18"/>
               </w:rPr>
-              <w:lastRenderedPageBreak/>
               <w:t>Dashboard</w:t>
             </w:r>
             <w:proofErr w:type="spellEnd"/>
@@ -21929,6 +21213,7 @@
               </w:rPr>
               <w:t xml:space="preserve"> despliega </w:t>
             </w:r>
+            <w:proofErr w:type="gramStart"/>
             <w:r>
               <w:rPr>
                 <w:sz w:val="18"/>
@@ -21936,20 +21221,13 @@
               </w:rPr>
               <w:t>gráficos</w:t>
             </w:r>
+            <w:proofErr w:type="gramEnd"/>
             <w:r>
               <w:rPr>
                 <w:sz w:val="18"/>
                 <w:szCs w:val="18"/>
               </w:rPr>
-              <w:t xml:space="preserve"> pero filtros no actualizan todos los </w:t>
-            </w:r>
-            <w:r>
-              <w:rPr>
-                <w:sz w:val="18"/>
-                <w:szCs w:val="18"/>
-              </w:rPr>
-              <w:lastRenderedPageBreak/>
-              <w:t>componentes. IA ausente o superficial.</w:t>
+              <w:t xml:space="preserve"> pero filtros no actualizan todos los componentes. IA ausente o superficial.</w:t>
             </w:r>
           </w:p>
         </w:tc>
@@ -21977,7 +21255,6 @@
                 <w:sz w:val="18"/>
                 <w:szCs w:val="18"/>
               </w:rPr>
-              <w:lastRenderedPageBreak/>
               <w:t>Dashboard</w:t>
             </w:r>
             <w:proofErr w:type="spellEnd"/>
@@ -21986,15 +21263,7 @@
                 <w:sz w:val="18"/>
                 <w:szCs w:val="18"/>
               </w:rPr>
-              <w:t xml:space="preserve"> inoperable, no compila, o solo </w:t>
-            </w:r>
-            <w:r>
-              <w:rPr>
-                <w:sz w:val="18"/>
-                <w:szCs w:val="18"/>
-              </w:rPr>
-              <w:lastRenderedPageBreak/>
-              <w:t>entrega notebook sin desarrollo web.</w:t>
+              <w:t xml:space="preserve"> inoperable, no compila, o solo entrega notebook sin desarrollo web.</w:t>
             </w:r>
           </w:p>
         </w:tc>
@@ -22021,19 +21290,12 @@
                 <w:sz w:val="18"/>
                 <w:szCs w:val="18"/>
               </w:rPr>
-              <w:lastRenderedPageBreak/>
               <w:t>25</w:t>
             </w:r>
           </w:p>
         </w:tc>
       </w:tr>
       <w:tr>
-        <w:tblPrEx>
-          <w:tblCellMar>
-            <w:top w:w="0" w:type="dxa"/>
-            <w:bottom w:w="0" w:type="dxa"/>
-          </w:tblCellMar>
-        </w:tblPrEx>
         <w:tc>
           <w:tcPr>
             <w:tcW w:w="2000" w:type="dxa"/>
@@ -22057,6 +21319,7 @@
                 <w:sz w:val="18"/>
                 <w:szCs w:val="18"/>
               </w:rPr>
+              <w:lastRenderedPageBreak/>
               <w:t xml:space="preserve">5. Data </w:t>
             </w:r>
             <w:proofErr w:type="spellStart"/>
@@ -22116,7 +21379,23 @@
                 <w:sz w:val="18"/>
                 <w:szCs w:val="18"/>
               </w:rPr>
-              <w:t xml:space="preserve"> PEP-8, alto Data-Ink Ratio, paletas accesibles.</w:t>
+              <w:t xml:space="preserve"> PEP-8, alto Data-</w:t>
+            </w:r>
+            <w:proofErr w:type="spellStart"/>
+            <w:r>
+              <w:rPr>
+                <w:sz w:val="18"/>
+                <w:szCs w:val="18"/>
+              </w:rPr>
+              <w:t>Ink</w:t>
+            </w:r>
+            <w:proofErr w:type="spellEnd"/>
+            <w:r>
+              <w:rPr>
+                <w:sz w:val="18"/>
+                <w:szCs w:val="18"/>
+              </w:rPr>
+              <w:t xml:space="preserve"> Ratio, paletas accesibles.</w:t>
             </w:r>
           </w:p>
         </w:tc>
@@ -22401,7 +21680,15 @@
         <w:jc w:val="both"/>
       </w:pPr>
       <w:r>
-        <w:t xml:space="preserve">Manejo de NaN: todos los </w:t>
+        <w:t xml:space="preserve">Manejo de </w:t>
+      </w:r>
+      <w:proofErr w:type="spellStart"/>
+      <w:r>
+        <w:t>NaN</w:t>
+      </w:r>
+      <w:proofErr w:type="spellEnd"/>
+      <w:r>
+        <w:t xml:space="preserve">: todos los </w:t>
       </w:r>
       <w:proofErr w:type="spellStart"/>
       <w:r>
@@ -22479,12 +21766,6 @@
         <w:gridCol w:w="6560"/>
       </w:tblGrid>
       <w:tr>
-        <w:tblPrEx>
-          <w:tblCellMar>
-            <w:top w:w="0" w:type="dxa"/>
-            <w:bottom w:w="0" w:type="dxa"/>
-          </w:tblCellMar>
-        </w:tblPrEx>
         <w:tc>
           <w:tcPr>
             <w:tcW w:w="2800" w:type="dxa"/>
@@ -22546,12 +21827,6 @@
         </w:tc>
       </w:tr>
       <w:tr>
-        <w:tblPrEx>
-          <w:tblCellMar>
-            <w:top w:w="0" w:type="dxa"/>
-            <w:bottom w:w="0" w:type="dxa"/>
-          </w:tblCellMar>
-        </w:tblPrEx>
         <w:tc>
           <w:tcPr>
             <w:tcW w:w="2800" w:type="dxa"/>
@@ -22635,12 +21910,6 @@
         </w:tc>
       </w:tr>
       <w:tr>
-        <w:tblPrEx>
-          <w:tblCellMar>
-            <w:top w:w="0" w:type="dxa"/>
-            <w:bottom w:w="0" w:type="dxa"/>
-          </w:tblCellMar>
-        </w:tblPrEx>
         <w:tc>
           <w:tcPr>
             <w:tcW w:w="2800" w:type="dxa"/>
@@ -22854,7 +22123,15 @@
       </w:r>
       <w:proofErr w:type="spellEnd"/>
       <w:r>
-        <w:t xml:space="preserve"> usamos Seaborn para las </w:t>
+        <w:t xml:space="preserve"> usamos </w:t>
+      </w:r>
+      <w:proofErr w:type="spellStart"/>
+      <w:r>
+        <w:t>Seaborn</w:t>
+      </w:r>
+      <w:proofErr w:type="spellEnd"/>
+      <w:r>
+        <w:t xml:space="preserve"> para las </w:t>
       </w:r>
       <w:proofErr w:type="spellStart"/>
       <w:r>
@@ -22931,12 +22208,6 @@
         <w:gridCol w:w="9360"/>
       </w:tblGrid>
       <w:tr>
-        <w:tblPrEx>
-          <w:tblCellMar>
-            <w:top w:w="0" w:type="dxa"/>
-            <w:bottom w:w="0" w:type="dxa"/>
-          </w:tblCellMar>
-        </w:tblPrEx>
         <w:tc>
           <w:tcPr>
             <w:tcW w:w="9360" w:type="dxa"/>
@@ -22969,15 +22240,7 @@
         </w:tc>
       </w:tr>
       <w:tr>
-        <w:tblPrEx>
-          <w:tblCellMar>
-            <w:top w:w="0" w:type="dxa"/>
-            <w:bottom w:w="0" w:type="dxa"/>
-          </w:tblCellMar>
-        </w:tblPrEx>
-        <w:trPr>
-          <w:trHeight w:hRule="exact" w:val="400"/>
-        </w:trPr>
+        <w:trPr/>
         <w:tc>
           <w:tcPr>
             <w:tcW w:w="9360" w:type="dxa"/>
@@ -23003,76 +22266,7 @@
               <w:rPr>
                 <w:sz w:val="21"/>
               </w:rPr>
-              <w:t>Seaborn y Plotly responden a casos de uso diferentes; un Data Scientist Senior elige segun el canal de entrega, no segun moda. Tres criterios de decision diferenciados:</w:t>
-            </w:r>
-          </w:p>
-          <w:p>
-            <w:pPr>
-              <w:spacing w:after="80"/>
-            </w:pPr>
-            <w:r>
-              <w:rPr>
-                <w:b/>
-                <w:sz w:val="21"/>
-              </w:rPr>
-              <w:t>1) Medio de consumo:</w:t>
-            </w:r>
-          </w:p>
-          <w:p>
-            <w:pPr>
-              <w:spacing w:after="80"/>
-            </w:pPr>
-            <w:r>
-              <w:rPr>
-                <w:sz w:val="21"/>
-              </w:rPr>
-              <w:t xml:space="preserve">   Seaborn es la herramienta correcta para el informe tecnico en PDF porque la junta directiva necesita un documento que se imprima, se firme y se archive. Plotly es la herramienta correcta para el dashboard porque los directores quieren filtrar por pais, ano, y hacer hover sobre una celda de la matriz para investigar relaciones bilaterales.</w:t>
-            </w:r>
-          </w:p>
-          <w:p>
-            <w:pPr>
-              <w:spacing w:after="80"/>
-            </w:pPr>
-            <w:r>
-              <w:rPr>
-                <w:b/>
-                <w:sz w:val="21"/>
-              </w:rPr>
-              <w:t>2) Interactividad necesaria:</w:t>
-            </w:r>
-          </w:p>
-          <w:p>
-            <w:pPr>
-              <w:spacing w:after="80"/>
-            </w:pPr>
-            <w:r>
-              <w:rPr>
-                <w:sz w:val="21"/>
-              </w:rPr>
-              <w:t xml:space="preserve">   En el PDF la interactividad seria desperdiciada (no hay con que interactuar en papel). En el dashboard la interactividad es el valor agregado: tooltips, zoom, sliders y filtros reactivos.</w:t>
-            </w:r>
-          </w:p>
-          <w:p>
-            <w:pPr>
-              <w:spacing w:after="80"/>
-            </w:pPr>
-            <w:r>
-              <w:rPr>
-                <w:b/>
-                <w:sz w:val="21"/>
-              </w:rPr>
-              <w:t>3) Resolucion y peso del archivo:</w:t>
-            </w:r>
-          </w:p>
-          <w:p>
-            <w:pPr>
-              <w:spacing w:after="80"/>
-            </w:pPr>
-            <w:r>
-              <w:rPr>
-                <w:sz w:val="21"/>
-              </w:rPr>
-              <w:t xml:space="preserve">   Seaborn produce PNG 300 dpi de pocos KB, perfecto para imprimir; Plotly produce HTML de varios MB que requiere navegador. Para email a inversionistas, Seaborn; para portal web interno, Plotly.</w:t>
+              <w:t>Seaborn para PDF (estatico, imprimible, ligero); Plotly para dashboard (interactivo con tooltips y filtros). La eleccion depende del canal: papel = Seaborn, navegador = Plotly.</w:t>
             </w:r>
           </w:p>
         </w:tc>
@@ -23104,8 +22298,13 @@
         <w:t xml:space="preserve">Un nuevo miembro del equipo propone usar </w:t>
       </w:r>
       <w:proofErr w:type="spellStart"/>
-      <w:r>
-        <w:t>matplotlib.pyplot.show</w:t>
+      <w:proofErr w:type="gramStart"/>
+      <w:r>
+        <w:t>matplotlib.pyplot</w:t>
+      </w:r>
+      <w:proofErr w:type="gramEnd"/>
+      <w:r>
+        <w:t>.show</w:t>
       </w:r>
       <w:proofErr w:type="spellEnd"/>
       <w:r>
@@ -23154,12 +22353,6 @@
         <w:gridCol w:w="9360"/>
       </w:tblGrid>
       <w:tr>
-        <w:tblPrEx>
-          <w:tblCellMar>
-            <w:top w:w="0" w:type="dxa"/>
-            <w:bottom w:w="0" w:type="dxa"/>
-          </w:tblCellMar>
-        </w:tblPrEx>
         <w:tc>
           <w:tcPr>
             <w:tcW w:w="9360" w:type="dxa"/>
@@ -23192,15 +22385,7 @@
         </w:tc>
       </w:tr>
       <w:tr>
-        <w:tblPrEx>
-          <w:tblCellMar>
-            <w:top w:w="0" w:type="dxa"/>
-            <w:bottom w:w="0" w:type="dxa"/>
-          </w:tblCellMar>
-        </w:tblPrEx>
-        <w:trPr>
-          <w:trHeight w:hRule="exact" w:val="400"/>
-        </w:trPr>
+        <w:trPr/>
         <w:tc>
           <w:tcPr>
             <w:tcW w:w="9360" w:type="dxa"/>
@@ -23224,10 +22409,9 @@
             </w:pPr>
             <w:r>
               <w:rPr>
-                <w:b/>
                 <w:sz w:val="21"/>
               </w:rPr>
-              <w:t>Problema:</w:t>
+              <w:t>plt.show() abre una ventana GUI bloqueante que no existe en Streamlit (corre en servidor web), por lo que la figura no aparece y se cuelga.</w:t>
             </w:r>
           </w:p>
           <w:p>
@@ -23238,30 +22422,7 @@
               <w:rPr>
                 <w:sz w:val="21"/>
               </w:rPr>
-              <w:t xml:space="preserve">   matplotlib.pyplot.show() esta disenado para abrir una ventana GUI bloqueante (Tk, Qt) en un entorno de escritorio. En Streamlit no existe ventana GUI -- el codigo se ejecuta en un servidor web y cada rerun del script reejecuta todo el archivo. Como consecuencia, la figura nunca aparece en el navegador, el proceso se cuelga, o se acumulan figuras en memoria provocando un memory leak tras multiples interacciones del usuario.</w:t>
-            </w:r>
-          </w:p>
-          <w:p>
-            <w:pPr>
-              <w:spacing w:after="80"/>
-            </w:pPr>
-            <w:r>
-              <w:rPr>
-                <w:b/>
-                <w:sz w:val="21"/>
-              </w:rPr>
-              <w:t>Resolucion correcta:</w:t>
-            </w:r>
-          </w:p>
-          <w:p>
-            <w:pPr>
-              <w:spacing w:after="80"/>
-            </w:pPr>
-            <w:r>
-              <w:rPr>
-                <w:sz w:val="21"/>
-              </w:rPr>
-              <w:t xml:space="preserve">   Crear la figura con fig, ax = plt.subplots() y pasarla a st.pyplot(fig). Streamlit serializa la figura a PNG internamente y la envia al navegador. Despues, opcionalmente plt.close(fig) para liberar memoria. Si el grafico es interactivo (como en este examen), usar st.plotly_chart(fig) directamente con Plotly -- aprovecha la interactividad nativa sin pasar por matplotlib.</w:t>
+              <w:t>Correcto: crear fig, ax = plt.subplots() y pasarla a st.pyplot(fig). Para graficos interactivos usar st.plotly_chart(fig).</w:t>
             </w:r>
           </w:p>
         </w:tc>
@@ -23298,7 +22459,15 @@
       </w:r>
       <w:proofErr w:type="spellEnd"/>
       <w:r>
-        <w:t xml:space="preserve"> es el 'Data-Ink Ratio' </w:t>
+        <w:t xml:space="preserve"> es el 'Data-</w:t>
+      </w:r>
+      <w:proofErr w:type="spellStart"/>
+      <w:r>
+        <w:t>Ink</w:t>
+      </w:r>
+      <w:proofErr w:type="spellEnd"/>
+      <w:r>
+        <w:t xml:space="preserve"> Ratio' </w:t>
       </w:r>
       <w:proofErr w:type="spellStart"/>
       <w:r>
@@ -23335,12 +22504,6 @@
         <w:gridCol w:w="9360"/>
       </w:tblGrid>
       <w:tr>
-        <w:tblPrEx>
-          <w:tblCellMar>
-            <w:top w:w="0" w:type="dxa"/>
-            <w:bottom w:w="0" w:type="dxa"/>
-          </w:tblCellMar>
-        </w:tblPrEx>
         <w:tc>
           <w:tcPr>
             <w:tcW w:w="9360" w:type="dxa"/>
@@ -23373,15 +22536,7 @@
         </w:tc>
       </w:tr>
       <w:tr>
-        <w:tblPrEx>
-          <w:tblCellMar>
-            <w:top w:w="0" w:type="dxa"/>
-            <w:bottom w:w="0" w:type="dxa"/>
-          </w:tblCellMar>
-        </w:tblPrEx>
-        <w:trPr>
-          <w:trHeight w:hRule="exact" w:val="400"/>
-        </w:trPr>
+        <w:trPr/>
         <w:tc>
           <w:tcPr>
             <w:tcW w:w="9360" w:type="dxa"/>
@@ -23405,10 +22560,9 @@
             </w:pPr>
             <w:r>
               <w:rPr>
-                <w:b/>
                 <w:sz w:val="21"/>
               </w:rPr>
-              <w:t>Definicion:</w:t>
+              <w:t>Data-Ink Ratio (Tufte): proporcion de tinta que codifica datos vs. tinta total. Hay que maximizar el data-ink y eliminar el chartjunk.</w:t>
             </w:r>
           </w:p>
           <w:p>
@@ -23419,65 +22573,7 @@
               <w:rPr>
                 <w:sz w:val="21"/>
               </w:rPr>
-              <w:t xml:space="preserve">   Edward Tufte (The Visual Display of Quantitative Information, 1983) define el Data-Ink Ratio como la proporcion de tinta del grafico que codifica datos respecto al total de tinta utilizada. Su principio fundamental es: maximizar el data-ink, eliminar el chartjunk (gridlines decorativas, sombras, efectos 3D, fondos coloreados, leyendas redundantes).</w:t>
-            </w:r>
-          </w:p>
-          <w:p>
-            <w:pPr>
-              <w:spacing w:after="80"/>
-            </w:pPr>
-            <w:r>
-              <w:rPr>
-                <w:b/>
-                <w:sz w:val="21"/>
-              </w:rPr>
-              <w:t>Aplicacion concreta en este proyecto:</w:t>
-            </w:r>
-          </w:p>
-          <w:p>
-            <w:pPr>
-              <w:spacing w:after="80"/>
-            </w:pPr>
-            <w:r>
-              <w:rPr>
-                <w:b/>
-                <w:sz w:val="21"/>
-              </w:rPr>
-              <w:t>1) Heatmap de correlacion (Mision 2.1):</w:t>
-            </w:r>
-          </w:p>
-          <w:p>
-            <w:pPr>
-              <w:spacing w:after="80"/>
-            </w:pPr>
-            <w:r>
-              <w:rPr>
-                <w:sz w:val="21"/>
-              </w:rPr>
-              <w:t xml:space="preserve">   Apliqué mask = np.triu(np.ones_like(corr)) para eliminar la mitad superior triangular del heatmap. Esa mitad era visualmente redundante porque corr(A,B) == corr(B,A) -- cada celda eliminada codificaba un dato ya presente en la mitad inferior. La tinta restante codifica unica.</w:t>
-            </w:r>
-          </w:p>
-          <w:p>
-            <w:pPr>
-              <w:spacing w:after="80"/>
-            </w:pPr>
-            <w:r>
-              <w:rPr>
-                <w:b/>
-                <w:sz w:val="21"/>
-              </w:rPr>
-              <w:t>2) Clustermap (Mision 1.2):</w:t>
-            </w:r>
-          </w:p>
-          <w:p>
-            <w:pPr>
-              <w:spacing w:after="80"/>
-            </w:pPr>
-            <w:r>
-              <w:rPr>
-                <w:sz w:val="21"/>
-              </w:rPr>
-              <w:t xml:space="preserve">   Usé style="white" en lugar del default con gridlines. El dendrograma de la izquierda reemplaza la necesidad de una leyenda textual que explique los grupos -- el lector "lee" los clusters directamente del arbol. La barra de color a la izquierda codifica los Z-scores sin necesidad de etiquetas numericas en cada celda. Cada eliminacion concentra la informacion en lugar de destruirla.</w:t>
+              <w:t>Aplicacion: (1) en el heatmap use np.triu() para quitar la mitad redundante; (2) en el clustermap el dendrograma reemplaza la leyenda textual.</w:t>
             </w:r>
           </w:p>
         </w:tc>
@@ -23615,12 +22711,6 @@
         <w:gridCol w:w="9360"/>
       </w:tblGrid>
       <w:tr>
-        <w:tblPrEx>
-          <w:tblCellMar>
-            <w:top w:w="0" w:type="dxa"/>
-            <w:bottom w:w="0" w:type="dxa"/>
-          </w:tblCellMar>
-        </w:tblPrEx>
         <w:tc>
           <w:tcPr>
             <w:tcW w:w="9360" w:type="dxa"/>
@@ -23653,31 +22743,10 @@
         </w:tc>
       </w:tr>
       <w:tr>
-        <w:tblPrEx>
-          <w:tblCellMar>
-            <w:top w:w="0" w:type="dxa"/>
-            <w:bottom w:w="0" w:type="dxa"/>
-          </w:tblCellMar>
-        </w:tblPrEx>
-        <w:trPr>
-          <w:trHeight w:hRule="exact" w:val="400"/>
-        </w:trPr>
+        <w:trPr/>
         <w:tc>
           <w:tcPr>
-            <w:tcW w:w="9360" w:type="dxa"/>
-            <w:tcBorders>
-              <w:top w:val="single" w:sz="4" w:space="0" w:color="BFBFBF"/>
-              <w:left w:val="single" w:sz="4" w:space="0" w:color="BFBFBF"/>
-              <w:bottom w:val="single" w:sz="4" w:space="0" w:color="BFBFBF"/>
-              <w:right w:val="single" w:sz="4" w:space="0" w:color="BFBFBF"/>
-            </w:tcBorders>
-            <w:shd w:val="clear" w:color="auto" w:fill="FFFFFF"/>
-            <w:tcMar>
-              <w:top w:w="100" w:type="dxa"/>
-              <w:left w:w="150" w:type="dxa"/>
-              <w:bottom w:w="100" w:type="dxa"/>
-              <w:right w:w="150" w:type="dxa"/>
-            </w:tcMar>
+            <w:tcW w:type="dxa" w:w="9360"/>
           </w:tcPr>
           <w:p>
             <w:pPr>
@@ -23687,122 +22756,7 @@
               <w:rPr>
                 <w:sz w:val="21"/>
               </w:rPr>
-              <w:t>La estructura usada en la Tarea 4.3 -- Rol -&gt; Contexto -&gt; Formato -&gt; Restricciones -- sigue las mejores practicas porque cada seccion ataca una fuente distinta de variabilidad en la salida del LLM:</w:t>
-            </w:r>
-          </w:p>
-          <w:p>
-            <w:pPr>
-              <w:spacing w:after="80"/>
-            </w:pPr>
-            <w:r>
-              <w:rPr>
-                <w:b/>
-                <w:sz w:val="21"/>
-              </w:rPr>
-              <w:t>1) Rol del sistema:</w:t>
-            </w:r>
-          </w:p>
-          <w:p>
-            <w:pPr>
-              <w:spacing w:after="80"/>
-            </w:pPr>
-            <w:r>
-              <w:rPr>
-                <w:sz w:val="21"/>
-              </w:rPr>
-              <w:t xml:space="preserve">   "Eres un analista senior..." activa el conocimiento implicito del LLM sobre como habla un profesional financiero (vocabulario tecnico apropiado, estructura argumental, prudencia regulatoria).</w:t>
-            </w:r>
-          </w:p>
-          <w:p>
-            <w:pPr>
-              <w:spacing w:after="80"/>
-            </w:pPr>
-            <w:r>
-              <w:rPr>
-                <w:b/>
-                <w:sz w:val="21"/>
-              </w:rPr>
-              <w:t>2) Contexto de datos:</w:t>
-            </w:r>
-          </w:p>
-          <w:p>
-            <w:pPr>
-              <w:spacing w:after="80"/>
-            </w:pPr>
-            <w:r>
-              <w:rPr>
-                <w:sz w:val="21"/>
-              </w:rPr>
-              <w:t xml:space="preserve">   Entrega los hechos numericos del pais ya procesados -- evita pedirle al modelo que los infiera o invente. Reduce alucinaciones.</w:t>
-            </w:r>
-          </w:p>
-          <w:p>
-            <w:pPr>
-              <w:spacing w:after="80"/>
-            </w:pPr>
-            <w:r>
-              <w:rPr>
-                <w:b/>
-                <w:sz w:val="21"/>
-              </w:rPr>
-              <w:t>3) Instruccion de formato:</w:t>
-            </w:r>
-          </w:p>
-          <w:p>
-            <w:pPr>
-              <w:spacing w:after="80"/>
-            </w:pPr>
-            <w:r>
-              <w:rPr>
-                <w:sz w:val="21"/>
-              </w:rPr>
-              <w:t xml:space="preserve">   Garantiza salida estructurada y procesable: 3 parrafos numerados con recomendacion cerrada de un conjunto fijo {Comprar, Mantener, Vender}. Facilita parsing posterior si quisieramos automatizar.</w:t>
-            </w:r>
-          </w:p>
-          <w:p>
-            <w:pPr>
-              <w:spacing w:after="80"/>
-            </w:pPr>
-            <w:r>
-              <w:rPr>
-                <w:b/>
-                <w:sz w:val="21"/>
-              </w:rPr>
-              <w:t>4) Restricciones:</w:t>
-            </w:r>
-          </w:p>
-          <w:p>
-            <w:pPr>
-              <w:spacing w:after="80"/>
-            </w:pPr>
-            <w:r>
-              <w:rPr>
-                <w:sz w:val="21"/>
-              </w:rPr>
-              <w:t xml:space="preserve">   Acotan extension (max 200 palabras) y registro linguistico ("no tecnico") para que la salida sea consumible por la audiencia objetivo.</w:t>
-            </w:r>
-          </w:p>
-          <w:p>
-            <w:pPr>
-              <w:spacing w:after="80"/>
-            </w:pPr>
-            <w:r>
-              <w:rPr>
-                <w:b/>
-                <w:sz w:val="21"/>
-              </w:rPr>
-              <w:t>Que pasaria si eliminaramos el rol del sistema:</w:t>
-            </w:r>
-          </w:p>
-          <w:p>
-            <w:pPr>
-              <w:spacing w:after="80"/>
-            </w:pPr>
-            <w:r>
-              <w:rPr>
-                <w:sz w:val="21"/>
-              </w:rPr>
-              <w:t xml:space="preserve">   El LLM produciria una respuesta generica con tono enciclopedico (estilo Wikipedia), perderia el sesgo de prudencia financiera (podria recomendar agresivamente sin matizar riesgo regulatorio), y mezclaria jerga tecnica de estadistica con coloquialismos. El rol es lo que transforma una respuesta correcta en una respuesta alineada al contexto profesional especifico.</w:t>
+              <w:t>Rol -&gt; Contexto -&gt; Formato -&gt; Restricciones funciona porque cada parte ataca un problema distinto: el rol fija el tono profesional, el contexto evita alucinaciones, el formato garantiza salida estructurada y las restricciones limitan extension y lenguaje. Sin el rol, el LLM responderia generico tipo Wikipedia.</w:t>
             </w:r>
           </w:p>
         </w:tc>
@@ -23831,6 +22785,7 @@
         <w:spacing w:before="60" w:after="60"/>
       </w:pPr>
       <w:r>
+        <w:lastRenderedPageBreak/>
         <w:t xml:space="preserve">Califica tu propio trabajo en cada criterio del 1 al 10. Se honesto: esta </w:t>
       </w:r>
       <w:proofErr w:type="spellStart"/>
@@ -23842,10 +22797,12 @@
         <w:t xml:space="preserve"> no modifica tu </w:t>
       </w:r>
       <w:proofErr w:type="spellStart"/>
+      <w:proofErr w:type="gramStart"/>
       <w:r>
         <w:t>calificacion</w:t>
       </w:r>
       <w:proofErr w:type="spellEnd"/>
+      <w:proofErr w:type="gramEnd"/>
       <w:r>
         <w:t xml:space="preserve"> pero si es considerada por el docente como evidencia de </w:t>
       </w:r>
@@ -23886,12 +22843,6 @@
         <w:gridCol w:w="2000"/>
       </w:tblGrid>
       <w:tr>
-        <w:tblPrEx>
-          <w:tblCellMar>
-            <w:top w:w="0" w:type="dxa"/>
-            <w:bottom w:w="0" w:type="dxa"/>
-          </w:tblCellMar>
-        </w:tblPrEx>
         <w:tc>
           <w:tcPr>
             <w:tcW w:w="5760" w:type="dxa"/>
@@ -23918,7 +22869,6 @@
                 <w:sz w:val="20"/>
                 <w:szCs w:val="20"/>
               </w:rPr>
-              <w:lastRenderedPageBreak/>
               <w:t>Criterio</w:t>
             </w:r>
           </w:p>
@@ -24022,12 +22972,6 @@
         </w:tc>
       </w:tr>
       <w:tr>
-        <w:tblPrEx>
-          <w:tblCellMar>
-            <w:top w:w="0" w:type="dxa"/>
-            <w:bottom w:w="0" w:type="dxa"/>
-          </w:tblCellMar>
-        </w:tblPrEx>
         <w:tc>
           <w:tcPr>
             <w:tcW w:w="5760" w:type="dxa"/>
@@ -24133,12 +23077,6 @@
         </w:tc>
       </w:tr>
       <w:tr>
-        <w:tblPrEx>
-          <w:tblCellMar>
-            <w:top w:w="0" w:type="dxa"/>
-            <w:bottom w:w="0" w:type="dxa"/>
-          </w:tblCellMar>
-        </w:tblPrEx>
         <w:tc>
           <w:tcPr>
             <w:tcW w:w="5760" w:type="dxa"/>
@@ -24260,12 +23198,6 @@
         </w:tc>
       </w:tr>
       <w:tr>
-        <w:tblPrEx>
-          <w:tblCellMar>
-            <w:top w:w="0" w:type="dxa"/>
-            <w:bottom w:w="0" w:type="dxa"/>
-          </w:tblCellMar>
-        </w:tblPrEx>
         <w:tc>
           <w:tcPr>
             <w:tcW w:w="5760" w:type="dxa"/>
@@ -24396,12 +23328,6 @@
         </w:tc>
       </w:tr>
       <w:tr>
-        <w:tblPrEx>
-          <w:tblCellMar>
-            <w:top w:w="0" w:type="dxa"/>
-            <w:bottom w:w="0" w:type="dxa"/>
-          </w:tblCellMar>
-        </w:tblPrEx>
         <w:tc>
           <w:tcPr>
             <w:tcW w:w="5760" w:type="dxa"/>
@@ -24516,12 +23442,6 @@
         </w:tc>
       </w:tr>
       <w:tr>
-        <w:tblPrEx>
-          <w:tblCellMar>
-            <w:top w:w="0" w:type="dxa"/>
-            <w:bottom w:w="0" w:type="dxa"/>
-          </w:tblCellMar>
-        </w:tblPrEx>
         <w:tc>
           <w:tcPr>
             <w:tcW w:w="5760" w:type="dxa"/>
@@ -24653,12 +23573,6 @@
         <w:gridCol w:w="9360"/>
       </w:tblGrid>
       <w:tr>
-        <w:tblPrEx>
-          <w:tblCellMar>
-            <w:top w:w="0" w:type="dxa"/>
-            <w:bottom w:w="0" w:type="dxa"/>
-          </w:tblCellMar>
-        </w:tblPrEx>
         <w:tc>
           <w:tcPr>
             <w:tcW w:w="9360" w:type="dxa"/>
@@ -24686,6 +23600,7 @@
               <w:rPr>
                 <w:color w:val="A8C8F0"/>
               </w:rPr>
+              <w:lastRenderedPageBreak/>
               <w:t>Ingenieria</w:t>
             </w:r>
             <w:proofErr w:type="spellEnd"/>
@@ -24832,8 +23747,8 @@
     </w:tbl>
     <w:p/>
     <w:sectPr>
-      <w:headerReference w:type="default" r:id="rId7"/>
-      <w:footerReference w:type="default" r:id="rId8"/>
+      <w:headerReference w:type="default" r:id="rId13"/>
+      <w:footerReference w:type="default" r:id="rId14"/>
       <w:pgSz w:w="12240" w:h="15840"/>
       <w:pgMar w:top="1080" w:right="1080" w:bottom="1080" w:left="1080" w:header="708" w:footer="708" w:gutter="0"/>
       <w:cols w:space="720"/>
@@ -24844,7 +23759,7 @@
 </file>
 
 <file path=word/endnotes.xml><?xml version="1.0" encoding="utf-8"?>
-<w:endnotes xmlns:wpc="http://schemas.microsoft.com/office/word/2010/wordprocessingCanvas" xmlns:cx="http://schemas.microsoft.com/office/drawing/2014/chartex" xmlns:cx1="http://schemas.microsoft.com/office/drawing/2015/9/8/chartex" xmlns:cx2="http://schemas.microsoft.com/office/drawing/2015/10/21/chartex" xmlns:cx3="http://schemas.microsoft.com/office/drawing/2016/5/9/chartex" xmlns:cx4="http://schemas.microsoft.com/office/drawing/2016/5/10/chartex" xmlns:cx5="http://schemas.microsoft.com/office/drawing/2016/5/11/chartex" xmlns:cx6="http://schemas.microsoft.com/office/drawing/2016/5/12/chartex" xmlns:cx7="http://schemas.microsoft.com/office/drawing/2016/5/13/chartex" xmlns:cx8="http://schemas.microsoft.com/office/drawing/2016/5/14/chartex" xmlns:mc="http://schemas.openxmlformats.org/markup-compatibility/2006" xmlns:aink="http://schemas.microsoft.com/office/drawing/2016/ink" xmlns:am3d="http://schemas.microsoft.com/office/drawing/2017/model3d" xmlns:o="urn:schemas-microsoft-com:office:office" xmlns:oel="http://schemas.microsoft.com/office/2019/extlst" xmlns:r="http://schemas.openxmlformats.org/officeDocument/2006/relationships" xmlns:m="http://schemas.openxmlformats.org/officeDocument/2006/math" xmlns:v="urn:schemas-microsoft-com:vml" xmlns:wp14="http://schemas.microsoft.com/office/word/2010/wordprocessingDrawing" xmlns:wp="http://schemas.openxmlformats.org/drawingml/2006/wordprocessingDrawing" xmlns:w10="urn:schemas-microsoft-com:office:word" xmlns:w="http://schemas.openxmlformats.org/wordprocessingml/2006/main" xmlns:w14="http://schemas.microsoft.com/office/word/2010/wordml" xmlns:w15="http://schemas.microsoft.com/office/word/2012/wordml" xmlns:w16cex="http://schemas.microsoft.com/office/word/2018/wordml/cex" xmlns:w16cid="http://schemas.microsoft.com/office/word/2016/wordml/cid" xmlns:w16="http://schemas.microsoft.com/office/word/2018/wordml" xmlns:w16du="http://schemas.microsoft.com/office/word/2023/wordml/word16du" xmlns:w16sdtdh="http://schemas.microsoft.com/office/word/2020/wordml/sdtdatahash" xmlns:w16sdtfl="http://schemas.microsoft.com/office/word/2024/wordml/sdtformatlock" xmlns:w16se="http://schemas.microsoft.com/office/word/2015/wordml/symex" xmlns:wpg="http://schemas.microsoft.com/office/word/2010/wordprocessingGroup" xmlns:wpi="http://schemas.microsoft.com/office/word/2010/wordprocessingInk" xmlns:wne="http://schemas.microsoft.com/office/word/2006/wordml" xmlns:wps="http://schemas.microsoft.com/office/word/2010/wordprocessingShape" mc:Ignorable="w14 w15 w16se w16cid w16 w16cex w16sdtdh w16sdtfl w16du wp14">
+<w:endnotes xmlns:wpc="http://schemas.microsoft.com/office/word/2010/wordprocessingCanvas" xmlns:cx="http://schemas.microsoft.com/office/drawing/2014/chartex" xmlns:cx1="http://schemas.microsoft.com/office/drawing/2015/9/8/chartex" xmlns:cx2="http://schemas.microsoft.com/office/drawing/2015/10/21/chartex" xmlns:cx3="http://schemas.microsoft.com/office/drawing/2016/5/9/chartex" xmlns:cx4="http://schemas.microsoft.com/office/drawing/2016/5/10/chartex" xmlns:cx5="http://schemas.microsoft.com/office/drawing/2016/5/11/chartex" xmlns:cx6="http://schemas.microsoft.com/office/drawing/2016/5/12/chartex" xmlns:cx7="http://schemas.microsoft.com/office/drawing/2016/5/13/chartex" xmlns:cx8="http://schemas.microsoft.com/office/drawing/2016/5/14/chartex" xmlns:mc="http://schemas.openxmlformats.org/markup-compatibility/2006" xmlns:aink="http://schemas.microsoft.com/office/drawing/2016/ink" xmlns:am3d="http://schemas.microsoft.com/office/drawing/2017/model3d" xmlns:o="urn:schemas-microsoft-com:office:office" xmlns:r="http://schemas.openxmlformats.org/officeDocument/2006/relationships" xmlns:m="http://schemas.openxmlformats.org/officeDocument/2006/math" xmlns:v="urn:schemas-microsoft-com:vml" xmlns:wp14="http://schemas.microsoft.com/office/word/2010/wordprocessingDrawing" xmlns:wp="http://schemas.openxmlformats.org/drawingml/2006/wordprocessingDrawing" xmlns:w10="urn:schemas-microsoft-com:office:word" xmlns:w="http://schemas.openxmlformats.org/wordprocessingml/2006/main" xmlns:w14="http://schemas.microsoft.com/office/word/2010/wordml" xmlns:w15="http://schemas.microsoft.com/office/word/2012/wordml" xmlns:w16cex="http://schemas.microsoft.com/office/word/2018/wordml/cex" xmlns:w16cid="http://schemas.microsoft.com/office/word/2016/wordml/cid" xmlns:w16="http://schemas.microsoft.com/office/word/2018/wordml" xmlns:w16sdtdh="http://schemas.microsoft.com/office/word/2020/wordml/sdtdatahash" xmlns:w16se="http://schemas.microsoft.com/office/word/2015/wordml/symex" xmlns:wpg="http://schemas.microsoft.com/office/word/2010/wordprocessingGroup" xmlns:wpi="http://schemas.microsoft.com/office/word/2010/wordprocessingInk" xmlns:wne="http://schemas.microsoft.com/office/word/2006/wordml" xmlns:wps="http://schemas.microsoft.com/office/word/2010/wordprocessingShape" mc:Ignorable="w14 w15 w16se w16cid w16 w16cex w16sdtdh wp14">
   <w:endnote w:type="separator" w:id="-1">
     <w:p>
       <w:r>
@@ -24863,7 +23778,7 @@
 </file>
 
 <file path=word/footer1.xml><?xml version="1.0" encoding="utf-8"?>
-<w:ftr xmlns:wpc="http://schemas.microsoft.com/office/word/2010/wordprocessingCanvas" xmlns:cx="http://schemas.microsoft.com/office/drawing/2014/chartex" xmlns:cx1="http://schemas.microsoft.com/office/drawing/2015/9/8/chartex" xmlns:cx2="http://schemas.microsoft.com/office/drawing/2015/10/21/chartex" xmlns:cx3="http://schemas.microsoft.com/office/drawing/2016/5/9/chartex" xmlns:cx4="http://schemas.microsoft.com/office/drawing/2016/5/10/chartex" xmlns:cx5="http://schemas.microsoft.com/office/drawing/2016/5/11/chartex" xmlns:cx6="http://schemas.microsoft.com/office/drawing/2016/5/12/chartex" xmlns:cx7="http://schemas.microsoft.com/office/drawing/2016/5/13/chartex" xmlns:cx8="http://schemas.microsoft.com/office/drawing/2016/5/14/chartex" xmlns:mc="http://schemas.openxmlformats.org/markup-compatibility/2006" xmlns:aink="http://schemas.microsoft.com/office/drawing/2016/ink" xmlns:am3d="http://schemas.microsoft.com/office/drawing/2017/model3d" xmlns:o="urn:schemas-microsoft-com:office:office" xmlns:oel="http://schemas.microsoft.com/office/2019/extlst" xmlns:r="http://schemas.openxmlformats.org/officeDocument/2006/relationships" xmlns:m="http://schemas.openxmlformats.org/officeDocument/2006/math" xmlns:v="urn:schemas-microsoft-com:vml" xmlns:wp14="http://schemas.microsoft.com/office/word/2010/wordprocessingDrawing" xmlns:wp="http://schemas.openxmlformats.org/drawingml/2006/wordprocessingDrawing" xmlns:w10="urn:schemas-microsoft-com:office:word" xmlns:w="http://schemas.openxmlformats.org/wordprocessingml/2006/main" xmlns:w14="http://schemas.microsoft.com/office/word/2010/wordml" xmlns:w15="http://schemas.microsoft.com/office/word/2012/wordml" xmlns:w16cex="http://schemas.microsoft.com/office/word/2018/wordml/cex" xmlns:w16cid="http://schemas.microsoft.com/office/word/2016/wordml/cid" xmlns:w16="http://schemas.microsoft.com/office/word/2018/wordml" xmlns:w16du="http://schemas.microsoft.com/office/word/2023/wordml/word16du" xmlns:w16sdtdh="http://schemas.microsoft.com/office/word/2020/wordml/sdtdatahash" xmlns:w16sdtfl="http://schemas.microsoft.com/office/word/2024/wordml/sdtformatlock" xmlns:w16se="http://schemas.microsoft.com/office/word/2015/wordml/symex" xmlns:wpg="http://schemas.microsoft.com/office/word/2010/wordprocessingGroup" xmlns:wpi="http://schemas.microsoft.com/office/word/2010/wordprocessingInk" xmlns:wne="http://schemas.microsoft.com/office/word/2006/wordml" xmlns:wps="http://schemas.microsoft.com/office/word/2010/wordprocessingShape" mc:Ignorable="w14 w15 w16se w16cid w16 w16cex w16sdtdh w16sdtfl w16du wp14">
+<w:ftr xmlns:wpc="http://schemas.microsoft.com/office/word/2010/wordprocessingCanvas" xmlns:cx="http://schemas.microsoft.com/office/drawing/2014/chartex" xmlns:cx1="http://schemas.microsoft.com/office/drawing/2015/9/8/chartex" xmlns:cx2="http://schemas.microsoft.com/office/drawing/2015/10/21/chartex" xmlns:cx3="http://schemas.microsoft.com/office/drawing/2016/5/9/chartex" xmlns:cx4="http://schemas.microsoft.com/office/drawing/2016/5/10/chartex" xmlns:cx5="http://schemas.microsoft.com/office/drawing/2016/5/11/chartex" xmlns:cx6="http://schemas.microsoft.com/office/drawing/2016/5/12/chartex" xmlns:cx7="http://schemas.microsoft.com/office/drawing/2016/5/13/chartex" xmlns:cx8="http://schemas.microsoft.com/office/drawing/2016/5/14/chartex" xmlns:mc="http://schemas.openxmlformats.org/markup-compatibility/2006" xmlns:aink="http://schemas.microsoft.com/office/drawing/2016/ink" xmlns:am3d="http://schemas.microsoft.com/office/drawing/2017/model3d" xmlns:o="urn:schemas-microsoft-com:office:office" xmlns:r="http://schemas.openxmlformats.org/officeDocument/2006/relationships" xmlns:m="http://schemas.openxmlformats.org/officeDocument/2006/math" xmlns:v="urn:schemas-microsoft-com:vml" xmlns:wp14="http://schemas.microsoft.com/office/word/2010/wordprocessingDrawing" xmlns:wp="http://schemas.openxmlformats.org/drawingml/2006/wordprocessingDrawing" xmlns:w10="urn:schemas-microsoft-com:office:word" xmlns:w="http://schemas.openxmlformats.org/wordprocessingml/2006/main" xmlns:w14="http://schemas.microsoft.com/office/word/2010/wordml" xmlns:w15="http://schemas.microsoft.com/office/word/2012/wordml" xmlns:w16cex="http://schemas.microsoft.com/office/word/2018/wordml/cex" xmlns:w16cid="http://schemas.microsoft.com/office/word/2016/wordml/cid" xmlns:w16="http://schemas.microsoft.com/office/word/2018/wordml" xmlns:w16sdtdh="http://schemas.microsoft.com/office/word/2020/wordml/sdtdatahash" xmlns:w16se="http://schemas.microsoft.com/office/word/2015/wordml/symex" xmlns:wpg="http://schemas.microsoft.com/office/word/2010/wordprocessingGroup" xmlns:wpi="http://schemas.microsoft.com/office/word/2010/wordprocessingInk" xmlns:wne="http://schemas.microsoft.com/office/word/2006/wordml" xmlns:wps="http://schemas.microsoft.com/office/word/2010/wordprocessingShape" mc:Ignorable="w14 w15 w16se w16cid w16 w16cex w16sdtdh wp14">
   <w:p>
     <w:pPr>
       <w:pBdr>
@@ -24880,7 +23795,25 @@
         <w:sz w:val="18"/>
         <w:szCs w:val="18"/>
       </w:rPr>
-      <w:t xml:space="preserve">Examen Practico Integrador — Unidad 5  |  </w:t>
+      <w:t xml:space="preserve">Examen Practico Integrador — Unidad </w:t>
+    </w:r>
+    <w:proofErr w:type="gramStart"/>
+    <w:r>
+      <w:rPr>
+        <w:color w:val="595959"/>
+        <w:sz w:val="18"/>
+        <w:szCs w:val="18"/>
+      </w:rPr>
+      <w:t>5  |</w:t>
+    </w:r>
+    <w:proofErr w:type="gramEnd"/>
+    <w:r>
+      <w:rPr>
+        <w:color w:val="595959"/>
+        <w:sz w:val="18"/>
+        <w:szCs w:val="18"/>
+      </w:rPr>
+      <w:t xml:space="preserve">  </w:t>
     </w:r>
     <w:r>
       <w:rPr>
@@ -24947,7 +23880,7 @@
 </file>
 
 <file path=word/footnotes.xml><?xml version="1.0" encoding="utf-8"?>
-<w:footnotes xmlns:wpc="http://schemas.microsoft.com/office/word/2010/wordprocessingCanvas" xmlns:cx="http://schemas.microsoft.com/office/drawing/2014/chartex" xmlns:cx1="http://schemas.microsoft.com/office/drawing/2015/9/8/chartex" xmlns:cx2="http://schemas.microsoft.com/office/drawing/2015/10/21/chartex" xmlns:cx3="http://schemas.microsoft.com/office/drawing/2016/5/9/chartex" xmlns:cx4="http://schemas.microsoft.com/office/drawing/2016/5/10/chartex" xmlns:cx5="http://schemas.microsoft.com/office/drawing/2016/5/11/chartex" xmlns:cx6="http://schemas.microsoft.com/office/drawing/2016/5/12/chartex" xmlns:cx7="http://schemas.microsoft.com/office/drawing/2016/5/13/chartex" xmlns:cx8="http://schemas.microsoft.com/office/drawing/2016/5/14/chartex" xmlns:mc="http://schemas.openxmlformats.org/markup-compatibility/2006" xmlns:aink="http://schemas.microsoft.com/office/drawing/2016/ink" xmlns:am3d="http://schemas.microsoft.com/office/drawing/2017/model3d" xmlns:o="urn:schemas-microsoft-com:office:office" xmlns:oel="http://schemas.microsoft.com/office/2019/extlst" xmlns:r="http://schemas.openxmlformats.org/officeDocument/2006/relationships" xmlns:m="http://schemas.openxmlformats.org/officeDocument/2006/math" xmlns:v="urn:schemas-microsoft-com:vml" xmlns:wp14="http://schemas.microsoft.com/office/word/2010/wordprocessingDrawing" xmlns:wp="http://schemas.openxmlformats.org/drawingml/2006/wordprocessingDrawing" xmlns:w10="urn:schemas-microsoft-com:office:word" xmlns:w="http://schemas.openxmlformats.org/wordprocessingml/2006/main" xmlns:w14="http://schemas.microsoft.com/office/word/2010/wordml" xmlns:w15="http://schemas.microsoft.com/office/word/2012/wordml" xmlns:w16cex="http://schemas.microsoft.com/office/word/2018/wordml/cex" xmlns:w16cid="http://schemas.microsoft.com/office/word/2016/wordml/cid" xmlns:w16="http://schemas.microsoft.com/office/word/2018/wordml" xmlns:w16du="http://schemas.microsoft.com/office/word/2023/wordml/word16du" xmlns:w16sdtdh="http://schemas.microsoft.com/office/word/2020/wordml/sdtdatahash" xmlns:w16sdtfl="http://schemas.microsoft.com/office/word/2024/wordml/sdtformatlock" xmlns:w16se="http://schemas.microsoft.com/office/word/2015/wordml/symex" xmlns:wpg="http://schemas.microsoft.com/office/word/2010/wordprocessingGroup" xmlns:wpi="http://schemas.microsoft.com/office/word/2010/wordprocessingInk" xmlns:wne="http://schemas.microsoft.com/office/word/2006/wordml" xmlns:wps="http://schemas.microsoft.com/office/word/2010/wordprocessingShape" mc:Ignorable="w14 w15 w16se w16cid w16 w16cex w16sdtdh w16sdtfl w16du wp14">
+<w:footnotes xmlns:wpc="http://schemas.microsoft.com/office/word/2010/wordprocessingCanvas" xmlns:cx="http://schemas.microsoft.com/office/drawing/2014/chartex" xmlns:cx1="http://schemas.microsoft.com/office/drawing/2015/9/8/chartex" xmlns:cx2="http://schemas.microsoft.com/office/drawing/2015/10/21/chartex" xmlns:cx3="http://schemas.microsoft.com/office/drawing/2016/5/9/chartex" xmlns:cx4="http://schemas.microsoft.com/office/drawing/2016/5/10/chartex" xmlns:cx5="http://schemas.microsoft.com/office/drawing/2016/5/11/chartex" xmlns:cx6="http://schemas.microsoft.com/office/drawing/2016/5/12/chartex" xmlns:cx7="http://schemas.microsoft.com/office/drawing/2016/5/13/chartex" xmlns:cx8="http://schemas.microsoft.com/office/drawing/2016/5/14/chartex" xmlns:mc="http://schemas.openxmlformats.org/markup-compatibility/2006" xmlns:aink="http://schemas.microsoft.com/office/drawing/2016/ink" xmlns:am3d="http://schemas.microsoft.com/office/drawing/2017/model3d" xmlns:o="urn:schemas-microsoft-com:office:office" xmlns:r="http://schemas.openxmlformats.org/officeDocument/2006/relationships" xmlns:m="http://schemas.openxmlformats.org/officeDocument/2006/math" xmlns:v="urn:schemas-microsoft-com:vml" xmlns:wp14="http://schemas.microsoft.com/office/word/2010/wordprocessingDrawing" xmlns:wp="http://schemas.openxmlformats.org/drawingml/2006/wordprocessingDrawing" xmlns:w10="urn:schemas-microsoft-com:office:word" xmlns:w="http://schemas.openxmlformats.org/wordprocessingml/2006/main" xmlns:w14="http://schemas.microsoft.com/office/word/2010/wordml" xmlns:w15="http://schemas.microsoft.com/office/word/2012/wordml" xmlns:w16cex="http://schemas.microsoft.com/office/word/2018/wordml/cex" xmlns:w16cid="http://schemas.microsoft.com/office/word/2016/wordml/cid" xmlns:w16="http://schemas.microsoft.com/office/word/2018/wordml" xmlns:w16sdtdh="http://schemas.microsoft.com/office/word/2020/wordml/sdtdatahash" xmlns:w16se="http://schemas.microsoft.com/office/word/2015/wordml/symex" xmlns:wpg="http://schemas.microsoft.com/office/word/2010/wordprocessingGroup" xmlns:wpi="http://schemas.microsoft.com/office/word/2010/wordprocessingInk" xmlns:wne="http://schemas.microsoft.com/office/word/2006/wordml" xmlns:wps="http://schemas.microsoft.com/office/word/2010/wordprocessingShape" mc:Ignorable="w14 w15 w16se w16cid w16 w16cex w16sdtdh wp14">
   <w:footnote w:type="separator" w:id="-1">
     <w:p>
       <w:r>
@@ -24966,7 +23899,7 @@
 </file>
 
 <file path=word/header1.xml><?xml version="1.0" encoding="utf-8"?>
-<w:hdr xmlns:wpc="http://schemas.microsoft.com/office/word/2010/wordprocessingCanvas" xmlns:cx="http://schemas.microsoft.com/office/drawing/2014/chartex" xmlns:cx1="http://schemas.microsoft.com/office/drawing/2015/9/8/chartex" xmlns:cx2="http://schemas.microsoft.com/office/drawing/2015/10/21/chartex" xmlns:cx3="http://schemas.microsoft.com/office/drawing/2016/5/9/chartex" xmlns:cx4="http://schemas.microsoft.com/office/drawing/2016/5/10/chartex" xmlns:cx5="http://schemas.microsoft.com/office/drawing/2016/5/11/chartex" xmlns:cx6="http://schemas.microsoft.com/office/drawing/2016/5/12/chartex" xmlns:cx7="http://schemas.microsoft.com/office/drawing/2016/5/13/chartex" xmlns:cx8="http://schemas.microsoft.com/office/drawing/2016/5/14/chartex" xmlns:mc="http://schemas.openxmlformats.org/markup-compatibility/2006" xmlns:aink="http://schemas.microsoft.com/office/drawing/2016/ink" xmlns:am3d="http://schemas.microsoft.com/office/drawing/2017/model3d" xmlns:o="urn:schemas-microsoft-com:office:office" xmlns:oel="http://schemas.microsoft.com/office/2019/extlst" xmlns:r="http://schemas.openxmlformats.org/officeDocument/2006/relationships" xmlns:m="http://schemas.openxmlformats.org/officeDocument/2006/math" xmlns:v="urn:schemas-microsoft-com:vml" xmlns:wp14="http://schemas.microsoft.com/office/word/2010/wordprocessingDrawing" xmlns:wp="http://schemas.openxmlformats.org/drawingml/2006/wordprocessingDrawing" xmlns:w10="urn:schemas-microsoft-com:office:word" xmlns:w="http://schemas.openxmlformats.org/wordprocessingml/2006/main" xmlns:w14="http://schemas.microsoft.com/office/word/2010/wordml" xmlns:w15="http://schemas.microsoft.com/office/word/2012/wordml" xmlns:w16cex="http://schemas.microsoft.com/office/word/2018/wordml/cex" xmlns:w16cid="http://schemas.microsoft.com/office/word/2016/wordml/cid" xmlns:w16="http://schemas.microsoft.com/office/word/2018/wordml" xmlns:w16du="http://schemas.microsoft.com/office/word/2023/wordml/word16du" xmlns:w16sdtdh="http://schemas.microsoft.com/office/word/2020/wordml/sdtdatahash" xmlns:w16sdtfl="http://schemas.microsoft.com/office/word/2024/wordml/sdtformatlock" xmlns:w16se="http://schemas.microsoft.com/office/word/2015/wordml/symex" xmlns:wpg="http://schemas.microsoft.com/office/word/2010/wordprocessingGroup" xmlns:wpi="http://schemas.microsoft.com/office/word/2010/wordprocessingInk" xmlns:wne="http://schemas.microsoft.com/office/word/2006/wordml" xmlns:wps="http://schemas.microsoft.com/office/word/2010/wordprocessingShape" mc:Ignorable="w14 w15 w16se w16cid w16 w16cex w16sdtdh w16sdtfl w16du wp14">
+<w:hdr xmlns:wpc="http://schemas.microsoft.com/office/word/2010/wordprocessingCanvas" xmlns:cx="http://schemas.microsoft.com/office/drawing/2014/chartex" xmlns:cx1="http://schemas.microsoft.com/office/drawing/2015/9/8/chartex" xmlns:cx2="http://schemas.microsoft.com/office/drawing/2015/10/21/chartex" xmlns:cx3="http://schemas.microsoft.com/office/drawing/2016/5/9/chartex" xmlns:cx4="http://schemas.microsoft.com/office/drawing/2016/5/10/chartex" xmlns:cx5="http://schemas.microsoft.com/office/drawing/2016/5/11/chartex" xmlns:cx6="http://schemas.microsoft.com/office/drawing/2016/5/12/chartex" xmlns:cx7="http://schemas.microsoft.com/office/drawing/2016/5/13/chartex" xmlns:cx8="http://schemas.microsoft.com/office/drawing/2016/5/14/chartex" xmlns:mc="http://schemas.openxmlformats.org/markup-compatibility/2006" xmlns:aink="http://schemas.microsoft.com/office/drawing/2016/ink" xmlns:am3d="http://schemas.microsoft.com/office/drawing/2017/model3d" xmlns:o="urn:schemas-microsoft-com:office:office" xmlns:r="http://schemas.openxmlformats.org/officeDocument/2006/relationships" xmlns:m="http://schemas.openxmlformats.org/officeDocument/2006/math" xmlns:v="urn:schemas-microsoft-com:vml" xmlns:wp14="http://schemas.microsoft.com/office/word/2010/wordprocessingDrawing" xmlns:wp="http://schemas.openxmlformats.org/drawingml/2006/wordprocessingDrawing" xmlns:w10="urn:schemas-microsoft-com:office:word" xmlns:w="http://schemas.openxmlformats.org/wordprocessingml/2006/main" xmlns:w14="http://schemas.microsoft.com/office/word/2010/wordml" xmlns:w15="http://schemas.microsoft.com/office/word/2012/wordml" xmlns:w16cex="http://schemas.microsoft.com/office/word/2018/wordml/cex" xmlns:w16cid="http://schemas.microsoft.com/office/word/2016/wordml/cid" xmlns:w16="http://schemas.microsoft.com/office/word/2018/wordml" xmlns:w16sdtdh="http://schemas.microsoft.com/office/word/2020/wordml/sdtdatahash" xmlns:w16se="http://schemas.microsoft.com/office/word/2015/wordml/symex" xmlns:wpg="http://schemas.microsoft.com/office/word/2010/wordprocessingGroup" xmlns:wpi="http://schemas.microsoft.com/office/word/2010/wordprocessingInk" xmlns:wne="http://schemas.microsoft.com/office/word/2006/wordml" xmlns:wps="http://schemas.microsoft.com/office/word/2010/wordprocessingShape" mc:Ignorable="w14 w15 w16se w16cid w16 w16cex w16sdtdh wp14">
   <w:p>
     <w:pPr>
       <w:pBdr>
@@ -25013,7 +23946,7 @@
 </file>
 
 <file path=word/numbering.xml><?xml version="1.0" encoding="utf-8"?>
-<w:numbering xmlns:wpc="http://schemas.microsoft.com/office/word/2010/wordprocessingCanvas" xmlns:cx="http://schemas.microsoft.com/office/drawing/2014/chartex" xmlns:cx1="http://schemas.microsoft.com/office/drawing/2015/9/8/chartex" xmlns:cx2="http://schemas.microsoft.com/office/drawing/2015/10/21/chartex" xmlns:cx3="http://schemas.microsoft.com/office/drawing/2016/5/9/chartex" xmlns:cx4="http://schemas.microsoft.com/office/drawing/2016/5/10/chartex" xmlns:cx5="http://schemas.microsoft.com/office/drawing/2016/5/11/chartex" xmlns:cx6="http://schemas.microsoft.com/office/drawing/2016/5/12/chartex" xmlns:cx7="http://schemas.microsoft.com/office/drawing/2016/5/13/chartex" xmlns:cx8="http://schemas.microsoft.com/office/drawing/2016/5/14/chartex" xmlns:mc="http://schemas.openxmlformats.org/markup-compatibility/2006" xmlns:aink="http://schemas.microsoft.com/office/drawing/2016/ink" xmlns:am3d="http://schemas.microsoft.com/office/drawing/2017/model3d" xmlns:o="urn:schemas-microsoft-com:office:office" xmlns:oel="http://schemas.microsoft.com/office/2019/extlst" xmlns:r="http://schemas.openxmlformats.org/officeDocument/2006/relationships" xmlns:m="http://schemas.openxmlformats.org/officeDocument/2006/math" xmlns:v="urn:schemas-microsoft-com:vml" xmlns:wp14="http://schemas.microsoft.com/office/word/2010/wordprocessingDrawing" xmlns:wp="http://schemas.openxmlformats.org/drawingml/2006/wordprocessingDrawing" xmlns:w10="urn:schemas-microsoft-com:office:word" xmlns:w="http://schemas.openxmlformats.org/wordprocessingml/2006/main" xmlns:w14="http://schemas.microsoft.com/office/word/2010/wordml" xmlns:w15="http://schemas.microsoft.com/office/word/2012/wordml" xmlns:w16cex="http://schemas.microsoft.com/office/word/2018/wordml/cex" xmlns:w16cid="http://schemas.microsoft.com/office/word/2016/wordml/cid" xmlns:w16="http://schemas.microsoft.com/office/word/2018/wordml" xmlns:w16du="http://schemas.microsoft.com/office/word/2023/wordml/word16du" xmlns:w16sdtdh="http://schemas.microsoft.com/office/word/2020/wordml/sdtdatahash" xmlns:w16sdtfl="http://schemas.microsoft.com/office/word/2024/wordml/sdtformatlock" xmlns:w16se="http://schemas.microsoft.com/office/word/2015/wordml/symex" xmlns:wpg="http://schemas.microsoft.com/office/word/2010/wordprocessingGroup" xmlns:wpi="http://schemas.microsoft.com/office/word/2010/wordprocessingInk" xmlns:wne="http://schemas.microsoft.com/office/word/2006/wordml" xmlns:wps="http://schemas.microsoft.com/office/word/2010/wordprocessingShape" mc:Ignorable="w14 w15 w16se w16cid w16 w16cex w16sdtdh w16sdtfl w16du wp14">
+<w:numbering xmlns:wpc="http://schemas.microsoft.com/office/word/2010/wordprocessingCanvas" xmlns:cx="http://schemas.microsoft.com/office/drawing/2014/chartex" xmlns:cx1="http://schemas.microsoft.com/office/drawing/2015/9/8/chartex" xmlns:cx2="http://schemas.microsoft.com/office/drawing/2015/10/21/chartex" xmlns:cx3="http://schemas.microsoft.com/office/drawing/2016/5/9/chartex" xmlns:cx4="http://schemas.microsoft.com/office/drawing/2016/5/10/chartex" xmlns:cx5="http://schemas.microsoft.com/office/drawing/2016/5/11/chartex" xmlns:cx6="http://schemas.microsoft.com/office/drawing/2016/5/12/chartex" xmlns:cx7="http://schemas.microsoft.com/office/drawing/2016/5/13/chartex" xmlns:cx8="http://schemas.microsoft.com/office/drawing/2016/5/14/chartex" xmlns:mc="http://schemas.openxmlformats.org/markup-compatibility/2006" xmlns:aink="http://schemas.microsoft.com/office/drawing/2016/ink" xmlns:am3d="http://schemas.microsoft.com/office/drawing/2017/model3d" xmlns:o="urn:schemas-microsoft-com:office:office" xmlns:r="http://schemas.openxmlformats.org/officeDocument/2006/relationships" xmlns:m="http://schemas.openxmlformats.org/officeDocument/2006/math" xmlns:v="urn:schemas-microsoft-com:vml" xmlns:wp14="http://schemas.microsoft.com/office/word/2010/wordprocessingDrawing" xmlns:wp="http://schemas.openxmlformats.org/drawingml/2006/wordprocessingDrawing" xmlns:w10="urn:schemas-microsoft-com:office:word" xmlns:w="http://schemas.openxmlformats.org/wordprocessingml/2006/main" xmlns:w14="http://schemas.microsoft.com/office/word/2010/wordml" xmlns:w15="http://schemas.microsoft.com/office/word/2012/wordml" xmlns:w16cex="http://schemas.microsoft.com/office/word/2018/wordml/cex" xmlns:w16cid="http://schemas.microsoft.com/office/word/2016/wordml/cid" xmlns:w16="http://schemas.microsoft.com/office/word/2018/wordml" xmlns:w16sdtdh="http://schemas.microsoft.com/office/word/2020/wordml/sdtdatahash" xmlns:w16se="http://schemas.microsoft.com/office/word/2015/wordml/symex" xmlns:wpg="http://schemas.microsoft.com/office/word/2010/wordprocessingGroup" xmlns:wpi="http://schemas.microsoft.com/office/word/2010/wordprocessingInk" xmlns:wne="http://schemas.microsoft.com/office/word/2006/wordml" xmlns:wps="http://schemas.microsoft.com/office/word/2010/wordprocessingShape" mc:Ignorable="w14 w15 w16se w16cid w16 w16cex w16sdtdh wp14">
   <w:abstractNum w:abstractNumId="0" w15:restartNumberingAfterBreak="0">
     <w:nsid w:val="176D6C57"/>
     <w:multiLevelType w:val="hybridMultilevel"/>
@@ -25212,19 +24145,19 @@
       <w:lvlJc w:val="left"/>
     </w:lvl>
   </w:abstractNum>
-  <w:num w:numId="1" w16cid:durableId="1034892401">
+  <w:num w:numId="1">
     <w:abstractNumId w:val="1"/>
     <w:lvlOverride w:ilvl="0">
       <w:startOverride w:val="1"/>
     </w:lvlOverride>
   </w:num>
-  <w:num w:numId="2" w16cid:durableId="351498355">
+  <w:num w:numId="2">
     <w:abstractNumId w:val="0"/>
     <w:lvlOverride w:ilvl="0">
       <w:startOverride w:val="1"/>
     </w:lvlOverride>
   </w:num>
-  <w:num w:numId="3" w16cid:durableId="1574580211">
+  <w:num w:numId="3">
     <w:abstractNumId w:val="2"/>
     <w:lvlOverride w:ilvl="0">
       <w:startOverride w:val="1"/>
@@ -25234,7 +24167,7 @@
 </file>
 
 <file path=word/styles.xml><?xml version="1.0" encoding="utf-8"?>
-<w:styles xmlns:mc="http://schemas.openxmlformats.org/markup-compatibility/2006" xmlns:r="http://schemas.openxmlformats.org/officeDocument/2006/relationships" xmlns:w="http://schemas.openxmlformats.org/wordprocessingml/2006/main" xmlns:w14="http://schemas.microsoft.com/office/word/2010/wordml" xmlns:w15="http://schemas.microsoft.com/office/word/2012/wordml" xmlns:w16cex="http://schemas.microsoft.com/office/word/2018/wordml/cex" xmlns:w16cid="http://schemas.microsoft.com/office/word/2016/wordml/cid" xmlns:w16="http://schemas.microsoft.com/office/word/2018/wordml" xmlns:w16du="http://schemas.microsoft.com/office/word/2023/wordml/word16du" xmlns:w16sdtdh="http://schemas.microsoft.com/office/word/2020/wordml/sdtdatahash" xmlns:w16sdtfl="http://schemas.microsoft.com/office/word/2024/wordml/sdtformatlock" xmlns:w16se="http://schemas.microsoft.com/office/word/2015/wordml/symex" mc:Ignorable="w14 w15 w16se w16cid w16 w16cex w16sdtdh w16sdtfl w16du">
+<w:styles xmlns:mc="http://schemas.openxmlformats.org/markup-compatibility/2006" xmlns:r="http://schemas.openxmlformats.org/officeDocument/2006/relationships" xmlns:w="http://schemas.openxmlformats.org/wordprocessingml/2006/main" xmlns:w14="http://schemas.microsoft.com/office/word/2010/wordml" xmlns:w15="http://schemas.microsoft.com/office/word/2012/wordml" xmlns:w16cex="http://schemas.microsoft.com/office/word/2018/wordml/cex" xmlns:w16cid="http://schemas.microsoft.com/office/word/2016/wordml/cid" xmlns:w16="http://schemas.microsoft.com/office/word/2018/wordml" xmlns:w16sdtdh="http://schemas.microsoft.com/office/word/2020/wordml/sdtdatahash" xmlns:w16se="http://schemas.microsoft.com/office/word/2015/wordml/symex" mc:Ignorable="w14 w15 w16se w16cid w16 w16cex w16sdtdh">
   <w:docDefaults>
     <w:rPrDefault>
       <w:rPr>

</xml_diff>

<commit_message>
docs: agrega URL del dashboard desplegado en Streamlit Cloud y 3ra captura con filtros
</commit_message>
<xml_diff>
--- a/Examen_Unidad5_Visualizacion_Datos.docx
+++ b/Examen_Unidad5_Visualizacion_Datos.docx
@@ -19244,6 +19244,45 @@
               </w:drawing>
             </w:r>
           </w:p>
+          <w:p>
+            <w:pPr>
+              <w:jc w:val="center"/>
+            </w:pPr>
+            <w:r>
+              <w:drawing>
+                <wp:inline xmlns:a="http://schemas.openxmlformats.org/drawingml/2006/main" xmlns:pic="http://schemas.openxmlformats.org/drawingml/2006/picture">
+                  <wp:extent cx="5486400" cy="3429000"/>
+                  <wp:docPr id="33" name="Picture 33"/>
+                  <wp:cNvGraphicFramePr>
+                    <a:graphicFrameLocks noChangeAspect="1"/>
+                  </wp:cNvGraphicFramePr>
+                  <a:graphic>
+                    <a:graphicData uri="http://schemas.openxmlformats.org/drawingml/2006/picture">
+                      <pic:pic>
+                        <pic:nvPicPr>
+                          <pic:cNvPr id="0" name="dashboard_filtros.PNG"/>
+                          <pic:cNvPicPr/>
+                        </pic:nvPicPr>
+                        <pic:blipFill>
+                          <a:blip r:embed="rId19"/>
+                          <a:stretch>
+                            <a:fillRect/>
+                          </a:stretch>
+                        </pic:blipFill>
+                        <pic:spPr>
+                          <a:xfrm>
+                            <a:off x="0" y="0"/>
+                            <a:ext cx="5486400" cy="3429000"/>
+                          </a:xfrm>
+                          <a:prstGeom prst="rect"/>
+                        </pic:spPr>
+                      </pic:pic>
+                    </a:graphicData>
+                  </a:graphic>
+                </wp:inline>
+              </w:drawing>
+            </w:r>
+          </w:p>
         </w:tc>
       </w:tr>
     </w:tbl>
@@ -21897,14 +21936,11 @@
             </w:tcMar>
           </w:tcPr>
           <w:p>
-            <w:pPr>
-              <w:spacing w:after="80"/>
-            </w:pPr>
             <w:r>
               <w:rPr>
                 <w:sz w:val="21"/>
               </w:rPr>
-              <w:t>http://localhost:8501  (correr con: streamlit run app.py)</w:t>
+              <w:t>https://examen-u5-esg-dashboard-a9hhrlhxytb9lwsumjmhbp.streamlit.app/</w:t>
             </w:r>
           </w:p>
         </w:tc>

</xml_diff>